<commit_message>
Remove header from docx template
Because docx layout is configurable, there is currently no consistent
docx styled element that a template header could count on being there.
This would mean that when such an element is not there, you get an
error in the header instead. Eventually maybe we will have dynamic
header logic for docx.
</commit_message>
<xml_diff>
--- a/template.docx
+++ b/template.docx
@@ -1034,12 +1034,19 @@
           <w:szCs w:val="22"/>
         </w:rPr>
         <w:sectPr>
+          <w:headerReference w:type="even" r:id="rId15"/>
+          <w:headerReference w:type="default" r:id="rId16"/>
+          <w:footerReference w:type="even" r:id="rId17"/>
+          <w:footerReference w:type="default" r:id="rId18"/>
+          <w:headerReference w:type="first" r:id="rId19"/>
+          <w:footerReference w:type="first" r:id="rId20"/>
           <w:pgSz w:w="12240" w:h="15840"/>
           <w:pgMar w:top="1440" w:right="1440" w:bottom="1440" w:left="1440" w:header="720" w:footer="720" w:gutter="0"/>
           <w:cols w:space="720"/>
         </w:sectPr>
       </w:pPr>
     </w:p>
+    <w:bookmarkEnd w:id="0"/>
     <w:p>
       <w:pPr>
         <w:pStyle w:val="BodyText"/>
@@ -1049,15 +1056,12 @@
           <w:szCs w:val="22"/>
         </w:rPr>
       </w:pPr>
-      <w:bookmarkStart w:id="2" w:name="_GoBack"/>
-      <w:bookmarkEnd w:id="0"/>
-      <w:bookmarkEnd w:id="2"/>
     </w:p>
     <w:sectPr>
-      <w:headerReference w:type="default" r:id="rId15"/>
-      <w:footerReference w:type="default" r:id="rId16"/>
-      <w:headerReference w:type="first" r:id="rId17"/>
-      <w:footerReference w:type="first" r:id="rId18"/>
+      <w:headerReference w:type="default" r:id="rId21"/>
+      <w:footerReference w:type="default" r:id="rId22"/>
+      <w:headerReference w:type="first" r:id="rId23"/>
+      <w:footerReference w:type="first" r:id="rId24"/>
       <w:type w:val="continuous"/>
       <w:pgSz w:w="12240" w:h="15840"/>
       <w:pgMar w:top="1440" w:right="1440" w:bottom="1440" w:left="1440" w:header="720" w:footer="720" w:gutter="0"/>
@@ -1098,91 +1102,32 @@
   <w:p>
     <w:pPr>
       <w:pStyle w:val="Footer"/>
-      <w:jc w:val="center"/>
     </w:pPr>
-    <w:r>
-      <w:t xml:space="preserve">Page </w:t>
-    </w:r>
-    <w:r>
-      <w:rPr>
-        <w:b/>
-        <w:bCs/>
-      </w:rPr>
-      <w:fldChar w:fldCharType="begin"/>
-    </w:r>
-    <w:r>
-      <w:rPr>
-        <w:b/>
-        <w:bCs/>
-      </w:rPr>
-      <w:instrText xml:space="preserve"> PAGE  \* Arabic  \* MERGEFORMAT </w:instrText>
-    </w:r>
-    <w:r>
-      <w:rPr>
-        <w:b/>
-        <w:bCs/>
-      </w:rPr>
-      <w:fldChar w:fldCharType="separate"/>
-    </w:r>
-    <w:r>
-      <w:rPr>
-        <w:b/>
-        <w:bCs/>
-        <w:noProof/>
-      </w:rPr>
-      <w:t>5</w:t>
-    </w:r>
-    <w:r>
-      <w:rPr>
-        <w:b/>
-        <w:bCs/>
-      </w:rPr>
-      <w:fldChar w:fldCharType="end"/>
-    </w:r>
-    <w:r>
-      <w:t xml:space="preserve"> of </w:t>
-    </w:r>
-    <w:r>
-      <w:rPr>
-        <w:b/>
-        <w:bCs/>
-      </w:rPr>
-      <w:fldChar w:fldCharType="begin"/>
-    </w:r>
-    <w:r>
-      <w:rPr>
-        <w:b/>
-        <w:bCs/>
-      </w:rPr>
-      <w:instrText xml:space="preserve"> NUMPAGES  \* Arabic  \* MERGEFORMAT </w:instrText>
-    </w:r>
-    <w:r>
-      <w:rPr>
-        <w:b/>
-        <w:bCs/>
-      </w:rPr>
-      <w:fldChar w:fldCharType="separate"/>
-    </w:r>
-    <w:r>
-      <w:rPr>
-        <w:b/>
-        <w:bCs/>
-        <w:noProof/>
-      </w:rPr>
-      <w:t>5</w:t>
-    </w:r>
-    <w:r>
-      <w:rPr>
-        <w:b/>
-        <w:bCs/>
-      </w:rPr>
-      <w:fldChar w:fldCharType="end"/>
-    </w:r>
   </w:p>
 </w:ftr>
 </file>
 
 <file path=word/footer2.xml><?xml version="1.0" encoding="utf-8"?>
+<w:ftr xmlns:wpc="http://schemas.microsoft.com/office/word/2010/wordprocessingCanvas" xmlns:mc="http://schemas.openxmlformats.org/markup-compatibility/2006" xmlns:o="urn:schemas-microsoft-com:office:office" xmlns:r="http://schemas.openxmlformats.org/officeDocument/2006/relationships" xmlns:m="http://schemas.openxmlformats.org/officeDocument/2006/math" xmlns:v="urn:schemas-microsoft-com:vml" xmlns:wp14="http://schemas.microsoft.com/office/word/2010/wordprocessingDrawing" xmlns:wp="http://schemas.openxmlformats.org/drawingml/2006/wordprocessingDrawing" xmlns:w10="urn:schemas-microsoft-com:office:word" xmlns:w="http://schemas.openxmlformats.org/wordprocessingml/2006/main" xmlns:w14="http://schemas.microsoft.com/office/word/2010/wordml" xmlns:w15="http://schemas.microsoft.com/office/word/2012/wordml" xmlns:wpg="http://schemas.microsoft.com/office/word/2010/wordprocessingGroup" xmlns:wpi="http://schemas.microsoft.com/office/word/2010/wordprocessingInk" xmlns:wne="http://schemas.microsoft.com/office/word/2006/wordml" xmlns:wps="http://schemas.microsoft.com/office/word/2010/wordprocessingShape" mc:Ignorable="w14 w15 wp14">
+  <w:p>
+    <w:pPr>
+      <w:pStyle w:val="Footer"/>
+    </w:pPr>
+  </w:p>
+</w:ftr>
+</file>
+
+<file path=word/footer3.xml><?xml version="1.0" encoding="utf-8"?>
+<w:ftr xmlns:wpc="http://schemas.microsoft.com/office/word/2010/wordprocessingCanvas" xmlns:mc="http://schemas.openxmlformats.org/markup-compatibility/2006" xmlns:o="urn:schemas-microsoft-com:office:office" xmlns:r="http://schemas.openxmlformats.org/officeDocument/2006/relationships" xmlns:m="http://schemas.openxmlformats.org/officeDocument/2006/math" xmlns:v="urn:schemas-microsoft-com:vml" xmlns:wp14="http://schemas.microsoft.com/office/word/2010/wordprocessingDrawing" xmlns:wp="http://schemas.openxmlformats.org/drawingml/2006/wordprocessingDrawing" xmlns:w10="urn:schemas-microsoft-com:office:word" xmlns:w="http://schemas.openxmlformats.org/wordprocessingml/2006/main" xmlns:w14="http://schemas.microsoft.com/office/word/2010/wordml" xmlns:w15="http://schemas.microsoft.com/office/word/2012/wordml" xmlns:wpg="http://schemas.microsoft.com/office/word/2010/wordprocessingGroup" xmlns:wpi="http://schemas.microsoft.com/office/word/2010/wordprocessingInk" xmlns:wne="http://schemas.microsoft.com/office/word/2006/wordml" xmlns:wps="http://schemas.microsoft.com/office/word/2010/wordprocessingShape" mc:Ignorable="w14 w15 wp14">
+  <w:p>
+    <w:pPr>
+      <w:pStyle w:val="Footer"/>
+    </w:pPr>
+  </w:p>
+</w:ftr>
+</file>
+
+<file path=word/footer4.xml><?xml version="1.0" encoding="utf-8"?>
 <w:ftr xmlns:wpc="http://schemas.microsoft.com/office/word/2010/wordprocessingCanvas" xmlns:mc="http://schemas.openxmlformats.org/markup-compatibility/2006" xmlns:o="urn:schemas-microsoft-com:office:office" xmlns:r="http://schemas.openxmlformats.org/officeDocument/2006/relationships" xmlns:m="http://schemas.openxmlformats.org/officeDocument/2006/math" xmlns:v="urn:schemas-microsoft-com:vml" xmlns:wp14="http://schemas.microsoft.com/office/word/2010/wordprocessingDrawing" xmlns:wp="http://schemas.openxmlformats.org/drawingml/2006/wordprocessingDrawing" xmlns:w10="urn:schemas-microsoft-com:office:word" xmlns:w="http://schemas.openxmlformats.org/wordprocessingml/2006/main" xmlns:w14="http://schemas.microsoft.com/office/word/2010/wordml" xmlns:w15="http://schemas.microsoft.com/office/word/2012/wordml" xmlns:wpg="http://schemas.microsoft.com/office/word/2010/wordprocessingGroup" xmlns:wpi="http://schemas.microsoft.com/office/word/2010/wordprocessingInk" xmlns:wne="http://schemas.microsoft.com/office/word/2006/wordml" xmlns:wps="http://schemas.microsoft.com/office/word/2010/wordprocessingShape" mc:Ignorable="w14 w15 wp14">
   <w:p>
     <w:pPr>
@@ -1258,6 +1203,95 @@
         <w:bCs/>
         <w:noProof/>
       </w:rPr>
+      <w:t>5</w:t>
+    </w:r>
+    <w:r>
+      <w:rPr>
+        <w:b/>
+        <w:bCs/>
+      </w:rPr>
+      <w:fldChar w:fldCharType="end"/>
+    </w:r>
+  </w:p>
+</w:ftr>
+</file>
+
+<file path=word/footer5.xml><?xml version="1.0" encoding="utf-8"?>
+<w:ftr xmlns:wpc="http://schemas.microsoft.com/office/word/2010/wordprocessingCanvas" xmlns:mc="http://schemas.openxmlformats.org/markup-compatibility/2006" xmlns:o="urn:schemas-microsoft-com:office:office" xmlns:r="http://schemas.openxmlformats.org/officeDocument/2006/relationships" xmlns:m="http://schemas.openxmlformats.org/officeDocument/2006/math" xmlns:v="urn:schemas-microsoft-com:vml" xmlns:wp14="http://schemas.microsoft.com/office/word/2010/wordprocessingDrawing" xmlns:wp="http://schemas.openxmlformats.org/drawingml/2006/wordprocessingDrawing" xmlns:w10="urn:schemas-microsoft-com:office:word" xmlns:w="http://schemas.openxmlformats.org/wordprocessingml/2006/main" xmlns:w14="http://schemas.microsoft.com/office/word/2010/wordml" xmlns:w15="http://schemas.microsoft.com/office/word/2012/wordml" xmlns:wpg="http://schemas.microsoft.com/office/word/2010/wordprocessingGroup" xmlns:wpi="http://schemas.microsoft.com/office/word/2010/wordprocessingInk" xmlns:wne="http://schemas.microsoft.com/office/word/2006/wordml" xmlns:wps="http://schemas.microsoft.com/office/word/2010/wordprocessingShape" mc:Ignorable="w14 w15 wp14">
+  <w:p>
+    <w:pPr>
+      <w:pStyle w:val="Footer"/>
+      <w:jc w:val="center"/>
+    </w:pPr>
+    <w:r>
+      <w:t xml:space="preserve">Page </w:t>
+    </w:r>
+    <w:r>
+      <w:rPr>
+        <w:b/>
+        <w:bCs/>
+      </w:rPr>
+      <w:fldChar w:fldCharType="begin"/>
+    </w:r>
+    <w:r>
+      <w:rPr>
+        <w:b/>
+        <w:bCs/>
+      </w:rPr>
+      <w:instrText xml:space="preserve"> PAGE  \* Arabic  \* MERGEFORMAT </w:instrText>
+    </w:r>
+    <w:r>
+      <w:rPr>
+        <w:b/>
+        <w:bCs/>
+      </w:rPr>
+      <w:fldChar w:fldCharType="separate"/>
+    </w:r>
+    <w:r>
+      <w:rPr>
+        <w:b/>
+        <w:bCs/>
+        <w:noProof/>
+      </w:rPr>
+      <w:t>5</w:t>
+    </w:r>
+    <w:r>
+      <w:rPr>
+        <w:b/>
+        <w:bCs/>
+      </w:rPr>
+      <w:fldChar w:fldCharType="end"/>
+    </w:r>
+    <w:r>
+      <w:t xml:space="preserve"> of </w:t>
+    </w:r>
+    <w:r>
+      <w:rPr>
+        <w:b/>
+        <w:bCs/>
+      </w:rPr>
+      <w:fldChar w:fldCharType="begin"/>
+    </w:r>
+    <w:r>
+      <w:rPr>
+        <w:b/>
+        <w:bCs/>
+      </w:rPr>
+      <w:instrText xml:space="preserve"> NUMPAGES  \* Arabic  \* MERGEFORMAT </w:instrText>
+    </w:r>
+    <w:r>
+      <w:rPr>
+        <w:b/>
+        <w:bCs/>
+      </w:rPr>
+      <w:fldChar w:fldCharType="separate"/>
+    </w:r>
+    <w:r>
+      <w:rPr>
+        <w:b/>
+        <w:bCs/>
+        <w:noProof/>
+      </w:rPr>
       <w:t>198</w:t>
     </w:r>
     <w:r>
@@ -1295,46 +1329,45 @@
   <w:p>
     <w:pPr>
       <w:pStyle w:val="Header"/>
-      <w:jc w:val="center"/>
     </w:pPr>
-    <w:r>
-      <w:rPr>
-        <w:noProof/>
-      </w:rPr>
-      <w:fldChar w:fldCharType="begin"/>
-    </w:r>
-    <w:r>
-      <w:rPr>
-        <w:noProof/>
-      </w:rPr>
-      <w:instrText xml:space="preserve"> STYLEREF  "Heading 3"  \* MERGEFORMAT </w:instrText>
-    </w:r>
-    <w:r>
-      <w:rPr>
-        <w:noProof/>
-      </w:rPr>
-      <w:fldChar w:fldCharType="separate"/>
-    </w:r>
-    <w:r>
-      <w:rPr>
-        <w:b/>
-        <w:bCs/>
-        <w:noProof/>
-        <w:lang w:val="en-US"/>
-      </w:rPr>
-      <w:t>Error! No text of specified style in document.</w:t>
-    </w:r>
-    <w:r>
-      <w:rPr>
-        <w:noProof/>
-      </w:rPr>
-      <w:fldChar w:fldCharType="end"/>
-    </w:r>
   </w:p>
 </w:hdr>
 </file>
 
 <file path=word/header2.xml><?xml version="1.0" encoding="utf-8"?>
+<w:hdr xmlns:wpc="http://schemas.microsoft.com/office/word/2010/wordprocessingCanvas" xmlns:mc="http://schemas.openxmlformats.org/markup-compatibility/2006" xmlns:o="urn:schemas-microsoft-com:office:office" xmlns:r="http://schemas.openxmlformats.org/officeDocument/2006/relationships" xmlns:m="http://schemas.openxmlformats.org/officeDocument/2006/math" xmlns:v="urn:schemas-microsoft-com:vml" xmlns:wp14="http://schemas.microsoft.com/office/word/2010/wordprocessingDrawing" xmlns:wp="http://schemas.openxmlformats.org/drawingml/2006/wordprocessingDrawing" xmlns:w10="urn:schemas-microsoft-com:office:word" xmlns:w="http://schemas.openxmlformats.org/wordprocessingml/2006/main" xmlns:w14="http://schemas.microsoft.com/office/word/2010/wordml" xmlns:w15="http://schemas.microsoft.com/office/word/2012/wordml" xmlns:wpg="http://schemas.microsoft.com/office/word/2010/wordprocessingGroup" xmlns:wpi="http://schemas.microsoft.com/office/word/2010/wordprocessingInk" xmlns:wne="http://schemas.microsoft.com/office/word/2006/wordml" xmlns:wps="http://schemas.microsoft.com/office/word/2010/wordprocessingShape" mc:Ignorable="w14 w15 wp14">
+  <w:p>
+    <w:pPr>
+      <w:pStyle w:val="Header"/>
+    </w:pPr>
+  </w:p>
+</w:hdr>
+</file>
+
+<file path=word/header3.xml><?xml version="1.0" encoding="utf-8"?>
+<w:hdr xmlns:wpc="http://schemas.microsoft.com/office/word/2010/wordprocessingCanvas" xmlns:mc="http://schemas.openxmlformats.org/markup-compatibility/2006" xmlns:o="urn:schemas-microsoft-com:office:office" xmlns:r="http://schemas.openxmlformats.org/officeDocument/2006/relationships" xmlns:m="http://schemas.openxmlformats.org/officeDocument/2006/math" xmlns:v="urn:schemas-microsoft-com:vml" xmlns:wp14="http://schemas.microsoft.com/office/word/2010/wordprocessingDrawing" xmlns:wp="http://schemas.openxmlformats.org/drawingml/2006/wordprocessingDrawing" xmlns:w10="urn:schemas-microsoft-com:office:word" xmlns:w="http://schemas.openxmlformats.org/wordprocessingml/2006/main" xmlns:w14="http://schemas.microsoft.com/office/word/2010/wordml" xmlns:w15="http://schemas.microsoft.com/office/word/2012/wordml" xmlns:wpg="http://schemas.microsoft.com/office/word/2010/wordprocessingGroup" xmlns:wpi="http://schemas.microsoft.com/office/word/2010/wordprocessingInk" xmlns:wne="http://schemas.microsoft.com/office/word/2006/wordml" xmlns:wps="http://schemas.microsoft.com/office/word/2010/wordprocessingShape" mc:Ignorable="w14 w15 wp14">
+  <w:p>
+    <w:pPr>
+      <w:pStyle w:val="Header"/>
+    </w:pPr>
+  </w:p>
+</w:hdr>
+</file>
+
+<file path=word/header4.xml><?xml version="1.0" encoding="utf-8"?>
+<w:hdr xmlns:wpc="http://schemas.microsoft.com/office/word/2010/wordprocessingCanvas" xmlns:mc="http://schemas.openxmlformats.org/markup-compatibility/2006" xmlns:o="urn:schemas-microsoft-com:office:office" xmlns:r="http://schemas.openxmlformats.org/officeDocument/2006/relationships" xmlns:m="http://schemas.openxmlformats.org/officeDocument/2006/math" xmlns:v="urn:schemas-microsoft-com:vml" xmlns:wp14="http://schemas.microsoft.com/office/word/2010/wordprocessingDrawing" xmlns:wp="http://schemas.openxmlformats.org/drawingml/2006/wordprocessingDrawing" xmlns:w10="urn:schemas-microsoft-com:office:word" xmlns:w="http://schemas.openxmlformats.org/wordprocessingml/2006/main" xmlns:w14="http://schemas.microsoft.com/office/word/2010/wordml" xmlns:w15="http://schemas.microsoft.com/office/word/2012/wordml" xmlns:wpg="http://schemas.microsoft.com/office/word/2010/wordprocessingGroup" xmlns:wpi="http://schemas.microsoft.com/office/word/2010/wordprocessingInk" xmlns:wne="http://schemas.microsoft.com/office/word/2006/wordml" xmlns:wps="http://schemas.microsoft.com/office/word/2010/wordprocessingShape" mc:Ignorable="w14 w15 wp14">
+  <w:p>
+    <w:pPr>
+      <w:pStyle w:val="Header"/>
+      <w:jc w:val="center"/>
+    </w:pPr>
+    <w:bookmarkStart w:id="2" w:name="_GoBack"/>
+    <w:bookmarkEnd w:id="2"/>
+  </w:p>
+</w:hdr>
+</file>
+
+<file path=word/header5.xml><?xml version="1.0" encoding="utf-8"?>
 <w:hdr xmlns:wpc="http://schemas.microsoft.com/office/word/2010/wordprocessingCanvas" xmlns:mc="http://schemas.openxmlformats.org/markup-compatibility/2006" xmlns:o="urn:schemas-microsoft-com:office:office" xmlns:r="http://schemas.openxmlformats.org/officeDocument/2006/relationships" xmlns:m="http://schemas.openxmlformats.org/officeDocument/2006/math" xmlns:v="urn:schemas-microsoft-com:vml" xmlns:wp14="http://schemas.microsoft.com/office/word/2010/wordprocessingDrawing" xmlns:wp="http://schemas.openxmlformats.org/drawingml/2006/wordprocessingDrawing" xmlns:w10="urn:schemas-microsoft-com:office:word" xmlns:w="http://schemas.openxmlformats.org/wordprocessingml/2006/main" xmlns:w14="http://schemas.microsoft.com/office/word/2010/wordml" xmlns:w15="http://schemas.microsoft.com/office/word/2012/wordml" xmlns:wpg="http://schemas.microsoft.com/office/word/2010/wordprocessingGroup" xmlns:wpi="http://schemas.microsoft.com/office/word/2010/wordprocessingInk" xmlns:wne="http://schemas.microsoft.com/office/word/2006/wordml" xmlns:wps="http://schemas.microsoft.com/office/word/2010/wordprocessingShape" mc:Ignorable="w14 w15 wp14">
   <w:p>
     <w:pPr>
@@ -3628,7 +3661,7 @@
 </file>
 
 <file path=customXml/itemProps1.xml><?xml version="1.0" encoding="utf-8"?>
-<ds:datastoreItem xmlns:ds="http://schemas.openxmlformats.org/officeDocument/2006/customXml" ds:itemID="{3C9660D2-6004-4F31-A516-54FCD59612FB}">
+<ds:datastoreItem xmlns:ds="http://schemas.openxmlformats.org/officeDocument/2006/customXml" ds:itemID="{F4B3E128-AF0C-4B7C-ADD3-4F1F82441278}">
   <ds:schemaRefs>
     <ds:schemaRef ds:uri="http://schemas.openxmlformats.org/officeDocument/2006/bibliography"/>
   </ds:schemaRefs>

</xml_diff>

<commit_message>
Update the Docx template and make a few tweaks to accommodate it
Many of requested changes from PO could/can be implemented by using
our Word template architecture. PO provided an updated generated docx
file that had the new look and feel that is desired. The PO used Word
styles to do this correctly. So we turned
that document minus most of its content which is generated
programmatically into the new template making sure that the HTML to
Docx conversion which handles some of the Docx content generation
mapped properly to the defined styles.
</commit_message>
<xml_diff>
--- a/template.docx
+++ b/template.docx
@@ -16,7 +16,23 @@
           <w:sz w:val="32"/>
           <w:szCs w:val="32"/>
         </w:rPr>
-        <w:t>{{ title1 }}</w:t>
+        <w:t>{</w:t>
+      </w:r>
+      <w:proofErr w:type="gramStart"/>
+      <w:r>
+        <w:rPr>
+          <w:sz w:val="32"/>
+          <w:szCs w:val="32"/>
+        </w:rPr>
+        <w:t>{ title1</w:t>
+      </w:r>
+      <w:proofErr w:type="gramEnd"/>
+      <w:r>
+        <w:rPr>
+          <w:sz w:val="32"/>
+          <w:szCs w:val="32"/>
+        </w:rPr>
+        <w:t xml:space="preserve"> }}</w:t>
       </w:r>
     </w:p>
     <w:p>
@@ -32,7 +48,23 @@
           <w:sz w:val="32"/>
           <w:szCs w:val="32"/>
         </w:rPr>
-        <w:t>{{ title2 }}</w:t>
+        <w:t>{</w:t>
+      </w:r>
+      <w:proofErr w:type="gramStart"/>
+      <w:r>
+        <w:rPr>
+          <w:sz w:val="32"/>
+          <w:szCs w:val="32"/>
+        </w:rPr>
+        <w:t>{ title2</w:t>
+      </w:r>
+      <w:proofErr w:type="gramEnd"/>
+      <w:r>
+        <w:rPr>
+          <w:sz w:val="32"/>
+          <w:szCs w:val="32"/>
+        </w:rPr>
+        <w:t xml:space="preserve"> }}</w:t>
       </w:r>
     </w:p>
     <w:p>
@@ -48,140 +80,158 @@
           <w:sz w:val="28"/>
           <w:szCs w:val="28"/>
         </w:rPr>
-        <w:t>{{ title3 }}</w:t>
+        <w:t>{</w:t>
+      </w:r>
+      <w:proofErr w:type="gramStart"/>
+      <w:r>
+        <w:rPr>
+          <w:sz w:val="28"/>
+          <w:szCs w:val="28"/>
+        </w:rPr>
+        <w:t>{ title3</w:t>
+      </w:r>
+      <w:proofErr w:type="gramEnd"/>
+      <w:r>
+        <w:rPr>
+          <w:sz w:val="28"/>
+          <w:szCs w:val="28"/>
+        </w:rPr>
+        <w:t xml:space="preserve"> }}</w:t>
       </w:r>
     </w:p>
     <w:p>
       <w:pPr>
-        <w:rPr>
-          <w:sz w:val="22"/>
-          <w:szCs w:val="22"/>
+        <w:pStyle w:val="Subtitle"/>
+        <w:rPr>
+          <w:sz w:val="32"/>
+          <w:szCs w:val="32"/>
         </w:rPr>
       </w:pPr>
     </w:p>
     <w:p>
       <w:pPr>
-        <w:rPr>
-          <w:sz w:val="22"/>
-          <w:szCs w:val="22"/>
+        <w:pStyle w:val="Subtitle"/>
+        <w:rPr>
+          <w:sz w:val="28"/>
+          <w:szCs w:val="28"/>
         </w:rPr>
       </w:pPr>
     </w:p>
     <w:p>
       <w:pPr>
         <w:rPr>
-          <w:sz w:val="22"/>
-          <w:szCs w:val="22"/>
+          <w:color w:val="000000" w:themeColor="text1"/>
         </w:rPr>
       </w:pPr>
     </w:p>
     <w:p>
       <w:pPr>
-        <w:spacing w:after="0" w:line="259" w:lineRule="auto"/>
-        <w:rPr>
-          <w:rFonts w:ascii="Cambria" w:eastAsia="Calibri" w:hAnsi="Cambria" w:cs="Calibri"/>
-          <w:sz w:val="22"/>
-          <w:szCs w:val="22"/>
-          <w:lang w:val="en-US"/>
-        </w:rPr>
-      </w:pPr>
-      <w:r>
-        <w:rPr>
-          <w:sz w:val="22"/>
-          <w:szCs w:val="22"/>
-        </w:rPr>
-        <w:br w:type="page"/>
-      </w:r>
-      <w:bookmarkStart w:id="1" w:name="_Hlk117865285"/>
-      <w:r>
-        <w:rPr>
-          <w:rFonts w:ascii="Cambria" w:eastAsia="Calibri" w:hAnsi="Cambria" w:cs="Calibri"/>
-          <w:sz w:val="22"/>
-          <w:szCs w:val="22"/>
-          <w:lang w:val="en-US"/>
-        </w:rPr>
-        <w:lastRenderedPageBreak/>
-        <w:t>©2026</w:t>
-      </w:r>
-      <w:r>
-        <w:rPr>
-          <w:rFonts w:ascii="Cambria" w:eastAsia="Calibri" w:hAnsi="Cambria" w:cs="Calibri"/>
-          <w:sz w:val="22"/>
-          <w:szCs w:val="22"/>
-          <w:lang w:val="en-US"/>
-        </w:rPr>
-        <w:t xml:space="preserve"> Wycliffe Associates</w:t>
-      </w:r>
+        <w:rPr>
+          <w:color w:val="000000" w:themeColor="text1"/>
+        </w:rPr>
+      </w:pPr>
     </w:p>
     <w:p>
       <w:pPr>
-        <w:spacing w:after="0" w:line="259" w:lineRule="auto"/>
-        <w:rPr>
-          <w:rFonts w:ascii="Cambria" w:eastAsia="Calibri" w:hAnsi="Cambria" w:cs="Calibri"/>
-          <w:sz w:val="22"/>
-          <w:szCs w:val="22"/>
-          <w:lang w:val="en-US"/>
-        </w:rPr>
-      </w:pPr>
-      <w:r>
-        <w:rPr>
-          <w:rFonts w:ascii="Cambria" w:eastAsia="Calibri" w:hAnsi="Cambria" w:cs="Calibri"/>
-          <w:sz w:val="22"/>
-          <w:szCs w:val="22"/>
-          <w:lang w:val="en-US"/>
-        </w:rPr>
-        <w:t>Released under a Creative Commons Attribution-ShareAlike 4.0 International License.</w:t>
-      </w:r>
+        <w:rPr>
+          <w:color w:val="000000" w:themeColor="text1"/>
+        </w:rPr>
+      </w:pPr>
     </w:p>
     <w:p>
       <w:pPr>
         <w:spacing w:after="0"/>
-        <w:textAlignment w:val="baseline"/>
-        <w:rPr>
-          <w:rFonts w:ascii="Cambria" w:eastAsia="Times New Roman" w:hAnsi="Cambria" w:cs="Calibri"/>
-          <w:sz w:val="22"/>
-          <w:szCs w:val="22"/>
-          <w:lang w:val="en-US"/>
-        </w:rPr>
-      </w:pPr>
+        <w:rPr>
+          <w:rFonts w:eastAsia="Calibri" w:cs="Noto Sans NKo"/>
+          <w:color w:val="000000" w:themeColor="text1"/>
+        </w:rPr>
+      </w:pPr>
+      <w:r>
+        <w:rPr>
+          <w:color w:val="000000" w:themeColor="text1"/>
+        </w:rPr>
+        <w:br w:type="page"/>
+      </w:r>
+      <w:bookmarkStart w:id="1" w:name="_Hlk117865285"/>
+      <w:r>
+        <w:rPr>
+          <w:rFonts w:ascii="Calibri" w:eastAsia="Calibri" w:hAnsi="Calibri" w:cs="Calibri"/>
+          <w:color w:val="000000" w:themeColor="text1"/>
+        </w:rPr>
+        <w:lastRenderedPageBreak/>
+        <w:t>©</w:t>
+      </w:r>
+      <w:r>
+        <w:rPr>
+          <w:rFonts w:eastAsia="Calibri" w:cs="Noto Sans NKo"/>
+          <w:color w:val="000000" w:themeColor="text1"/>
+        </w:rPr>
+        <w:t>2026 Wycliffe Associates</w:t>
+      </w:r>
     </w:p>
     <w:p>
       <w:pPr>
-        <w:spacing w:after="0" w:line="259" w:lineRule="auto"/>
-        <w:rPr>
-          <w:rFonts w:ascii="Cambria" w:eastAsia="Calibri" w:hAnsi="Cambria" w:cs="Arial"/>
-          <w:sz w:val="22"/>
-          <w:szCs w:val="22"/>
-          <w:lang w:val="en-US"/>
-        </w:rPr>
-      </w:pPr>
-      <w:r>
-        <w:rPr>
-          <w:rFonts w:ascii="Cambria" w:eastAsia="Calibri" w:hAnsi="Cambria" w:cs="Calibri"/>
-          <w:sz w:val="22"/>
-          <w:szCs w:val="22"/>
-          <w:lang w:val="en-US"/>
-        </w:rPr>
-        <w:t>To view a copy of the CC BY-SA 4.0 license</w:t>
-      </w:r>
-      <w:r>
-        <w:rPr>
-          <w:rFonts w:ascii="Cambria" w:eastAsia="Calibri" w:hAnsi="Cambria" w:cs="Arial"/>
-          <w:sz w:val="22"/>
-          <w:szCs w:val="22"/>
-          <w:lang w:val="en-US"/>
-        </w:rPr>
-        <w:t xml:space="preserve"> visit </w:t>
-      </w:r>
-      <w:hyperlink r:id="rId8" w:history="1">
+        <w:spacing w:after="0"/>
+        <w:rPr>
+          <w:rFonts w:eastAsia="Calibri" w:cs="Noto Sans NKo"/>
+          <w:color w:val="000000" w:themeColor="text1"/>
+        </w:rPr>
+      </w:pPr>
+      <w:r>
+        <w:rPr>
+          <w:rFonts w:eastAsia="Calibri" w:cs="Noto Sans NKo"/>
+          <w:color w:val="000000" w:themeColor="text1"/>
+        </w:rPr>
+        <w:t>Released under a Creative Commons Attribution-</w:t>
+      </w:r>
+      <w:proofErr w:type="spellStart"/>
+      <w:r>
+        <w:rPr>
+          <w:rFonts w:eastAsia="Calibri" w:cs="Noto Sans NKo"/>
+          <w:color w:val="000000" w:themeColor="text1"/>
+        </w:rPr>
+        <w:t>ShareAlike</w:t>
+      </w:r>
+      <w:proofErr w:type="spellEnd"/>
+      <w:r>
+        <w:rPr>
+          <w:rFonts w:eastAsia="Calibri" w:cs="Noto Sans NKo"/>
+          <w:color w:val="000000" w:themeColor="text1"/>
+        </w:rPr>
+        <w:t xml:space="preserve"> 4.0 International License.</w:t>
+      </w:r>
+    </w:p>
+    <w:p>
+      <w:pPr>
+        <w:spacing w:after="0"/>
+        <w:textAlignment w:val="baseline"/>
+        <w:rPr>
+          <w:rFonts w:eastAsia="Times New Roman" w:cs="Noto Sans NKo"/>
+          <w:color w:val="000000" w:themeColor="text1"/>
+        </w:rPr>
+      </w:pPr>
+    </w:p>
+    <w:p>
+      <w:pPr>
+        <w:spacing w:after="0"/>
+        <w:rPr>
+          <w:rFonts w:eastAsia="Calibri" w:cs="Noto Sans NKo"/>
+          <w:color w:val="000000" w:themeColor="text1"/>
+        </w:rPr>
+      </w:pPr>
+      <w:r>
+        <w:rPr>
+          <w:rFonts w:eastAsia="Calibri" w:cs="Noto Sans NKo"/>
+          <w:color w:val="000000" w:themeColor="text1"/>
+        </w:rPr>
+        <w:t xml:space="preserve">To view a copy of the CC BY-SA 4.0 license visit </w:t>
+      </w:r>
+      <w:hyperlink r:id="rId7" w:history="1">
         <w:r>
           <w:rPr>
-            <w:rFonts w:ascii="Cambria" w:eastAsia="Calibri" w:hAnsi="Cambria" w:cs="Arial"/>
-            <w:color w:val="0563C1"/>
-            <w:sz w:val="22"/>
-            <w:szCs w:val="22"/>
+            <w:rFonts w:eastAsia="Calibri" w:cs="Noto Sans NKo"/>
+            <w:color w:val="000000" w:themeColor="text1"/>
             <w:u w:val="single"/>
-            <w:lang w:val="en-US"/>
           </w:rPr>
           <w:t>http://creativecommons.org/licenses/by-sa/4.0/</w:t>
         </w:r>
@@ -192,53 +242,51 @@
         <w:spacing w:after="0"/>
         <w:textAlignment w:val="baseline"/>
         <w:rPr>
-          <w:rFonts w:ascii="Cambria" w:eastAsia="Times New Roman" w:hAnsi="Cambria" w:cs="Calibri"/>
-          <w:sz w:val="22"/>
-          <w:szCs w:val="22"/>
-          <w:lang w:val="en-US"/>
+          <w:rFonts w:eastAsia="Times New Roman" w:cs="Noto Sans NKo"/>
+          <w:color w:val="000000" w:themeColor="text1"/>
         </w:rPr>
       </w:pPr>
     </w:p>
     <w:p>
       <w:pPr>
-        <w:spacing w:after="0" w:line="259" w:lineRule="auto"/>
-        <w:rPr>
-          <w:rFonts w:ascii="Cambria" w:eastAsia="Calibri" w:hAnsi="Cambria" w:cs="Arial"/>
+        <w:spacing w:after="0"/>
+        <w:rPr>
+          <w:rFonts w:eastAsia="Calibri" w:cs="Noto Sans NKo"/>
+          <w:color w:val="000000" w:themeColor="text1"/>
           <w:sz w:val="20"/>
           <w:szCs w:val="20"/>
-          <w:lang w:val="en-US"/>
-        </w:rPr>
-      </w:pPr>
-      <w:r>
-        <w:rPr>
-          <w:rFonts w:ascii="Cambria" w:eastAsia="Calibri" w:hAnsi="Cambria" w:cs="Arial"/>
+        </w:rPr>
+      </w:pPr>
+      <w:r>
+        <w:rPr>
+          <w:rFonts w:eastAsia="Calibri" w:cs="Noto Sans NKo"/>
+          <w:color w:val="000000" w:themeColor="text1"/>
           <w:sz w:val="20"/>
           <w:szCs w:val="20"/>
-          <w:lang w:val="en-US"/>
         </w:rPr>
         <w:t>Below is a human-readable summary of (and not a substitute for) the license.</w:t>
       </w:r>
     </w:p>
     <w:p>
       <w:pPr>
-        <w:spacing w:after="0" w:line="259" w:lineRule="auto"/>
-        <w:rPr>
-          <w:rFonts w:ascii="Cambria" w:eastAsia="Calibri" w:hAnsi="Cambria" w:cs="Arial"/>
+        <w:spacing w:after="0"/>
+        <w:rPr>
+          <w:rFonts w:eastAsia="Calibri" w:cs="Noto Sans NKo"/>
           <w:b/>
           <w:bCs/>
+          <w:color w:val="000000" w:themeColor="text1"/>
           <w:sz w:val="20"/>
           <w:szCs w:val="20"/>
-          <w:lang w:val="en-US"/>
-        </w:rPr>
-      </w:pPr>
-      <w:r>
-        <w:rPr>
-          <w:rFonts w:ascii="Cambria" w:eastAsia="Calibri" w:hAnsi="Cambria" w:cs="Arial"/>
+        </w:rPr>
+      </w:pPr>
+      <w:r>
+        <w:rPr>
+          <w:rFonts w:eastAsia="Calibri" w:cs="Noto Sans NKo"/>
           <w:b/>
           <w:bCs/>
+          <w:color w:val="000000" w:themeColor="text1"/>
           <w:sz w:val="20"/>
           <w:szCs w:val="20"/>
-          <w:lang w:val="en-US"/>
         </w:rPr>
         <w:t>You are free to:</w:t>
       </w:r>
@@ -249,33 +297,42 @@
           <w:ilvl w:val="0"/>
           <w:numId w:val="4"/>
         </w:numPr>
-        <w:spacing w:after="0" w:line="259" w:lineRule="auto"/>
-        <w:rPr>
-          <w:rFonts w:ascii="Cambria" w:eastAsia="Calibri" w:hAnsi="Cambria" w:cs="Arial"/>
+        <w:spacing w:after="0"/>
+        <w:rPr>
+          <w:rFonts w:eastAsia="Calibri" w:cs="Noto Sans NKo"/>
+          <w:color w:val="000000" w:themeColor="text1"/>
           <w:sz w:val="20"/>
           <w:szCs w:val="20"/>
-          <w:lang w:val="en-US"/>
-        </w:rPr>
-      </w:pPr>
-      <w:r>
-        <w:rPr>
-          <w:rFonts w:ascii="Cambria" w:eastAsia="Calibri" w:hAnsi="Cambria" w:cs="Arial"/>
+        </w:rPr>
+      </w:pPr>
+      <w:r>
+        <w:rPr>
+          <w:rFonts w:eastAsia="Calibri" w:cs="Noto Sans NKo"/>
           <w:b/>
           <w:bCs/>
+          <w:color w:val="000000" w:themeColor="text1"/>
           <w:sz w:val="20"/>
           <w:szCs w:val="20"/>
-          <w:lang w:val="en-US"/>
         </w:rPr>
         <w:t>Share</w:t>
       </w:r>
       <w:r>
         <w:rPr>
-          <w:rFonts w:ascii="Cambria" w:eastAsia="Calibri" w:hAnsi="Cambria" w:cs="Arial"/>
+          <w:rFonts w:ascii="Arial" w:eastAsia="Calibri" w:hAnsi="Arial" w:cs="Arial"/>
+          <w:color w:val="000000" w:themeColor="text1"/>
           <w:sz w:val="20"/>
           <w:szCs w:val="20"/>
-          <w:lang w:val="en-US"/>
-        </w:rPr>
-        <w:t>— copy and redistribute the material in any medium or format.</w:t>
+        </w:rPr>
+        <w:t>—</w:t>
+      </w:r>
+      <w:r>
+        <w:rPr>
+          <w:rFonts w:eastAsia="Calibri" w:cs="Noto Sans NKo"/>
+          <w:color w:val="000000" w:themeColor="text1"/>
+          <w:sz w:val="20"/>
+          <w:szCs w:val="20"/>
+        </w:rPr>
+        <w:t xml:space="preserve"> copy and redistribute the material in any medium or format.</w:t>
       </w:r>
     </w:p>
     <w:p>
@@ -284,76 +341,85 @@
           <w:ilvl w:val="0"/>
           <w:numId w:val="4"/>
         </w:numPr>
-        <w:spacing w:after="0" w:line="259" w:lineRule="auto"/>
-        <w:rPr>
-          <w:rFonts w:ascii="Cambria" w:eastAsia="Calibri" w:hAnsi="Cambria" w:cs="Arial"/>
+        <w:spacing w:after="0"/>
+        <w:rPr>
+          <w:rFonts w:eastAsia="Calibri" w:cs="Noto Sans NKo"/>
+          <w:color w:val="000000" w:themeColor="text1"/>
           <w:sz w:val="20"/>
           <w:szCs w:val="20"/>
-          <w:lang w:val="en-US"/>
-        </w:rPr>
-      </w:pPr>
-      <w:r>
-        <w:rPr>
-          <w:rFonts w:ascii="Cambria" w:eastAsia="Calibri" w:hAnsi="Cambria" w:cs="Arial"/>
+        </w:rPr>
+      </w:pPr>
+      <w:r>
+        <w:rPr>
+          <w:rFonts w:eastAsia="Calibri" w:cs="Noto Sans NKo"/>
           <w:b/>
           <w:bCs/>
+          <w:color w:val="000000" w:themeColor="text1"/>
           <w:sz w:val="20"/>
           <w:szCs w:val="20"/>
-          <w:lang w:val="en-US"/>
         </w:rPr>
         <w:t>Adapt</w:t>
       </w:r>
       <w:r>
         <w:rPr>
-          <w:rFonts w:ascii="Cambria" w:eastAsia="Calibri" w:hAnsi="Cambria" w:cs="Arial"/>
+          <w:rFonts w:ascii="Arial" w:eastAsia="Calibri" w:hAnsi="Arial" w:cs="Arial"/>
+          <w:color w:val="000000" w:themeColor="text1"/>
           <w:sz w:val="20"/>
           <w:szCs w:val="20"/>
-          <w:lang w:val="en-US"/>
-        </w:rPr>
-        <w:t>— remix, transform, and build upon the material for any purpose, even commercially.</w:t>
+        </w:rPr>
+        <w:t>—</w:t>
+      </w:r>
+      <w:r>
+        <w:rPr>
+          <w:rFonts w:eastAsia="Calibri" w:cs="Noto Sans NKo"/>
+          <w:color w:val="000000" w:themeColor="text1"/>
+          <w:sz w:val="20"/>
+          <w:szCs w:val="20"/>
+        </w:rPr>
+        <w:t xml:space="preserve"> remix, transform, and build upon the material for any purpose, even commercially.</w:t>
       </w:r>
     </w:p>
     <w:p>
       <w:pPr>
-        <w:spacing w:after="0" w:line="259" w:lineRule="auto"/>
+        <w:spacing w:after="0"/>
         <w:ind w:left="360"/>
         <w:rPr>
-          <w:rFonts w:ascii="Cambria" w:eastAsia="Calibri" w:hAnsi="Cambria" w:cs="Arial"/>
+          <w:rFonts w:eastAsia="Calibri" w:cs="Noto Sans NKo"/>
+          <w:color w:val="000000" w:themeColor="text1"/>
           <w:sz w:val="20"/>
           <w:szCs w:val="20"/>
-          <w:lang w:val="en-US"/>
-        </w:rPr>
-      </w:pPr>
-      <w:r>
-        <w:rPr>
-          <w:rFonts w:ascii="Cambria" w:eastAsia="Calibri" w:hAnsi="Cambria" w:cs="Arial"/>
+        </w:rPr>
+      </w:pPr>
+      <w:r>
+        <w:rPr>
+          <w:rFonts w:eastAsia="Calibri" w:cs="Noto Sans NKo"/>
+          <w:color w:val="000000" w:themeColor="text1"/>
           <w:sz w:val="20"/>
           <w:szCs w:val="20"/>
-          <w:lang w:val="en-US"/>
         </w:rPr>
         <w:t>The licensor cannot revoke these freedoms as long as you follow the license terms.</w:t>
       </w:r>
     </w:p>
     <w:p>
       <w:pPr>
-        <w:spacing w:after="0" w:line="259" w:lineRule="auto"/>
-        <w:rPr>
-          <w:rFonts w:ascii="Cambria" w:eastAsia="Calibri" w:hAnsi="Cambria" w:cs="Arial"/>
+        <w:spacing w:after="0"/>
+        <w:rPr>
+          <w:rFonts w:eastAsia="Calibri" w:cs="Noto Sans NKo"/>
           <w:b/>
           <w:bCs/>
+          <w:color w:val="000000" w:themeColor="text1"/>
           <w:sz w:val="20"/>
           <w:szCs w:val="20"/>
-          <w:lang w:val="en-US"/>
-        </w:rPr>
-      </w:pPr>
-      <w:r>
-        <w:rPr>
-          <w:rFonts w:ascii="Cambria" w:eastAsia="Calibri" w:hAnsi="Cambria" w:cs="Arial"/>
+        </w:rPr>
+      </w:pPr>
+      <w:r>
+        <w:rPr>
+          <w:rFonts w:eastAsia="Calibri" w:cs="Noto Sans NKo"/>
           <w:b/>
           <w:bCs/>
+          <w:color w:val="000000" w:themeColor="text1"/>
           <w:sz w:val="20"/>
           <w:szCs w:val="20"/>
-          <w:lang w:val="en-US"/>
         </w:rPr>
         <w:t>Under the following conditions:</w:t>
       </w:r>
@@ -364,55 +430,99 @@
           <w:ilvl w:val="0"/>
           <w:numId w:val="5"/>
         </w:numPr>
-        <w:spacing w:after="0" w:line="259" w:lineRule="auto"/>
-        <w:rPr>
-          <w:rFonts w:ascii="Cambria" w:eastAsia="Calibri" w:hAnsi="Cambria" w:cs="Arial"/>
+        <w:spacing w:after="0"/>
+        <w:rPr>
+          <w:rFonts w:eastAsia="Calibri" w:cs="Noto Sans NKo"/>
+          <w:color w:val="000000" w:themeColor="text1"/>
           <w:sz w:val="20"/>
           <w:szCs w:val="20"/>
-          <w:lang w:val="en-US"/>
-        </w:rPr>
-      </w:pPr>
-      <w:r>
-        <w:rPr>
-          <w:rFonts w:ascii="Cambria" w:eastAsia="Calibri" w:hAnsi="Cambria" w:cs="Arial"/>
+        </w:rPr>
+      </w:pPr>
+      <w:r>
+        <w:rPr>
+          <w:rFonts w:eastAsia="Calibri" w:cs="Noto Sans NKo"/>
           <w:b/>
           <w:bCs/>
+          <w:color w:val="000000" w:themeColor="text1"/>
           <w:sz w:val="20"/>
           <w:szCs w:val="20"/>
-          <w:lang w:val="en-US"/>
         </w:rPr>
         <w:t>Attribution</w:t>
       </w:r>
       <w:r>
         <w:rPr>
-          <w:rFonts w:ascii="Cambria" w:eastAsia="Calibri" w:hAnsi="Cambria" w:cs="Arial"/>
+          <w:rFonts w:ascii="Arial" w:eastAsia="Calibri" w:hAnsi="Arial" w:cs="Arial"/>
+          <w:color w:val="000000" w:themeColor="text1"/>
           <w:sz w:val="20"/>
           <w:szCs w:val="20"/>
-          <w:lang w:val="en-US"/>
-        </w:rPr>
-        <w:t xml:space="preserve">— You must attribute the work as follows: “Original work available at </w:t>
-      </w:r>
-      <w:hyperlink r:id="rId9" w:history="1">
+        </w:rPr>
+        <w:t>—</w:t>
+      </w:r>
+      <w:r>
+        <w:rPr>
+          <w:rFonts w:eastAsia="Calibri" w:cs="Noto Sans NKo"/>
+          <w:color w:val="000000" w:themeColor="text1"/>
+          <w:sz w:val="20"/>
+          <w:szCs w:val="20"/>
+        </w:rPr>
+        <w:t xml:space="preserve"> You must attribute the work as follows: </w:t>
+      </w:r>
+      <w:r>
+        <w:rPr>
+          <w:rFonts w:ascii="Arial" w:eastAsia="Calibri" w:hAnsi="Arial" w:cs="Arial"/>
+          <w:color w:val="000000" w:themeColor="text1"/>
+          <w:sz w:val="20"/>
+          <w:szCs w:val="20"/>
+        </w:rPr>
+        <w:t>“</w:t>
+      </w:r>
+      <w:r>
+        <w:rPr>
+          <w:rFonts w:eastAsia="Calibri" w:cs="Noto Sans NKo"/>
+          <w:color w:val="000000" w:themeColor="text1"/>
+          <w:sz w:val="20"/>
+          <w:szCs w:val="20"/>
+        </w:rPr>
+        <w:t xml:space="preserve">Original work available at </w:t>
+      </w:r>
+      <w:hyperlink r:id="rId8" w:history="1">
         <w:r>
           <w:rPr>
-            <w:rFonts w:ascii="Cambria" w:eastAsia="Calibri" w:hAnsi="Cambria" w:cs="Arial"/>
-            <w:color w:val="0563C1"/>
+            <w:rFonts w:eastAsia="Calibri" w:cs="Noto Sans NKo"/>
+            <w:color w:val="000000" w:themeColor="text1"/>
             <w:sz w:val="20"/>
             <w:szCs w:val="20"/>
             <w:u w:val="single"/>
-            <w:lang w:val="en-US"/>
           </w:rPr>
           <w:t>https://BibleInEveryLanguage.org</w:t>
         </w:r>
       </w:hyperlink>
       <w:r>
         <w:rPr>
-          <w:rFonts w:ascii="Cambria" w:eastAsia="Calibri" w:hAnsi="Cambria" w:cs="Arial"/>
+          <w:rFonts w:eastAsia="Calibri" w:cs="Noto Sans NKo"/>
+          <w:color w:val="000000" w:themeColor="text1"/>
           <w:sz w:val="20"/>
           <w:szCs w:val="20"/>
-          <w:lang w:val="en-US"/>
-        </w:rPr>
-        <w:t>.” Attribution statements in derivative works should not in any way suggest that we endorse you or your use of this work.</w:t>
+        </w:rPr>
+        <w:t>.</w:t>
+      </w:r>
+      <w:r>
+        <w:rPr>
+          <w:rFonts w:ascii="Arial" w:eastAsia="Calibri" w:hAnsi="Arial" w:cs="Arial"/>
+          <w:color w:val="000000" w:themeColor="text1"/>
+          <w:sz w:val="20"/>
+          <w:szCs w:val="20"/>
+        </w:rPr>
+        <w:t>”</w:t>
+      </w:r>
+      <w:r>
+        <w:rPr>
+          <w:rFonts w:eastAsia="Calibri" w:cs="Noto Sans NKo"/>
+          <w:color w:val="000000" w:themeColor="text1"/>
+          <w:sz w:val="20"/>
+          <w:szCs w:val="20"/>
+        </w:rPr>
+        <w:t xml:space="preserve"> Attribution statements in derivative works should not in any way suggest that we endorse you or your use of this work.</w:t>
       </w:r>
     </w:p>
     <w:p>
@@ -421,33 +531,44 @@
           <w:ilvl w:val="0"/>
           <w:numId w:val="5"/>
         </w:numPr>
-        <w:spacing w:after="0" w:line="259" w:lineRule="auto"/>
-        <w:rPr>
-          <w:rFonts w:ascii="Cambria" w:eastAsia="Calibri" w:hAnsi="Cambria" w:cs="Arial"/>
+        <w:spacing w:after="0"/>
+        <w:rPr>
+          <w:rFonts w:eastAsia="Calibri" w:cs="Noto Sans NKo"/>
+          <w:color w:val="000000" w:themeColor="text1"/>
           <w:sz w:val="20"/>
           <w:szCs w:val="20"/>
-          <w:lang w:val="en-US"/>
-        </w:rPr>
-      </w:pPr>
-      <w:r>
-        <w:rPr>
-          <w:rFonts w:ascii="Cambria" w:eastAsia="Calibri" w:hAnsi="Cambria" w:cs="Arial"/>
+        </w:rPr>
+      </w:pPr>
+      <w:proofErr w:type="spellStart"/>
+      <w:r>
+        <w:rPr>
+          <w:rFonts w:eastAsia="Calibri" w:cs="Noto Sans NKo"/>
           <w:b/>
           <w:bCs/>
+          <w:color w:val="000000" w:themeColor="text1"/>
           <w:sz w:val="20"/>
           <w:szCs w:val="20"/>
-          <w:lang w:val="en-US"/>
         </w:rPr>
         <w:t>ShareAlike</w:t>
       </w:r>
-      <w:r>
-        <w:rPr>
-          <w:rFonts w:ascii="Cambria" w:eastAsia="Calibri" w:hAnsi="Cambria" w:cs="Arial"/>
+      <w:proofErr w:type="spellEnd"/>
+      <w:r>
+        <w:rPr>
+          <w:rFonts w:ascii="Arial" w:eastAsia="Calibri" w:hAnsi="Arial" w:cs="Arial"/>
+          <w:color w:val="000000" w:themeColor="text1"/>
           <w:sz w:val="20"/>
           <w:szCs w:val="20"/>
-          <w:lang w:val="en-US"/>
-        </w:rPr>
-        <w:t>— If you remix, transform, or build upon the material, you must distribute your contributions under the same license as the original.</w:t>
+        </w:rPr>
+        <w:t>—</w:t>
+      </w:r>
+      <w:r>
+        <w:rPr>
+          <w:rFonts w:eastAsia="Calibri" w:cs="Noto Sans NKo"/>
+          <w:color w:val="000000" w:themeColor="text1"/>
+          <w:sz w:val="20"/>
+          <w:szCs w:val="20"/>
+        </w:rPr>
+        <w:t xml:space="preserve"> If you remix, transform, or build upon the material, you must distribute your contributions under the same license as the original.</w:t>
       </w:r>
     </w:p>
     <w:p>
@@ -456,141 +577,150 @@
           <w:ilvl w:val="0"/>
           <w:numId w:val="5"/>
         </w:numPr>
-        <w:spacing w:after="0" w:line="259" w:lineRule="auto"/>
-        <w:rPr>
-          <w:rFonts w:ascii="Cambria" w:eastAsia="Calibri" w:hAnsi="Cambria" w:cs="Arial"/>
+        <w:spacing w:after="0"/>
+        <w:rPr>
+          <w:rFonts w:eastAsia="Calibri" w:cs="Noto Sans NKo"/>
+          <w:color w:val="000000" w:themeColor="text1"/>
           <w:sz w:val="20"/>
           <w:szCs w:val="20"/>
-          <w:lang w:val="en-US"/>
-        </w:rPr>
-      </w:pPr>
-      <w:r>
-        <w:rPr>
-          <w:rFonts w:ascii="Cambria" w:eastAsia="Calibri" w:hAnsi="Cambria" w:cs="Arial"/>
+        </w:rPr>
+      </w:pPr>
+      <w:r>
+        <w:rPr>
+          <w:rFonts w:eastAsia="Calibri" w:cs="Noto Sans NKo"/>
           <w:b/>
           <w:bCs/>
+          <w:color w:val="000000" w:themeColor="text1"/>
           <w:sz w:val="20"/>
           <w:szCs w:val="20"/>
-          <w:lang w:val="en-US"/>
         </w:rPr>
         <w:t>No additional restrictions</w:t>
       </w:r>
       <w:r>
         <w:rPr>
-          <w:rFonts w:ascii="Cambria" w:eastAsia="Calibri" w:hAnsi="Cambria" w:cs="Arial"/>
+          <w:rFonts w:ascii="Arial" w:eastAsia="Calibri" w:hAnsi="Arial" w:cs="Arial"/>
+          <w:color w:val="000000" w:themeColor="text1"/>
           <w:sz w:val="20"/>
           <w:szCs w:val="20"/>
-          <w:lang w:val="en-US"/>
-        </w:rPr>
-        <w:t>— You may not apply legal terms or technological measures that legally restrict others from doing anything the license permits.</w:t>
+        </w:rPr>
+        <w:t>—</w:t>
+      </w:r>
+      <w:r>
+        <w:rPr>
+          <w:rFonts w:eastAsia="Calibri" w:cs="Noto Sans NKo"/>
+          <w:color w:val="000000" w:themeColor="text1"/>
+          <w:sz w:val="20"/>
+          <w:szCs w:val="20"/>
+        </w:rPr>
+        <w:t xml:space="preserve"> You may not apply legal terms or technological measures that legally restrict others from doing anything the license permits.</w:t>
       </w:r>
     </w:p>
     <w:p>
       <w:pPr>
-        <w:spacing w:after="0" w:line="259" w:lineRule="auto"/>
-        <w:rPr>
-          <w:rFonts w:ascii="Cambria" w:eastAsia="Calibri" w:hAnsi="Cambria" w:cs="Arial"/>
+        <w:spacing w:after="0"/>
+        <w:rPr>
+          <w:rFonts w:eastAsia="Calibri" w:cs="Noto Sans NKo"/>
           <w:b/>
           <w:bCs/>
+          <w:color w:val="000000" w:themeColor="text1"/>
           <w:sz w:val="20"/>
           <w:szCs w:val="20"/>
-          <w:lang w:val="en-US"/>
-        </w:rPr>
-      </w:pPr>
-      <w:r>
-        <w:rPr>
-          <w:rFonts w:ascii="Cambria" w:eastAsia="Calibri" w:hAnsi="Cambria" w:cs="Arial"/>
+        </w:rPr>
+      </w:pPr>
+      <w:r>
+        <w:rPr>
+          <w:rFonts w:eastAsia="Calibri" w:cs="Noto Sans NKo"/>
           <w:b/>
           <w:bCs/>
+          <w:color w:val="000000" w:themeColor="text1"/>
           <w:sz w:val="20"/>
           <w:szCs w:val="20"/>
-          <w:lang w:val="en-US"/>
         </w:rPr>
         <w:t>Notices:</w:t>
       </w:r>
     </w:p>
     <w:p>
       <w:pPr>
-        <w:spacing w:after="0" w:line="259" w:lineRule="auto"/>
-        <w:rPr>
-          <w:rFonts w:ascii="Cambria" w:eastAsia="Calibri" w:hAnsi="Cambria" w:cs="Arial"/>
+        <w:spacing w:after="0"/>
+        <w:rPr>
+          <w:rFonts w:eastAsia="Calibri" w:cs="Noto Sans NKo"/>
+          <w:color w:val="000000" w:themeColor="text1"/>
           <w:sz w:val="20"/>
           <w:szCs w:val="20"/>
-          <w:lang w:val="en-US"/>
-        </w:rPr>
-      </w:pPr>
-      <w:r>
-        <w:rPr>
-          <w:rFonts w:ascii="Cambria" w:eastAsia="Calibri" w:hAnsi="Cambria" w:cs="Arial"/>
+        </w:rPr>
+      </w:pPr>
+      <w:r>
+        <w:rPr>
+          <w:rFonts w:eastAsia="Calibri" w:cs="Noto Sans NKo"/>
+          <w:color w:val="000000" w:themeColor="text1"/>
           <w:sz w:val="20"/>
           <w:szCs w:val="20"/>
-          <w:lang w:val="en-US"/>
         </w:rPr>
         <w:t>You do not have to comply with the license for elements of the material in the public domain or where your use is permitted by an applicable exception or limitation.</w:t>
       </w:r>
     </w:p>
     <w:p>
       <w:pPr>
-        <w:spacing w:after="0" w:line="259" w:lineRule="auto"/>
-        <w:rPr>
-          <w:rFonts w:ascii="Cambria" w:eastAsia="Calibri" w:hAnsi="Cambria" w:cs="Arial"/>
+        <w:spacing w:after="0"/>
+        <w:rPr>
+          <w:rFonts w:eastAsia="Calibri" w:cs="Noto Sans NKo"/>
+          <w:color w:val="000000" w:themeColor="text1"/>
           <w:sz w:val="20"/>
           <w:szCs w:val="20"/>
-          <w:lang w:val="en-US"/>
         </w:rPr>
       </w:pPr>
     </w:p>
     <w:p>
       <w:pPr>
-        <w:spacing w:after="0" w:line="259" w:lineRule="auto"/>
-        <w:rPr>
-          <w:rFonts w:ascii="Cambria" w:eastAsia="Calibri" w:hAnsi="Cambria" w:cs="Arial"/>
+        <w:spacing w:after="0"/>
+        <w:rPr>
+          <w:rFonts w:eastAsia="Calibri" w:cs="Noto Sans NKo"/>
+          <w:color w:val="000000" w:themeColor="text1"/>
           <w:sz w:val="20"/>
           <w:szCs w:val="20"/>
-          <w:lang w:val="en-US"/>
-        </w:rPr>
-      </w:pPr>
-      <w:r>
-        <w:rPr>
-          <w:rFonts w:ascii="Cambria" w:eastAsia="Calibri" w:hAnsi="Cambria" w:cs="Arial"/>
+        </w:rPr>
+      </w:pPr>
+      <w:r>
+        <w:rPr>
+          <w:rFonts w:eastAsia="Calibri" w:cs="Noto Sans NKo"/>
+          <w:color w:val="000000" w:themeColor="text1"/>
           <w:sz w:val="20"/>
           <w:szCs w:val="20"/>
-          <w:lang w:val="en-US"/>
         </w:rPr>
         <w:t>No warranties are given. The license may not give you all of the permissions necessary for your intended use. For example, other rights such as publicity, privacy, or moral rights may limit how you use the material.</w:t>
       </w:r>
     </w:p>
     <w:p>
       <w:pPr>
-        <w:spacing w:after="0" w:line="259" w:lineRule="auto"/>
-        <w:rPr>
-          <w:rFonts w:ascii="Cambria" w:eastAsia="Calibri" w:hAnsi="Cambria" w:cs="Arial"/>
+        <w:spacing w:after="0"/>
+        <w:rPr>
+          <w:rFonts w:eastAsia="Calibri" w:cs="Noto Sans NKo"/>
+          <w:color w:val="000000" w:themeColor="text1"/>
           <w:sz w:val="20"/>
           <w:szCs w:val="20"/>
-          <w:lang w:val="en-US"/>
         </w:rPr>
       </w:pPr>
     </w:p>
     <w:p>
       <w:pPr>
-        <w:spacing w:after="0" w:line="259" w:lineRule="auto"/>
+        <w:spacing w:after="0"/>
         <w:rPr>
           <w:rFonts w:ascii="Cambria" w:eastAsia="Calibri" w:hAnsi="Cambria" w:cs="Arial"/>
+          <w:color w:val="000000" w:themeColor="text1"/>
           <w:sz w:val="20"/>
           <w:szCs w:val="20"/>
-          <w:lang w:val="en-US"/>
         </w:rPr>
       </w:pPr>
       <w:r>
         <w:rPr>
           <w:rFonts w:ascii="Cambria" w:eastAsia="Calibri" w:hAnsi="Cambria" w:cs="Arial"/>
           <w:noProof/>
+          <w:color w:val="000000" w:themeColor="text1"/>
           <w:sz w:val="20"/>
           <w:szCs w:val="20"/>
-          <w:lang w:val="en-US"/>
         </w:rPr>
         <w:drawing>
-          <wp:inline distT="0" distB="0" distL="0" distR="0" wp14:anchorId="64866045" wp14:editId="12282584">
+          <wp:inline distT="0" distB="0" distL="0" distR="0" wp14:anchorId="21BED3DE" wp14:editId="30D2AD5D">
             <wp:extent cx="658368" cy="228600"/>
             <wp:effectExtent l="0" t="0" r="8890" b="0"/>
             <wp:docPr id="1" name="Picture 1" descr="A picture containing text, clipart&#10;&#10;Description automatically generated"/>
@@ -605,7 +735,7 @@
                     <pic:cNvPicPr/>
                   </pic:nvPicPr>
                   <pic:blipFill>
-                    <a:blip r:embed="rId10"/>
+                    <a:blip r:embed="rId9"/>
                     <a:stretch>
                       <a:fillRect/>
                     </a:stretch>
@@ -626,29 +756,27 @@
         </w:drawing>
       </w:r>
     </w:p>
-    <w:bookmarkEnd w:id="1"/>
+    <w:bookmarkEnd w:id="0"/>
     <w:p>
       <w:pPr>
-        <w:spacing w:after="0" w:line="259" w:lineRule="auto"/>
+        <w:spacing w:after="0"/>
         <w:rPr>
           <w:rFonts w:ascii="Cambria" w:eastAsia="Calibri" w:hAnsi="Cambria" w:cs="Arial"/>
+          <w:color w:val="000000" w:themeColor="text1"/>
           <w:sz w:val="20"/>
           <w:szCs w:val="20"/>
-          <w:lang w:val="en-US"/>
         </w:rPr>
       </w:pPr>
     </w:p>
     <w:p>
       <w:pPr>
         <w:rPr>
-          <w:sz w:val="22"/>
-          <w:szCs w:val="22"/>
-        </w:rPr>
-      </w:pPr>
-      <w:r>
-        <w:rPr>
-          <w:sz w:val="22"/>
-          <w:szCs w:val="22"/>
+          <w:color w:val="000000" w:themeColor="text1"/>
+        </w:rPr>
+      </w:pPr>
+      <w:r>
+        <w:rPr>
+          <w:color w:val="000000" w:themeColor="text1"/>
         </w:rPr>
         <w:br w:type="page"/>
       </w:r>
@@ -656,47 +784,51 @@
     <w:p>
       <w:pPr>
         <w:pStyle w:val="BodyText"/>
-        <w:rPr>
-          <w:sz w:val="22"/>
-          <w:szCs w:val="22"/>
-        </w:rPr>
-      </w:pPr>
-      <w:r>
-        <w:rPr>
-          <w:sz w:val="22"/>
-          <w:szCs w:val="22"/>
-        </w:rPr>
+      </w:pPr>
+      <w:r>
         <w:lastRenderedPageBreak/>
-        <w:t>{{ TOC }}</w:t>
+        <w:t>{</w:t>
+      </w:r>
+      <w:proofErr w:type="gramStart"/>
+      <w:r>
+        <w:t>{ TOC</w:t>
+      </w:r>
+      <w:proofErr w:type="gramEnd"/>
+      <w:r>
+        <w:t xml:space="preserve"> }}</w:t>
       </w:r>
     </w:p>
     <w:p>
       <w:pPr>
-        <w:rPr>
-          <w:sz w:val="22"/>
-          <w:szCs w:val="22"/>
-        </w:rPr>
-      </w:pPr>
-      <w:r>
-        <w:rPr>
-          <w:sz w:val="22"/>
-          <w:szCs w:val="22"/>
-        </w:rPr>
-        <w:br w:type="page"/>
-      </w:r>
+        <w:pStyle w:val="BodyText"/>
+        <w:rPr>
+          <w:color w:val="000000" w:themeColor="text1"/>
+        </w:rPr>
+      </w:pPr>
     </w:p>
     <w:p>
       <w:pPr>
+        <w:rPr>
+          <w:color w:val="000000" w:themeColor="text1"/>
+        </w:rPr>
+      </w:pPr>
+      <w:r>
+        <w:rPr>
+          <w:color w:val="000000" w:themeColor="text1"/>
+        </w:rPr>
+        <w:br w:type="page"/>
+      </w:r>
+    </w:p>
+    <w:p>
+      <w:pPr>
         <w:pStyle w:val="BodyText"/>
         <w:rPr>
-          <w:sz w:val="22"/>
-          <w:szCs w:val="22"/>
-        </w:rPr>
-      </w:pPr>
-      <w:r>
-        <w:rPr>
-          <w:sz w:val="22"/>
-          <w:szCs w:val="22"/>
+          <w:color w:val="000000" w:themeColor="text1"/>
+        </w:rPr>
+      </w:pPr>
+      <w:r>
+        <w:rPr>
+          <w:color w:val="000000" w:themeColor="text1"/>
         </w:rPr>
         <w:lastRenderedPageBreak/>
         <w:t>Page left intentionally blank</w:t>
@@ -705,14 +837,12 @@
     <w:p>
       <w:pPr>
         <w:rPr>
-          <w:sz w:val="22"/>
-          <w:szCs w:val="22"/>
-        </w:rPr>
-      </w:pPr>
-      <w:r>
-        <w:rPr>
-          <w:sz w:val="22"/>
-          <w:szCs w:val="22"/>
+          <w:color w:val="000000" w:themeColor="text1"/>
+        </w:rPr>
+      </w:pPr>
+      <w:r>
+        <w:rPr>
+          <w:color w:val="000000" w:themeColor="text1"/>
         </w:rPr>
         <w:br w:type="page"/>
       </w:r>
@@ -721,45 +851,40 @@
       <w:pPr>
         <w:pStyle w:val="BodyText"/>
         <w:rPr>
-          <w:sz w:val="22"/>
-          <w:szCs w:val="22"/>
+          <w:color w:val="000000" w:themeColor="text1"/>
         </w:rPr>
         <w:sectPr>
-          <w:headerReference w:type="even" r:id="rId11"/>
-          <w:headerReference w:type="default" r:id="rId12"/>
-          <w:footerReference w:type="even" r:id="rId13"/>
-          <w:footerReference w:type="default" r:id="rId14"/>
-          <w:headerReference w:type="first" r:id="rId15"/>
-          <w:footerReference w:type="first" r:id="rId16"/>
+          <w:headerReference w:type="even" r:id="rId10"/>
+          <w:headerReference w:type="default" r:id="rId11"/>
+          <w:footerReference w:type="even" r:id="rId12"/>
+          <w:footerReference w:type="default" r:id="rId13"/>
+          <w:headerReference w:type="first" r:id="rId14"/>
+          <w:footerReference w:type="first" r:id="rId15"/>
           <w:pgSz w:w="12240" w:h="15840"/>
           <w:pgMar w:top="1440" w:right="1440" w:bottom="1440" w:left="1440" w:header="720" w:footer="720" w:gutter="0"/>
           <w:cols w:space="720"/>
         </w:sectPr>
       </w:pPr>
     </w:p>
+    <w:bookmarkEnd w:id="1"/>
     <w:p>
-      <w:pPr>
-        <w:pStyle w:val="BodyText"/>
-        <w:ind w:firstLine="0"/>
-        <w:rPr>
-          <w:sz w:val="22"/>
-          <w:szCs w:val="22"/>
-        </w:rPr>
-      </w:pPr>
-      <w:bookmarkStart w:id="2" w:name="_GoBack"/>
-      <w:bookmarkEnd w:id="0"/>
-      <w:bookmarkEnd w:id="2"/>
+      <w:r>
+        <w:rPr>
+          <w:color w:val="000000" w:themeColor="text1"/>
+        </w:rPr>
+        <w:lastRenderedPageBreak/>
+        <w:t xml:space="preserve"> </w:t>
+      </w:r>
     </w:p>
     <w:sectPr>
-      <w:headerReference w:type="default" r:id="rId17"/>
-      <w:footerReference w:type="default" r:id="rId18"/>
-      <w:headerReference w:type="first" r:id="rId19"/>
-      <w:footerReference w:type="first" r:id="rId20"/>
-      <w:type w:val="continuous"/>
+      <w:headerReference w:type="default" r:id="rId16"/>
+      <w:footerReference w:type="default" r:id="rId17"/>
+      <w:headerReference w:type="first" r:id="rId18"/>
+      <w:footerReference w:type="first" r:id="rId19"/>
       <w:pgSz w:w="12240" w:h="15840"/>
       <w:pgMar w:top="1440" w:right="1440" w:bottom="1440" w:left="1440" w:header="720" w:footer="720" w:gutter="0"/>
       <w:cols w:space="720"/>
-      <w:docGrid w:linePitch="326"/>
+      <w:docGrid w:linePitch="360"/>
     </w:sectPr>
   </w:body>
 </w:document>
@@ -770,7 +895,7 @@
   <w:endnote w:type="separator" w:id="-1">
     <w:p>
       <w:pPr>
-        <w:spacing w:after="0"/>
+        <w:spacing w:after="0" w:line="240" w:lineRule="auto"/>
       </w:pPr>
       <w:r>
         <w:separator/>
@@ -780,7 +905,7 @@
   <w:endnote w:type="continuationSeparator" w:id="0">
     <w:p>
       <w:pPr>
-        <w:spacing w:after="0"/>
+        <w:spacing w:after="0" w:line="240" w:lineRule="auto"/>
       </w:pPr>
       <w:r>
         <w:continuationSeparator/>
@@ -806,6 +931,77 @@
     <w:pPr>
       <w:pStyle w:val="Footer"/>
     </w:pPr>
+    <w:r>
+      <w:rPr>
+        <w:noProof/>
+        <w:color w:val="000000" w:themeColor="text1"/>
+        <w14:ligatures w14:val="standardContextual"/>
+      </w:rPr>
+      <w:drawing>
+        <wp:anchor distT="0" distB="0" distL="114300" distR="114300" simplePos="0" relativeHeight="251660288" behindDoc="1" locked="0" layoutInCell="1" allowOverlap="1" wp14:anchorId="2D453E0B" wp14:editId="5469F4C0">
+          <wp:simplePos x="0" y="0"/>
+          <wp:positionH relativeFrom="column">
+            <wp:posOffset>0</wp:posOffset>
+          </wp:positionH>
+          <wp:positionV relativeFrom="paragraph">
+            <wp:posOffset>-635</wp:posOffset>
+          </wp:positionV>
+          <wp:extent cx="1100667" cy="266223"/>
+          <wp:effectExtent l="0" t="0" r="4445" b="635"/>
+          <wp:wrapNone/>
+          <wp:docPr id="1443536831" name="Picture 1"/>
+          <wp:cNvGraphicFramePr>
+            <a:graphicFrameLocks xmlns:a="http://schemas.openxmlformats.org/drawingml/2006/main" noChangeAspect="1"/>
+          </wp:cNvGraphicFramePr>
+          <a:graphic xmlns:a="http://schemas.openxmlformats.org/drawingml/2006/main">
+            <a:graphicData uri="http://schemas.openxmlformats.org/drawingml/2006/picture">
+              <pic:pic xmlns:pic="http://schemas.openxmlformats.org/drawingml/2006/picture">
+                <pic:nvPicPr>
+                  <pic:cNvPr id="386319275" name="Picture 386319275"/>
+                  <pic:cNvPicPr/>
+                </pic:nvPicPr>
+                <pic:blipFill>
+                  <a:blip r:embed="rId1">
+                    <a:extLst>
+                      <a:ext uri="{BEBA8EAE-BF5A-486C-A8C5-ECC9F3942E4B}">
+                        <a14:imgProps xmlns:a14="http://schemas.microsoft.com/office/drawing/2010/main">
+                          <a14:imgLayer r:embed="rId2">
+                            <a14:imgEffect>
+                              <a14:saturation sat="0"/>
+                            </a14:imgEffect>
+                          </a14:imgLayer>
+                        </a14:imgProps>
+                      </a:ext>
+                      <a:ext uri="{28A0092B-C50C-407E-A947-70E740481C1C}">
+                        <a14:useLocalDpi xmlns:a14="http://schemas.microsoft.com/office/drawing/2010/main" val="0"/>
+                      </a:ext>
+                    </a:extLst>
+                  </a:blip>
+                  <a:stretch>
+                    <a:fillRect/>
+                  </a:stretch>
+                </pic:blipFill>
+                <pic:spPr>
+                  <a:xfrm>
+                    <a:off x="0" y="0"/>
+                    <a:ext cx="1100667" cy="266223"/>
+                  </a:xfrm>
+                  <a:prstGeom prst="rect">
+                    <a:avLst/>
+                  </a:prstGeom>
+                </pic:spPr>
+              </pic:pic>
+            </a:graphicData>
+          </a:graphic>
+          <wp14:sizeRelH relativeFrom="page">
+            <wp14:pctWidth>0</wp14:pctWidth>
+          </wp14:sizeRelH>
+          <wp14:sizeRelV relativeFrom="page">
+            <wp14:pctHeight>0</wp14:pctHeight>
+          </wp14:sizeRelV>
+        </wp:anchor>
+      </w:drawing>
+    </w:r>
   </w:p>
 </w:ftr>
 </file>
@@ -826,85 +1022,160 @@
     <w:pPr>
       <w:pStyle w:val="Footer"/>
       <w:jc w:val="center"/>
+      <w:rPr>
+        <w:color w:val="000000" w:themeColor="text1"/>
+      </w:rPr>
     </w:pPr>
     <w:r>
+      <w:rPr>
+        <w:noProof/>
+        <w:color w:val="000000" w:themeColor="text1"/>
+        <w14:ligatures w14:val="standardContextual"/>
+      </w:rPr>
+      <w:drawing>
+        <wp:anchor distT="0" distB="0" distL="114300" distR="114300" simplePos="0" relativeHeight="251658240" behindDoc="1" locked="0" layoutInCell="1" allowOverlap="1" wp14:anchorId="75754DC6" wp14:editId="6500144B">
+          <wp:simplePos x="0" y="0"/>
+          <wp:positionH relativeFrom="column">
+            <wp:posOffset>-29633</wp:posOffset>
+          </wp:positionH>
+          <wp:positionV relativeFrom="paragraph">
+            <wp:posOffset>28575</wp:posOffset>
+          </wp:positionV>
+          <wp:extent cx="1100667" cy="266223"/>
+          <wp:effectExtent l="0" t="0" r="4445" b="635"/>
+          <wp:wrapNone/>
+          <wp:docPr id="386319275" name="Picture 1"/>
+          <wp:cNvGraphicFramePr>
+            <a:graphicFrameLocks xmlns:a="http://schemas.openxmlformats.org/drawingml/2006/main" noChangeAspect="1"/>
+          </wp:cNvGraphicFramePr>
+          <a:graphic xmlns:a="http://schemas.openxmlformats.org/drawingml/2006/main">
+            <a:graphicData uri="http://schemas.openxmlformats.org/drawingml/2006/picture">
+              <pic:pic xmlns:pic="http://schemas.openxmlformats.org/drawingml/2006/picture">
+                <pic:nvPicPr>
+                  <pic:cNvPr id="386319275" name="Picture 386319275"/>
+                  <pic:cNvPicPr/>
+                </pic:nvPicPr>
+                <pic:blipFill>
+                  <a:blip r:embed="rId1">
+                    <a:extLst>
+                      <a:ext uri="{BEBA8EAE-BF5A-486C-A8C5-ECC9F3942E4B}">
+                        <a14:imgProps xmlns:a14="http://schemas.microsoft.com/office/drawing/2010/main">
+                          <a14:imgLayer r:embed="rId2">
+                            <a14:imgEffect>
+                              <a14:saturation sat="0"/>
+                            </a14:imgEffect>
+                          </a14:imgLayer>
+                        </a14:imgProps>
+                      </a:ext>
+                      <a:ext uri="{28A0092B-C50C-407E-A947-70E740481C1C}">
+                        <a14:useLocalDpi xmlns:a14="http://schemas.microsoft.com/office/drawing/2010/main" val="0"/>
+                      </a:ext>
+                    </a:extLst>
+                  </a:blip>
+                  <a:stretch>
+                    <a:fillRect/>
+                  </a:stretch>
+                </pic:blipFill>
+                <pic:spPr>
+                  <a:xfrm>
+                    <a:off x="0" y="0"/>
+                    <a:ext cx="1100667" cy="266223"/>
+                  </a:xfrm>
+                  <a:prstGeom prst="rect">
+                    <a:avLst/>
+                  </a:prstGeom>
+                </pic:spPr>
+              </pic:pic>
+            </a:graphicData>
+          </a:graphic>
+          <wp14:sizeRelH relativeFrom="page">
+            <wp14:pctWidth>0</wp14:pctWidth>
+          </wp14:sizeRelH>
+          <wp14:sizeRelV relativeFrom="page">
+            <wp14:pctHeight>0</wp14:pctHeight>
+          </wp14:sizeRelV>
+        </wp:anchor>
+      </w:drawing>
+    </w:r>
+    <w:r>
+      <w:rPr>
+        <w:color w:val="000000" w:themeColor="text1"/>
+      </w:rPr>
       <w:t xml:space="preserve">Page </w:t>
     </w:r>
     <w:r>
       <w:rPr>
-        <w:b/>
-        <w:bCs/>
+        <w:color w:val="000000" w:themeColor="text1"/>
       </w:rPr>
       <w:fldChar w:fldCharType="begin"/>
     </w:r>
     <w:r>
       <w:rPr>
-        <w:b/>
-        <w:bCs/>
+        <w:color w:val="000000" w:themeColor="text1"/>
       </w:rPr>
       <w:instrText xml:space="preserve"> PAGE  \* Arabic  \* MERGEFORMAT </w:instrText>
     </w:r>
     <w:r>
       <w:rPr>
-        <w:b/>
-        <w:bCs/>
+        <w:color w:val="000000" w:themeColor="text1"/>
       </w:rPr>
       <w:fldChar w:fldCharType="separate"/>
     </w:r>
     <w:r>
       <w:rPr>
-        <w:b/>
-        <w:bCs/>
         <w:noProof/>
+        <w:color w:val="000000" w:themeColor="text1"/>
       </w:rPr>
       <w:t>5</w:t>
     </w:r>
     <w:r>
       <w:rPr>
-        <w:b/>
-        <w:bCs/>
+        <w:color w:val="000000" w:themeColor="text1"/>
       </w:rPr>
       <w:fldChar w:fldCharType="end"/>
     </w:r>
     <w:r>
+      <w:rPr>
+        <w:color w:val="000000" w:themeColor="text1"/>
+      </w:rPr>
       <w:t xml:space="preserve"> of </w:t>
     </w:r>
     <w:r>
       <w:rPr>
-        <w:b/>
-        <w:bCs/>
+        <w:color w:val="000000" w:themeColor="text1"/>
       </w:rPr>
       <w:fldChar w:fldCharType="begin"/>
     </w:r>
     <w:r>
       <w:rPr>
-        <w:b/>
-        <w:bCs/>
+        <w:color w:val="000000" w:themeColor="text1"/>
       </w:rPr>
       <w:instrText xml:space="preserve"> NUMPAGES  \* Arabic  \* MERGEFORMAT </w:instrText>
     </w:r>
     <w:r>
       <w:rPr>
-        <w:b/>
-        <w:bCs/>
+        <w:color w:val="000000" w:themeColor="text1"/>
       </w:rPr>
       <w:fldChar w:fldCharType="separate"/>
     </w:r>
     <w:r>
       <w:rPr>
-        <w:b/>
-        <w:bCs/>
         <w:noProof/>
+        <w:color w:val="000000" w:themeColor="text1"/>
       </w:rPr>
       <w:t>5</w:t>
     </w:r>
     <w:r>
       <w:rPr>
-        <w:b/>
-        <w:bCs/>
+        <w:color w:val="000000" w:themeColor="text1"/>
       </w:rPr>
       <w:fldChar w:fldCharType="end"/>
     </w:r>
+  </w:p>
+  <w:p>
+    <w:pPr>
+      <w:pStyle w:val="Footer"/>
+    </w:pPr>
   </w:p>
 </w:ftr>
 </file>
@@ -1002,6 +1273,9 @@
 <w:footnotes xmlns:wpc="http://schemas.microsoft.com/office/word/2010/wordprocessingCanvas" xmlns:mc="http://schemas.openxmlformats.org/markup-compatibility/2006" xmlns:o="urn:schemas-microsoft-com:office:office" xmlns:r="http://schemas.openxmlformats.org/officeDocument/2006/relationships" xmlns:m="http://schemas.openxmlformats.org/officeDocument/2006/math" xmlns:v="urn:schemas-microsoft-com:vml" xmlns:wp14="http://schemas.microsoft.com/office/word/2010/wordprocessingDrawing" xmlns:wp="http://schemas.openxmlformats.org/drawingml/2006/wordprocessingDrawing" xmlns:w10="urn:schemas-microsoft-com:office:word" xmlns:w="http://schemas.openxmlformats.org/wordprocessingml/2006/main" xmlns:w14="http://schemas.microsoft.com/office/word/2010/wordml" xmlns:w15="http://schemas.microsoft.com/office/word/2012/wordml" xmlns:wpg="http://schemas.microsoft.com/office/word/2010/wordprocessingGroup" xmlns:wpi="http://schemas.microsoft.com/office/word/2010/wordprocessingInk" xmlns:wne="http://schemas.microsoft.com/office/word/2006/wordml" xmlns:wps="http://schemas.microsoft.com/office/word/2010/wordprocessingShape" mc:Ignorable="w14 w15 wp14">
   <w:footnote w:type="separator" w:id="-1">
     <w:p>
+      <w:pPr>
+        <w:spacing w:after="0" w:line="240" w:lineRule="auto"/>
+      </w:pPr>
       <w:r>
         <w:separator/>
       </w:r>
@@ -1009,6 +1283,9 @@
   </w:footnote>
   <w:footnote w:type="continuationSeparator" w:id="0">
     <w:p>
+      <w:pPr>
+        <w:spacing w:after="0" w:line="240" w:lineRule="auto"/>
+      </w:pPr>
       <w:r>
         <w:continuationSeparator/>
       </w:r>
@@ -1053,7 +1330,43 @@
     <w:pPr>
       <w:pStyle w:val="Header"/>
       <w:jc w:val="center"/>
-    </w:pPr>
+      <w:rPr>
+        <w:rFonts w:cs="Noto Sans NKo"/>
+      </w:rPr>
+    </w:pPr>
+    <w:r>
+      <w:rPr>
+        <w:rFonts w:cs="Noto Sans NKo"/>
+      </w:rPr>
+      <w:fldChar w:fldCharType="begin"/>
+    </w:r>
+    <w:r>
+      <w:rPr>
+        <w:rFonts w:cs="Noto Sans NKo"/>
+      </w:rPr>
+      <w:instrText xml:space="preserve"> STYLEREF  Title  \* MERGEFORMAT </w:instrText>
+    </w:r>
+    <w:r>
+      <w:rPr>
+        <w:rFonts w:cs="Noto Sans NKo"/>
+      </w:rPr>
+      <w:fldChar w:fldCharType="separate"/>
+    </w:r>
+    <w:r>
+      <w:rPr>
+        <w:rFonts w:cs="Noto Sans NKo"/>
+        <w:noProof/>
+      </w:rPr>
+      <w:t>{{ title1 }}</w:t>
+    </w:r>
+    <w:r>
+      <w:rPr>
+        <w:rFonts w:cs="Noto Sans NKo"/>
+      </w:rPr>
+      <w:fldChar w:fldCharType="end"/>
+    </w:r>
+    <w:bookmarkStart w:id="2" w:name="_GoBack"/>
+    <w:bookmarkEnd w:id="2"/>
   </w:p>
 </w:hdr>
 </file>
@@ -1124,7 +1437,7 @@
   <w:abstractNum w:abstractNumId="3" w15:restartNumberingAfterBreak="0">
     <w:nsid w:val="FFFFFF7F"/>
     <w:multiLevelType w:val="singleLevel"/>
-    <w:tmpl w:val="F050CF20"/>
+    <w:tmpl w:val="3DB23262"/>
     <w:lvl w:ilvl="0">
       <w:start w:val="1"/>
       <w:numFmt w:val="decimal"/>
@@ -1181,7 +1494,7 @@
   <w:abstractNum w:abstractNumId="6" w15:restartNumberingAfterBreak="0">
     <w:nsid w:val="FFFFFF82"/>
     <w:multiLevelType w:val="singleLevel"/>
-    <w:tmpl w:val="F1CE2FA4"/>
+    <w:tmpl w:val="C3925E02"/>
     <w:lvl w:ilvl="0">
       <w:start w:val="1"/>
       <w:numFmt w:val="bullet"/>
@@ -1496,6 +1809,103 @@
     </w:lvl>
   </w:abstractNum>
   <w:abstractNum w:abstractNumId="13" w15:restartNumberingAfterBreak="0">
+    <w:nsid w:val="014B34F3"/>
+    <w:multiLevelType w:val="singleLevel"/>
+    <w:tmpl w:val="29761A62"/>
+    <w:lvl w:ilvl="0">
+      <w:start w:val="1"/>
+      <w:numFmt w:val="bullet"/>
+      <w:lvlText w:val=""/>
+      <w:lvlJc w:val="left"/>
+      <w:pPr>
+        <w:tabs>
+          <w:tab w:val="num" w:pos="360"/>
+        </w:tabs>
+        <w:ind w:left="360" w:hanging="360"/>
+      </w:pPr>
+      <w:rPr>
+        <w:rFonts w:ascii="Symbol" w:hAnsi="Symbol" w:hint="default"/>
+      </w:rPr>
+    </w:lvl>
+  </w:abstractNum>
+  <w:abstractNum w:abstractNumId="14" w15:restartNumberingAfterBreak="0">
+    <w:nsid w:val="02772926"/>
+    <w:multiLevelType w:val="singleLevel"/>
+    <w:tmpl w:val="29761A62"/>
+    <w:lvl w:ilvl="0">
+      <w:start w:val="1"/>
+      <w:numFmt w:val="bullet"/>
+      <w:pStyle w:val="ListBullet"/>
+      <w:lvlText w:val=""/>
+      <w:lvlJc w:val="left"/>
+      <w:pPr>
+        <w:tabs>
+          <w:tab w:val="num" w:pos="360"/>
+        </w:tabs>
+        <w:ind w:left="360" w:hanging="360"/>
+      </w:pPr>
+      <w:rPr>
+        <w:rFonts w:ascii="Symbol" w:hAnsi="Symbol" w:hint="default"/>
+      </w:rPr>
+    </w:lvl>
+  </w:abstractNum>
+  <w:abstractNum w:abstractNumId="15" w15:restartNumberingAfterBreak="0">
+    <w:nsid w:val="02C19F0D"/>
+    <w:multiLevelType w:val="singleLevel"/>
+    <w:tmpl w:val="3D1EFFD4"/>
+    <w:lvl w:ilvl="0">
+      <w:start w:val="1"/>
+      <w:numFmt w:val="bullet"/>
+      <w:pStyle w:val="ListBullet2"/>
+      <w:lvlText w:val=""/>
+      <w:lvlJc w:val="left"/>
+      <w:pPr>
+        <w:tabs>
+          <w:tab w:val="num" w:pos="720"/>
+        </w:tabs>
+        <w:ind w:left="720" w:hanging="360"/>
+      </w:pPr>
+      <w:rPr>
+        <w:rFonts w:ascii="Symbol" w:hAnsi="Symbol" w:hint="default"/>
+      </w:rPr>
+    </w:lvl>
+  </w:abstractNum>
+  <w:abstractNum w:abstractNumId="16" w15:restartNumberingAfterBreak="0">
+    <w:nsid w:val="051736DD"/>
+    <w:multiLevelType w:val="singleLevel"/>
+    <w:tmpl w:val="D0A62B40"/>
+    <w:lvl w:ilvl="0">
+      <w:start w:val="1"/>
+      <w:numFmt w:val="decimal"/>
+      <w:pStyle w:val="ListNumber"/>
+      <w:lvlText w:val="%1."/>
+      <w:lvlJc w:val="left"/>
+      <w:pPr>
+        <w:tabs>
+          <w:tab w:val="num" w:pos="360"/>
+        </w:tabs>
+        <w:ind w:left="360" w:hanging="360"/>
+      </w:pPr>
+    </w:lvl>
+  </w:abstractNum>
+  <w:abstractNum w:abstractNumId="17" w15:restartNumberingAfterBreak="0">
+    <w:nsid w:val="05E1064F"/>
+    <w:multiLevelType w:val="singleLevel"/>
+    <w:tmpl w:val="D0A62B40"/>
+    <w:lvl w:ilvl="0">
+      <w:start w:val="1"/>
+      <w:numFmt w:val="decimal"/>
+      <w:lvlText w:val="%1."/>
+      <w:lvlJc w:val="left"/>
+      <w:pPr>
+        <w:tabs>
+          <w:tab w:val="num" w:pos="360"/>
+        </w:tabs>
+        <w:ind w:left="360" w:hanging="360"/>
+      </w:pPr>
+    </w:lvl>
+  </w:abstractNum>
+  <w:abstractNum w:abstractNumId="18" w15:restartNumberingAfterBreak="0">
     <w:nsid w:val="1E4454FD"/>
     <w:multiLevelType w:val="multilevel"/>
     <w:tmpl w:val="4BC67DC0"/>
@@ -1644,7 +2054,7 @@
       </w:rPr>
     </w:lvl>
   </w:abstractNum>
-  <w:abstractNum w:abstractNumId="14" w15:restartNumberingAfterBreak="0">
+  <w:abstractNum w:abstractNumId="19" w15:restartNumberingAfterBreak="0">
     <w:nsid w:val="5A006D75"/>
     <w:multiLevelType w:val="multilevel"/>
     <w:tmpl w:val="E062AA00"/>
@@ -1790,6 +2200,208 @@
       <w:rPr>
         <w:rFonts w:ascii="Wingdings" w:hAnsi="Wingdings" w:hint="default"/>
         <w:sz w:val="20"/>
+      </w:rPr>
+    </w:lvl>
+  </w:abstractNum>
+  <w:abstractNum w:abstractNumId="20" w15:restartNumberingAfterBreak="0">
+    <w:nsid w:val="70304275"/>
+    <w:multiLevelType w:val="hybridMultilevel"/>
+    <w:tmpl w:val="F5045B92"/>
+    <w:lvl w:ilvl="0" w:tplc="0AD6EFA4">
+      <w:start w:val="1"/>
+      <w:numFmt w:val="decimal"/>
+      <w:lvlText w:val="%1."/>
+      <w:lvlJc w:val="left"/>
+      <w:pPr>
+        <w:ind w:left="720" w:hanging="360"/>
+      </w:pPr>
+      <w:rPr>
+        <w:rFonts w:ascii="Calibri" w:hAnsi="Calibri" w:cs="Calibri" w:hint="default"/>
+      </w:rPr>
+    </w:lvl>
+    <w:lvl w:ilvl="1" w:tplc="04090019" w:tentative="1">
+      <w:start w:val="1"/>
+      <w:numFmt w:val="lowerLetter"/>
+      <w:lvlText w:val="%2."/>
+      <w:lvlJc w:val="left"/>
+      <w:pPr>
+        <w:ind w:left="1440" w:hanging="360"/>
+      </w:pPr>
+    </w:lvl>
+    <w:lvl w:ilvl="2" w:tplc="0409001B" w:tentative="1">
+      <w:start w:val="1"/>
+      <w:numFmt w:val="lowerRoman"/>
+      <w:lvlText w:val="%3."/>
+      <w:lvlJc w:val="right"/>
+      <w:pPr>
+        <w:ind w:left="2160" w:hanging="180"/>
+      </w:pPr>
+    </w:lvl>
+    <w:lvl w:ilvl="3" w:tplc="0409000F" w:tentative="1">
+      <w:start w:val="1"/>
+      <w:numFmt w:val="decimal"/>
+      <w:lvlText w:val="%4."/>
+      <w:lvlJc w:val="left"/>
+      <w:pPr>
+        <w:ind w:left="2880" w:hanging="360"/>
+      </w:pPr>
+    </w:lvl>
+    <w:lvl w:ilvl="4" w:tplc="04090019" w:tentative="1">
+      <w:start w:val="1"/>
+      <w:numFmt w:val="lowerLetter"/>
+      <w:lvlText w:val="%5."/>
+      <w:lvlJc w:val="left"/>
+      <w:pPr>
+        <w:ind w:left="3600" w:hanging="360"/>
+      </w:pPr>
+    </w:lvl>
+    <w:lvl w:ilvl="5" w:tplc="0409001B" w:tentative="1">
+      <w:start w:val="1"/>
+      <w:numFmt w:val="lowerRoman"/>
+      <w:lvlText w:val="%6."/>
+      <w:lvlJc w:val="right"/>
+      <w:pPr>
+        <w:ind w:left="4320" w:hanging="180"/>
+      </w:pPr>
+    </w:lvl>
+    <w:lvl w:ilvl="6" w:tplc="0409000F" w:tentative="1">
+      <w:start w:val="1"/>
+      <w:numFmt w:val="decimal"/>
+      <w:lvlText w:val="%7."/>
+      <w:lvlJc w:val="left"/>
+      <w:pPr>
+        <w:ind w:left="5040" w:hanging="360"/>
+      </w:pPr>
+    </w:lvl>
+    <w:lvl w:ilvl="7" w:tplc="04090019" w:tentative="1">
+      <w:start w:val="1"/>
+      <w:numFmt w:val="lowerLetter"/>
+      <w:lvlText w:val="%8."/>
+      <w:lvlJc w:val="left"/>
+      <w:pPr>
+        <w:ind w:left="5760" w:hanging="360"/>
+      </w:pPr>
+    </w:lvl>
+    <w:lvl w:ilvl="8" w:tplc="0409001B" w:tentative="1">
+      <w:start w:val="1"/>
+      <w:numFmt w:val="lowerRoman"/>
+      <w:lvlText w:val="%9."/>
+      <w:lvlJc w:val="right"/>
+      <w:pPr>
+        <w:ind w:left="6480" w:hanging="180"/>
+      </w:pPr>
+    </w:lvl>
+  </w:abstractNum>
+  <w:abstractNum w:abstractNumId="21" w15:restartNumberingAfterBreak="0">
+    <w:nsid w:val="7B292CBA"/>
+    <w:multiLevelType w:val="hybridMultilevel"/>
+    <w:tmpl w:val="206E819A"/>
+    <w:lvl w:ilvl="0" w:tplc="04090001">
+      <w:start w:val="1"/>
+      <w:numFmt w:val="bullet"/>
+      <w:lvlText w:val=""/>
+      <w:lvlJc w:val="left"/>
+      <w:pPr>
+        <w:ind w:left="1440" w:hanging="360"/>
+      </w:pPr>
+      <w:rPr>
+        <w:rFonts w:ascii="Symbol" w:hAnsi="Symbol" w:hint="default"/>
+      </w:rPr>
+    </w:lvl>
+    <w:lvl w:ilvl="1" w:tplc="04090003" w:tentative="1">
+      <w:start w:val="1"/>
+      <w:numFmt w:val="bullet"/>
+      <w:lvlText w:val="o"/>
+      <w:lvlJc w:val="left"/>
+      <w:pPr>
+        <w:ind w:left="2160" w:hanging="360"/>
+      </w:pPr>
+      <w:rPr>
+        <w:rFonts w:ascii="Courier New" w:hAnsi="Courier New" w:cs="Courier New" w:hint="default"/>
+      </w:rPr>
+    </w:lvl>
+    <w:lvl w:ilvl="2" w:tplc="04090005" w:tentative="1">
+      <w:start w:val="1"/>
+      <w:numFmt w:val="bullet"/>
+      <w:lvlText w:val=""/>
+      <w:lvlJc w:val="left"/>
+      <w:pPr>
+        <w:ind w:left="2880" w:hanging="360"/>
+      </w:pPr>
+      <w:rPr>
+        <w:rFonts w:ascii="Wingdings" w:hAnsi="Wingdings" w:hint="default"/>
+      </w:rPr>
+    </w:lvl>
+    <w:lvl w:ilvl="3" w:tplc="04090001" w:tentative="1">
+      <w:start w:val="1"/>
+      <w:numFmt w:val="bullet"/>
+      <w:lvlText w:val=""/>
+      <w:lvlJc w:val="left"/>
+      <w:pPr>
+        <w:ind w:left="3600" w:hanging="360"/>
+      </w:pPr>
+      <w:rPr>
+        <w:rFonts w:ascii="Symbol" w:hAnsi="Symbol" w:hint="default"/>
+      </w:rPr>
+    </w:lvl>
+    <w:lvl w:ilvl="4" w:tplc="04090003" w:tentative="1">
+      <w:start w:val="1"/>
+      <w:numFmt w:val="bullet"/>
+      <w:lvlText w:val="o"/>
+      <w:lvlJc w:val="left"/>
+      <w:pPr>
+        <w:ind w:left="4320" w:hanging="360"/>
+      </w:pPr>
+      <w:rPr>
+        <w:rFonts w:ascii="Courier New" w:hAnsi="Courier New" w:cs="Courier New" w:hint="default"/>
+      </w:rPr>
+    </w:lvl>
+    <w:lvl w:ilvl="5" w:tplc="04090005" w:tentative="1">
+      <w:start w:val="1"/>
+      <w:numFmt w:val="bullet"/>
+      <w:lvlText w:val=""/>
+      <w:lvlJc w:val="left"/>
+      <w:pPr>
+        <w:ind w:left="5040" w:hanging="360"/>
+      </w:pPr>
+      <w:rPr>
+        <w:rFonts w:ascii="Wingdings" w:hAnsi="Wingdings" w:hint="default"/>
+      </w:rPr>
+    </w:lvl>
+    <w:lvl w:ilvl="6" w:tplc="04090001" w:tentative="1">
+      <w:start w:val="1"/>
+      <w:numFmt w:val="bullet"/>
+      <w:lvlText w:val=""/>
+      <w:lvlJc w:val="left"/>
+      <w:pPr>
+        <w:ind w:left="5760" w:hanging="360"/>
+      </w:pPr>
+      <w:rPr>
+        <w:rFonts w:ascii="Symbol" w:hAnsi="Symbol" w:hint="default"/>
+      </w:rPr>
+    </w:lvl>
+    <w:lvl w:ilvl="7" w:tplc="04090003" w:tentative="1">
+      <w:start w:val="1"/>
+      <w:numFmt w:val="bullet"/>
+      <w:lvlText w:val="o"/>
+      <w:lvlJc w:val="left"/>
+      <w:pPr>
+        <w:ind w:left="6480" w:hanging="360"/>
+      </w:pPr>
+      <w:rPr>
+        <w:rFonts w:ascii="Courier New" w:hAnsi="Courier New" w:cs="Courier New" w:hint="default"/>
+      </w:rPr>
+    </w:lvl>
+    <w:lvl w:ilvl="8" w:tplc="04090005" w:tentative="1">
+      <w:start w:val="1"/>
+      <w:numFmt w:val="bullet"/>
+      <w:lvlText w:val=""/>
+      <w:lvlJc w:val="left"/>
+      <w:pPr>
+        <w:ind w:left="7200" w:hanging="360"/>
+      </w:pPr>
+      <w:rPr>
+        <w:rFonts w:ascii="Wingdings" w:hAnsi="Wingdings" w:hint="default"/>
       </w:rPr>
     </w:lvl>
   </w:abstractNum>
@@ -1830,10 +2442,10 @@
     <w:abstractNumId w:val="11"/>
   </w:num>
   <w:num w:numId="4">
-    <w:abstractNumId w:val="13"/>
+    <w:abstractNumId w:val="18"/>
   </w:num>
   <w:num w:numId="5">
-    <w:abstractNumId w:val="14"/>
+    <w:abstractNumId w:val="19"/>
   </w:num>
   <w:num w:numId="6">
     <w:abstractNumId w:val="9"/>
@@ -1863,7 +2475,124 @@
     <w:abstractNumId w:val="1"/>
   </w:num>
   <w:num w:numId="15">
+    <w:abstractNumId w:val="17"/>
+  </w:num>
+  <w:num w:numId="16">
+    <w:abstractNumId w:val="17"/>
+    <w:lvlOverride w:ilvl="0">
+      <w:startOverride w:val="1"/>
+    </w:lvlOverride>
+  </w:num>
+  <w:num w:numId="17">
+    <w:abstractNumId w:val="17"/>
+    <w:lvlOverride w:ilvl="0">
+      <w:startOverride w:val="1"/>
+    </w:lvlOverride>
+  </w:num>
+  <w:num w:numId="18">
+    <w:abstractNumId w:val="13"/>
+  </w:num>
+  <w:num w:numId="19">
+    <w:abstractNumId w:val="17"/>
+    <w:lvlOverride w:ilvl="0">
+      <w:startOverride w:val="1"/>
+    </w:lvlOverride>
+  </w:num>
+  <w:num w:numId="20">
+    <w:abstractNumId w:val="17"/>
+    <w:lvlOverride w:ilvl="0">
+      <w:startOverride w:val="1"/>
+    </w:lvlOverride>
+  </w:num>
+  <w:num w:numId="21">
+    <w:abstractNumId w:val="17"/>
+    <w:lvlOverride w:ilvl="0">
+      <w:startOverride w:val="1"/>
+    </w:lvlOverride>
+  </w:num>
+  <w:num w:numId="22">
+    <w:abstractNumId w:val="17"/>
+    <w:lvlOverride w:ilvl="0">
+      <w:startOverride w:val="1"/>
+    </w:lvlOverride>
+  </w:num>
+  <w:num w:numId="23">
+    <w:abstractNumId w:val="17"/>
+    <w:lvlOverride w:ilvl="0">
+      <w:startOverride w:val="1"/>
+    </w:lvlOverride>
+  </w:num>
+  <w:num w:numId="24">
+    <w:abstractNumId w:val="17"/>
+    <w:lvlOverride w:ilvl="0">
+      <w:startOverride w:val="1"/>
+    </w:lvlOverride>
+  </w:num>
+  <w:num w:numId="25">
+    <w:abstractNumId w:val="17"/>
+    <w:lvlOverride w:ilvl="0">
+      <w:startOverride w:val="1"/>
+    </w:lvlOverride>
+  </w:num>
+  <w:num w:numId="26">
+    <w:abstractNumId w:val="17"/>
+    <w:lvlOverride w:ilvl="0">
+      <w:startOverride w:val="1"/>
+    </w:lvlOverride>
+  </w:num>
+  <w:num w:numId="27">
+    <w:abstractNumId w:val="15"/>
+  </w:num>
+  <w:num w:numId="28">
+    <w:abstractNumId w:val="17"/>
+    <w:lvlOverride w:ilvl="0">
+      <w:startOverride w:val="1"/>
+    </w:lvlOverride>
+  </w:num>
+  <w:num w:numId="29">
+    <w:abstractNumId w:val="17"/>
+    <w:lvlOverride w:ilvl="0">
+      <w:startOverride w:val="1"/>
+    </w:lvlOverride>
+  </w:num>
+  <w:num w:numId="30">
+    <w:abstractNumId w:val="17"/>
+    <w:lvlOverride w:ilvl="0">
+      <w:startOverride w:val="1"/>
+    </w:lvlOverride>
+  </w:num>
+  <w:num w:numId="31">
     <w:abstractNumId w:val="0"/>
+  </w:num>
+  <w:num w:numId="32">
+    <w:abstractNumId w:val="16"/>
+  </w:num>
+  <w:num w:numId="33">
+    <w:abstractNumId w:val="16"/>
+    <w:lvlOverride w:ilvl="0">
+      <w:startOverride w:val="1"/>
+    </w:lvlOverride>
+  </w:num>
+  <w:num w:numId="34">
+    <w:abstractNumId w:val="16"/>
+    <w:lvlOverride w:ilvl="0">
+      <w:startOverride w:val="1"/>
+    </w:lvlOverride>
+  </w:num>
+  <w:num w:numId="35">
+    <w:abstractNumId w:val="14"/>
+  </w:num>
+  <w:num w:numId="36">
+    <w:abstractNumId w:val="2"/>
+    <w:lvlOverride w:ilvl="0">
+      <w:startOverride w:val="1"/>
+    </w:lvlOverride>
+  </w:num>
+  <w:num w:numId="37">
+    <w:abstractNumId w:val="20"/>
+  </w:num>
+  <w:num w:numId="38">
+    <w:abstractNumId w:val="21"/>
   </w:num>
 </w:numbering>
 </file>
@@ -1874,19 +2603,31 @@
     <w:rPrDefault>
       <w:rPr>
         <w:rFonts w:asciiTheme="minorHAnsi" w:eastAsiaTheme="minorHAnsi" w:hAnsiTheme="minorHAnsi" w:cstheme="minorBidi"/>
+        <w:kern w:val="2"/>
         <w:sz w:val="24"/>
         <w:szCs w:val="24"/>
-        <w:lang w:val="en" w:eastAsia="en-US" w:bidi="ar-SA"/>
+        <w:lang w:val="en-US" w:eastAsia="en-US" w:bidi="ar-SA"/>
+        <w14:ligatures w14:val="standardContextual"/>
       </w:rPr>
     </w:rPrDefault>
     <w:pPrDefault>
       <w:pPr>
-        <w:spacing w:after="200"/>
+        <w:spacing w:after="160" w:line="278" w:lineRule="auto"/>
       </w:pPr>
     </w:pPrDefault>
   </w:docDefaults>
-  <w:latentStyles w:defLockedState="0" w:defUIPriority="0" w:defSemiHidden="0" w:defUnhideWhenUsed="0" w:defQFormat="0" w:count="371">
-    <w:lsdException w:name="heading 5" w:semiHidden="1" w:unhideWhenUsed="1"/>
+  <w:latentStyles w:defLockedState="0" w:defUIPriority="99" w:defSemiHidden="0" w:defUnhideWhenUsed="0" w:defQFormat="0" w:count="371">
+    <w:lsdException w:name="Normal" w:uiPriority="0" w:qFormat="1"/>
+    <w:lsdException w:name="heading 1" w:uiPriority="9" w:qFormat="1"/>
+    <w:lsdException w:name="heading 2" w:semiHidden="1" w:uiPriority="9" w:unhideWhenUsed="1" w:qFormat="1"/>
+    <w:lsdException w:name="heading 3" w:semiHidden="1" w:uiPriority="9" w:unhideWhenUsed="1" w:qFormat="1"/>
+    <w:lsdException w:name="heading 4" w:semiHidden="1" w:uiPriority="9" w:unhideWhenUsed="1" w:qFormat="1"/>
+    <w:lsdException w:name="heading 5" w:semiHidden="1" w:uiPriority="9" w:unhideWhenUsed="1" w:qFormat="1"/>
+    <w:lsdException w:name="heading 6" w:semiHidden="1" w:uiPriority="9" w:unhideWhenUsed="1" w:qFormat="1"/>
+    <w:lsdException w:name="heading 7" w:semiHidden="1" w:uiPriority="9" w:unhideWhenUsed="1" w:qFormat="1"/>
+    <w:lsdException w:name="heading 8" w:semiHidden="1" w:uiPriority="9" w:unhideWhenUsed="1" w:qFormat="1"/>
+    <w:lsdException w:name="heading 9" w:semiHidden="1" w:uiPriority="9" w:unhideWhenUsed="1" w:qFormat="1"/>
+    <w:lsdException w:name="index 1" w:semiHidden="1" w:unhideWhenUsed="1"/>
     <w:lsdException w:name="index 2" w:semiHidden="1" w:unhideWhenUsed="1"/>
     <w:lsdException w:name="index 3" w:semiHidden="1" w:unhideWhenUsed="1"/>
     <w:lsdException w:name="index 4" w:semiHidden="1" w:unhideWhenUsed="1"/>
@@ -1896,49 +2637,53 @@
     <w:lsdException w:name="index 8" w:semiHidden="1" w:unhideWhenUsed="1"/>
     <w:lsdException w:name="index 9" w:semiHidden="1" w:unhideWhenUsed="1"/>
     <w:lsdException w:name="toc 1" w:semiHidden="1" w:uiPriority="39" w:unhideWhenUsed="1"/>
-    <w:lsdException w:name="toc 2" w:semiHidden="1" w:unhideWhenUsed="1"/>
-    <w:lsdException w:name="toc 3" w:semiHidden="1" w:unhideWhenUsed="1"/>
-    <w:lsdException w:name="toc 4" w:semiHidden="1" w:unhideWhenUsed="1"/>
-    <w:lsdException w:name="toc 5" w:semiHidden="1" w:unhideWhenUsed="1"/>
-    <w:lsdException w:name="toc 6" w:semiHidden="1" w:unhideWhenUsed="1"/>
-    <w:lsdException w:name="toc 7" w:semiHidden="1" w:unhideWhenUsed="1"/>
-    <w:lsdException w:name="toc 8" w:semiHidden="1" w:unhideWhenUsed="1"/>
-    <w:lsdException w:name="toc 9" w:semiHidden="1" w:unhideWhenUsed="1"/>
+    <w:lsdException w:name="toc 2" w:semiHidden="1" w:uiPriority="39" w:unhideWhenUsed="1"/>
+    <w:lsdException w:name="toc 3" w:semiHidden="1" w:uiPriority="39" w:unhideWhenUsed="1"/>
+    <w:lsdException w:name="toc 4" w:semiHidden="1" w:uiPriority="39" w:unhideWhenUsed="1"/>
+    <w:lsdException w:name="toc 5" w:semiHidden="1" w:uiPriority="39" w:unhideWhenUsed="1"/>
+    <w:lsdException w:name="toc 6" w:semiHidden="1" w:uiPriority="39" w:unhideWhenUsed="1"/>
+    <w:lsdException w:name="toc 7" w:semiHidden="1" w:uiPriority="39" w:unhideWhenUsed="1"/>
+    <w:lsdException w:name="toc 8" w:semiHidden="1" w:uiPriority="39" w:unhideWhenUsed="1"/>
+    <w:lsdException w:name="toc 9" w:semiHidden="1" w:uiPriority="39" w:unhideWhenUsed="1"/>
     <w:lsdException w:name="Normal Indent" w:semiHidden="1" w:unhideWhenUsed="1"/>
-    <w:lsdException w:name="footnote text" w:semiHidden="1" w:unhideWhenUsed="1"/>
-    <w:lsdException w:name="annotation text" w:semiHidden="1" w:unhideWhenUsed="1"/>
-    <w:lsdException w:name="header" w:semiHidden="1" w:unhideWhenUsed="1"/>
-    <w:lsdException w:name="footer" w:semiHidden="1" w:unhideWhenUsed="1"/>
+    <w:lsdException w:name="footnote text" w:semiHidden="1" w:uiPriority="9" w:unhideWhenUsed="1" w:qFormat="1"/>
+    <w:lsdException w:name="annotation text" w:semiHidden="1" w:uiPriority="0" w:unhideWhenUsed="1"/>
+    <w:lsdException w:name="header" w:semiHidden="1" w:uiPriority="0" w:unhideWhenUsed="1"/>
+    <w:lsdException w:name="footer" w:semiHidden="1" w:uiPriority="0" w:unhideWhenUsed="1"/>
     <w:lsdException w:name="index heading" w:semiHidden="1" w:unhideWhenUsed="1"/>
-    <w:lsdException w:name="caption" w:semiHidden="1" w:unhideWhenUsed="1"/>
+    <w:lsdException w:name="caption" w:semiHidden="1" w:uiPriority="0" w:unhideWhenUsed="1" w:qFormat="1"/>
     <w:lsdException w:name="table of figures" w:semiHidden="1" w:unhideWhenUsed="1"/>
     <w:lsdException w:name="envelope address" w:semiHidden="1" w:unhideWhenUsed="1"/>
     <w:lsdException w:name="envelope return" w:semiHidden="1" w:unhideWhenUsed="1"/>
-    <w:lsdException w:name="footnote reference" w:semiHidden="1" w:unhideWhenUsed="1"/>
-    <w:lsdException w:name="annotation reference" w:semiHidden="1" w:unhideWhenUsed="1"/>
-    <w:lsdException w:name="line number" w:semiHidden="1" w:unhideWhenUsed="1"/>
+    <w:lsdException w:name="footnote reference" w:semiHidden="1" w:uiPriority="0" w:unhideWhenUsed="1"/>
+    <w:lsdException w:name="annotation reference" w:semiHidden="1" w:uiPriority="0" w:unhideWhenUsed="1"/>
+    <w:lsdException w:name="line number" w:semiHidden="1" w:uiPriority="0" w:unhideWhenUsed="1"/>
     <w:lsdException w:name="page number" w:semiHidden="1" w:unhideWhenUsed="1"/>
     <w:lsdException w:name="endnote reference" w:semiHidden="1" w:unhideWhenUsed="1"/>
     <w:lsdException w:name="endnote text" w:semiHidden="1" w:unhideWhenUsed="1"/>
     <w:lsdException w:name="table of authorities" w:semiHidden="1" w:unhideWhenUsed="1"/>
     <w:lsdException w:name="macro" w:semiHidden="1" w:unhideWhenUsed="1"/>
     <w:lsdException w:name="toa heading" w:semiHidden="1" w:unhideWhenUsed="1"/>
-    <w:lsdException w:name="List" w:semiHidden="1" w:unhideWhenUsed="1"/>
+    <w:lsdException w:name="List" w:semiHidden="1" w:uiPriority="0" w:unhideWhenUsed="1"/>
     <w:lsdException w:name="List Bullet" w:semiHidden="1" w:unhideWhenUsed="1"/>
     <w:lsdException w:name="List Number" w:semiHidden="1" w:unhideWhenUsed="1"/>
     <w:lsdException w:name="List 2" w:semiHidden="1" w:unhideWhenUsed="1"/>
     <w:lsdException w:name="List 3" w:semiHidden="1" w:unhideWhenUsed="1"/>
     <w:lsdException w:name="List 4" w:semiHidden="1" w:unhideWhenUsed="1"/>
+    <w:lsdException w:name="List 5" w:semiHidden="1" w:unhideWhenUsed="1"/>
     <w:lsdException w:name="List Bullet 2" w:semiHidden="1" w:unhideWhenUsed="1"/>
-    <w:lsdException w:name="List Bullet 3" w:semiHidden="1" w:unhideWhenUsed="1"/>
-    <w:lsdException w:name="List Number 2" w:semiHidden="1" w:unhideWhenUsed="1"/>
-    <w:lsdException w:name="List Number 3" w:semiHidden="1" w:unhideWhenUsed="1"/>
+    <w:lsdException w:name="List Bullet 3" w:semiHidden="1" w:uiPriority="0" w:unhideWhenUsed="1" w:qFormat="1"/>
+    <w:lsdException w:name="List Bullet 4" w:semiHidden="1" w:unhideWhenUsed="1"/>
+    <w:lsdException w:name="List Bullet 5" w:semiHidden="1" w:unhideWhenUsed="1"/>
+    <w:lsdException w:name="List Number 2" w:semiHidden="1" w:uiPriority="0" w:unhideWhenUsed="1" w:qFormat="1"/>
+    <w:lsdException w:name="List Number 3" w:semiHidden="1" w:uiPriority="0" w:unhideWhenUsed="1"/>
     <w:lsdException w:name="List Number 4" w:semiHidden="1" w:unhideWhenUsed="1"/>
     <w:lsdException w:name="List Number 5" w:semiHidden="1" w:unhideWhenUsed="1"/>
+    <w:lsdException w:name="Title" w:uiPriority="0" w:qFormat="1"/>
     <w:lsdException w:name="Closing" w:semiHidden="1" w:unhideWhenUsed="1"/>
     <w:lsdException w:name="Signature" w:semiHidden="1" w:unhideWhenUsed="1"/>
-    <w:lsdException w:name="Default Paragraph Font" w:semiHidden="1" w:unhideWhenUsed="1"/>
-    <w:lsdException w:name="Body Text" w:semiHidden="1" w:unhideWhenUsed="1"/>
+    <w:lsdException w:name="Default Paragraph Font" w:semiHidden="1" w:uiPriority="1" w:unhideWhenUsed="1"/>
+    <w:lsdException w:name="Body Text" w:semiHidden="1" w:uiPriority="0" w:unhideWhenUsed="1" w:qFormat="1"/>
     <w:lsdException w:name="Body Text Indent" w:semiHidden="1" w:unhideWhenUsed="1"/>
     <w:lsdException w:name="List Continue" w:semiHidden="1" w:unhideWhenUsed="1"/>
     <w:lsdException w:name="List Continue 2" w:semiHidden="1" w:unhideWhenUsed="1"/>
@@ -1946,14 +2691,21 @@
     <w:lsdException w:name="List Continue 4" w:semiHidden="1" w:unhideWhenUsed="1"/>
     <w:lsdException w:name="List Continue 5" w:semiHidden="1" w:unhideWhenUsed="1"/>
     <w:lsdException w:name="Message Header" w:semiHidden="1" w:unhideWhenUsed="1"/>
+    <w:lsdException w:name="Subtitle" w:uiPriority="0" w:qFormat="1"/>
     <w:lsdException w:name="Salutation" w:semiHidden="1" w:unhideWhenUsed="1"/>
-    <w:lsdException w:name="Date" w:semiHidden="1" w:unhideWhenUsed="1"/>
+    <w:lsdException w:name="Date" w:semiHidden="1" w:uiPriority="0" w:unhideWhenUsed="1" w:qFormat="1"/>
     <w:lsdException w:name="Body Text First Indent" w:semiHidden="1" w:unhideWhenUsed="1"/>
+    <w:lsdException w:name="Body Text First Indent 2" w:semiHidden="1" w:unhideWhenUsed="1"/>
+    <w:lsdException w:name="Note Heading" w:semiHidden="1" w:unhideWhenUsed="1"/>
+    <w:lsdException w:name="Body Text 2" w:semiHidden="1" w:unhideWhenUsed="1"/>
+    <w:lsdException w:name="Body Text 3" w:semiHidden="1" w:unhideWhenUsed="1"/>
     <w:lsdException w:name="Body Text Indent 2" w:semiHidden="1" w:unhideWhenUsed="1"/>
     <w:lsdException w:name="Body Text Indent 3" w:semiHidden="1" w:unhideWhenUsed="1"/>
-    <w:lsdException w:name="Block Text" w:semiHidden="1" w:unhideWhenUsed="1"/>
-    <w:lsdException w:name="Hyperlink" w:semiHidden="1" w:uiPriority="99" w:unhideWhenUsed="1"/>
+    <w:lsdException w:name="Block Text" w:semiHidden="1" w:uiPriority="9" w:unhideWhenUsed="1" w:qFormat="1"/>
+    <w:lsdException w:name="Hyperlink" w:semiHidden="1" w:unhideWhenUsed="1"/>
     <w:lsdException w:name="FollowedHyperlink" w:semiHidden="1" w:unhideWhenUsed="1"/>
+    <w:lsdException w:name="Strong" w:uiPriority="22" w:qFormat="1"/>
+    <w:lsdException w:name="Emphasis" w:uiPriority="20" w:qFormat="1"/>
     <w:lsdException w:name="Document Map" w:semiHidden="1" w:unhideWhenUsed="1"/>
     <w:lsdException w:name="Plain Text" w:semiHidden="1" w:unhideWhenUsed="1"/>
     <w:lsdException w:name="E-mail Signature" w:semiHidden="1" w:unhideWhenUsed="1"/>
@@ -1971,7 +2723,7 @@
     <w:lsdException w:name="HTML Typewriter" w:semiHidden="1" w:unhideWhenUsed="1"/>
     <w:lsdException w:name="HTML Variable" w:semiHidden="1" w:unhideWhenUsed="1"/>
     <w:lsdException w:name="Normal Table" w:semiHidden="1" w:unhideWhenUsed="1"/>
-    <w:lsdException w:name="annotation subject" w:semiHidden="1" w:unhideWhenUsed="1"/>
+    <w:lsdException w:name="annotation subject" w:semiHidden="1" w:uiPriority="0" w:unhideWhenUsed="1"/>
     <w:lsdException w:name="No List" w:semiHidden="1" w:unhideWhenUsed="1"/>
     <w:lsdException w:name="Outline List 1" w:semiHidden="1" w:unhideWhenUsed="1"/>
     <w:lsdException w:name="Outline List 2" w:semiHidden="1" w:unhideWhenUsed="1"/>
@@ -2019,109 +2771,128 @@
     <w:lsdException w:name="Table Web 2" w:semiHidden="1" w:unhideWhenUsed="1"/>
     <w:lsdException w:name="Table Web 3" w:semiHidden="1" w:unhideWhenUsed="1"/>
     <w:lsdException w:name="Balloon Text" w:semiHidden="1" w:unhideWhenUsed="1"/>
+    <w:lsdException w:name="Table Grid" w:uiPriority="39"/>
     <w:lsdException w:name="Table Theme" w:semiHidden="1" w:unhideWhenUsed="1"/>
     <w:lsdException w:name="Placeholder Text" w:semiHidden="1"/>
-    <w:lsdException w:name="Light Shading"/>
-    <w:lsdException w:name="Light List"/>
-    <w:lsdException w:name="Light Grid"/>
-    <w:lsdException w:name="Medium Shading 1"/>
-    <w:lsdException w:name="Medium Shading 2"/>
-    <w:lsdException w:name="Medium List 1"/>
-    <w:lsdException w:name="Medium List 2"/>
-    <w:lsdException w:name="Medium Grid 1"/>
-    <w:lsdException w:name="Medium Grid 2"/>
-    <w:lsdException w:name="Medium Grid 3"/>
-    <w:lsdException w:name="Dark List"/>
-    <w:lsdException w:name="Colorful Shading"/>
-    <w:lsdException w:name="Colorful List"/>
-    <w:lsdException w:name="Colorful Grid"/>
-    <w:lsdException w:name="Light Shading Accent 1"/>
-    <w:lsdException w:name="Light List Accent 1"/>
-    <w:lsdException w:name="Light Grid Accent 1"/>
-    <w:lsdException w:name="Medium Shading 1 Accent 1"/>
-    <w:lsdException w:name="Medium Shading 2 Accent 1"/>
-    <w:lsdException w:name="Medium List 1 Accent 1"/>
-    <w:lsdException w:name="Revision" w:semiHidden="1"/>
-    <w:lsdException w:name="Medium List 2 Accent 1"/>
-    <w:lsdException w:name="Medium Grid 1 Accent 1"/>
-    <w:lsdException w:name="Medium Grid 2 Accent 1"/>
-    <w:lsdException w:name="Medium Grid 3 Accent 1"/>
-    <w:lsdException w:name="Dark List Accent 1"/>
-    <w:lsdException w:name="Colorful Shading Accent 1"/>
-    <w:lsdException w:name="Colorful List Accent 1"/>
-    <w:lsdException w:name="Colorful Grid Accent 1"/>
-    <w:lsdException w:name="Light Shading Accent 2"/>
-    <w:lsdException w:name="Light List Accent 2"/>
-    <w:lsdException w:name="Light Grid Accent 2"/>
-    <w:lsdException w:name="Medium Shading 1 Accent 2"/>
-    <w:lsdException w:name="Medium Shading 2 Accent 2"/>
-    <w:lsdException w:name="Medium List 1 Accent 2"/>
-    <w:lsdException w:name="Medium List 2 Accent 2"/>
-    <w:lsdException w:name="Medium Grid 1 Accent 2"/>
-    <w:lsdException w:name="Medium Grid 2 Accent 2"/>
-    <w:lsdException w:name="Medium Grid 3 Accent 2"/>
-    <w:lsdException w:name="Dark List Accent 2"/>
-    <w:lsdException w:name="Colorful Shading Accent 2"/>
-    <w:lsdException w:name="Colorful List Accent 2"/>
-    <w:lsdException w:name="Colorful Grid Accent 2"/>
-    <w:lsdException w:name="Light Shading Accent 3"/>
-    <w:lsdException w:name="Light List Accent 3"/>
-    <w:lsdException w:name="Light Grid Accent 3"/>
-    <w:lsdException w:name="Medium Shading 1 Accent 3"/>
-    <w:lsdException w:name="Medium Shading 2 Accent 3"/>
-    <w:lsdException w:name="Medium List 1 Accent 3"/>
-    <w:lsdException w:name="Medium List 2 Accent 3"/>
-    <w:lsdException w:name="Medium Grid 1 Accent 3"/>
-    <w:lsdException w:name="Medium Grid 2 Accent 3"/>
-    <w:lsdException w:name="Medium Grid 3 Accent 3"/>
-    <w:lsdException w:name="Dark List Accent 3"/>
-    <w:lsdException w:name="Colorful Shading Accent 3"/>
-    <w:lsdException w:name="Colorful List Accent 3"/>
-    <w:lsdException w:name="Colorful Grid Accent 3"/>
-    <w:lsdException w:name="Light Shading Accent 4"/>
-    <w:lsdException w:name="Light List Accent 4"/>
-    <w:lsdException w:name="Light Grid Accent 4"/>
-    <w:lsdException w:name="Medium Shading 1 Accent 4"/>
-    <w:lsdException w:name="Medium Shading 2 Accent 4"/>
-    <w:lsdException w:name="Medium List 1 Accent 4"/>
-    <w:lsdException w:name="Medium List 2 Accent 4"/>
-    <w:lsdException w:name="Medium Grid 1 Accent 4"/>
-    <w:lsdException w:name="Medium Grid 2 Accent 4"/>
-    <w:lsdException w:name="Medium Grid 3 Accent 4"/>
-    <w:lsdException w:name="Dark List Accent 4"/>
-    <w:lsdException w:name="Colorful Shading Accent 4"/>
-    <w:lsdException w:name="Colorful List Accent 4"/>
-    <w:lsdException w:name="Colorful Grid Accent 4"/>
-    <w:lsdException w:name="Light Shading Accent 5"/>
-    <w:lsdException w:name="Light List Accent 5"/>
-    <w:lsdException w:name="Light Grid Accent 5"/>
-    <w:lsdException w:name="Medium Shading 1 Accent 5"/>
-    <w:lsdException w:name="Medium Shading 2 Accent 5"/>
-    <w:lsdException w:name="Medium List 1 Accent 5"/>
-    <w:lsdException w:name="Medium List 2 Accent 5"/>
-    <w:lsdException w:name="Medium Grid 1 Accent 5"/>
-    <w:lsdException w:name="Medium Grid 2 Accent 5"/>
-    <w:lsdException w:name="Medium Grid 3 Accent 5"/>
-    <w:lsdException w:name="Dark List Accent 5"/>
-    <w:lsdException w:name="Colorful Shading Accent 5"/>
-    <w:lsdException w:name="Colorful List Accent 5"/>
-    <w:lsdException w:name="Colorful Grid Accent 5"/>
-    <w:lsdException w:name="Light Shading Accent 6"/>
-    <w:lsdException w:name="Light List Accent 6"/>
-    <w:lsdException w:name="Light Grid Accent 6"/>
-    <w:lsdException w:name="Medium Shading 1 Accent 6"/>
-    <w:lsdException w:name="Medium Shading 2 Accent 6"/>
-    <w:lsdException w:name="Medium List 1 Accent 6"/>
-    <w:lsdException w:name="Medium List 2 Accent 6"/>
-    <w:lsdException w:name="Medium Grid 1 Accent 6"/>
-    <w:lsdException w:name="Medium Grid 2 Accent 6"/>
-    <w:lsdException w:name="Medium Grid 3 Accent 6"/>
-    <w:lsdException w:name="Dark List Accent 6"/>
-    <w:lsdException w:name="Colorful Shading Accent 6"/>
-    <w:lsdException w:name="Colorful List Accent 6"/>
-    <w:lsdException w:name="Colorful Grid Accent 6"/>
-    <w:lsdException w:name="Bibliography" w:semiHidden="1" w:unhideWhenUsed="1"/>
-    <w:lsdException w:name="TOC Heading" w:semiHidden="1" w:unhideWhenUsed="1"/>
+    <w:lsdException w:name="No Spacing" w:uiPriority="1" w:qFormat="1"/>
+    <w:lsdException w:name="Light Shading" w:uiPriority="60"/>
+    <w:lsdException w:name="Light List" w:uiPriority="61"/>
+    <w:lsdException w:name="Light Grid" w:uiPriority="62"/>
+    <w:lsdException w:name="Medium Shading 1" w:uiPriority="63"/>
+    <w:lsdException w:name="Medium Shading 2" w:uiPriority="64"/>
+    <w:lsdException w:name="Medium List 1" w:uiPriority="65"/>
+    <w:lsdException w:name="Medium List 2" w:uiPriority="66"/>
+    <w:lsdException w:name="Medium Grid 1" w:uiPriority="67"/>
+    <w:lsdException w:name="Medium Grid 2" w:uiPriority="68"/>
+    <w:lsdException w:name="Medium Grid 3" w:uiPriority="69"/>
+    <w:lsdException w:name="Dark List" w:uiPriority="70"/>
+    <w:lsdException w:name="Colorful Shading" w:uiPriority="71"/>
+    <w:lsdException w:name="Colorful List" w:uiPriority="72"/>
+    <w:lsdException w:name="Colorful Grid" w:uiPriority="73"/>
+    <w:lsdException w:name="Light Shading Accent 1" w:uiPriority="60"/>
+    <w:lsdException w:name="Light List Accent 1" w:uiPriority="61"/>
+    <w:lsdException w:name="Light Grid Accent 1" w:uiPriority="62"/>
+    <w:lsdException w:name="Medium Shading 1 Accent 1" w:uiPriority="63"/>
+    <w:lsdException w:name="Medium Shading 2 Accent 1" w:uiPriority="64"/>
+    <w:lsdException w:name="Medium List 1 Accent 1" w:uiPriority="65"/>
+    <w:lsdException w:name="Revision" w:semiHidden="1" w:uiPriority="0"/>
+    <w:lsdException w:name="List Paragraph" w:uiPriority="34" w:qFormat="1"/>
+    <w:lsdException w:name="Quote" w:uiPriority="29" w:qFormat="1"/>
+    <w:lsdException w:name="Intense Quote" w:uiPriority="30" w:qFormat="1"/>
+    <w:lsdException w:name="Medium List 2 Accent 1" w:uiPriority="66"/>
+    <w:lsdException w:name="Medium Grid 1 Accent 1" w:uiPriority="67"/>
+    <w:lsdException w:name="Medium Grid 2 Accent 1" w:uiPriority="68"/>
+    <w:lsdException w:name="Medium Grid 3 Accent 1" w:uiPriority="69"/>
+    <w:lsdException w:name="Dark List Accent 1" w:uiPriority="70"/>
+    <w:lsdException w:name="Colorful Shading Accent 1" w:uiPriority="71"/>
+    <w:lsdException w:name="Colorful List Accent 1" w:uiPriority="72"/>
+    <w:lsdException w:name="Colorful Grid Accent 1" w:uiPriority="73"/>
+    <w:lsdException w:name="Light Shading Accent 2" w:uiPriority="60"/>
+    <w:lsdException w:name="Light List Accent 2" w:uiPriority="61"/>
+    <w:lsdException w:name="Light Grid Accent 2" w:uiPriority="62"/>
+    <w:lsdException w:name="Medium Shading 1 Accent 2" w:uiPriority="63"/>
+    <w:lsdException w:name="Medium Shading 2 Accent 2" w:uiPriority="64"/>
+    <w:lsdException w:name="Medium List 1 Accent 2" w:uiPriority="65"/>
+    <w:lsdException w:name="Medium List 2 Accent 2" w:uiPriority="66"/>
+    <w:lsdException w:name="Medium Grid 1 Accent 2" w:uiPriority="67"/>
+    <w:lsdException w:name="Medium Grid 2 Accent 2" w:uiPriority="68"/>
+    <w:lsdException w:name="Medium Grid 3 Accent 2" w:uiPriority="69"/>
+    <w:lsdException w:name="Dark List Accent 2" w:uiPriority="70"/>
+    <w:lsdException w:name="Colorful Shading Accent 2" w:uiPriority="71"/>
+    <w:lsdException w:name="Colorful List Accent 2" w:uiPriority="72"/>
+    <w:lsdException w:name="Colorful Grid Accent 2" w:uiPriority="73"/>
+    <w:lsdException w:name="Light Shading Accent 3" w:uiPriority="60"/>
+    <w:lsdException w:name="Light List Accent 3" w:uiPriority="61"/>
+    <w:lsdException w:name="Light Grid Accent 3" w:uiPriority="62"/>
+    <w:lsdException w:name="Medium Shading 1 Accent 3" w:uiPriority="63"/>
+    <w:lsdException w:name="Medium Shading 2 Accent 3" w:uiPriority="64"/>
+    <w:lsdException w:name="Medium List 1 Accent 3" w:uiPriority="65"/>
+    <w:lsdException w:name="Medium List 2 Accent 3" w:uiPriority="66"/>
+    <w:lsdException w:name="Medium Grid 1 Accent 3" w:uiPriority="67"/>
+    <w:lsdException w:name="Medium Grid 2 Accent 3" w:uiPriority="68"/>
+    <w:lsdException w:name="Medium Grid 3 Accent 3" w:uiPriority="69"/>
+    <w:lsdException w:name="Dark List Accent 3" w:uiPriority="70"/>
+    <w:lsdException w:name="Colorful Shading Accent 3" w:uiPriority="71"/>
+    <w:lsdException w:name="Colorful List Accent 3" w:uiPriority="72"/>
+    <w:lsdException w:name="Colorful Grid Accent 3" w:uiPriority="73"/>
+    <w:lsdException w:name="Light Shading Accent 4" w:uiPriority="60"/>
+    <w:lsdException w:name="Light List Accent 4" w:uiPriority="61"/>
+    <w:lsdException w:name="Light Grid Accent 4" w:uiPriority="62"/>
+    <w:lsdException w:name="Medium Shading 1 Accent 4" w:uiPriority="63"/>
+    <w:lsdException w:name="Medium Shading 2 Accent 4" w:uiPriority="64"/>
+    <w:lsdException w:name="Medium List 1 Accent 4" w:uiPriority="65"/>
+    <w:lsdException w:name="Medium List 2 Accent 4" w:uiPriority="66"/>
+    <w:lsdException w:name="Medium Grid 1 Accent 4" w:uiPriority="67"/>
+    <w:lsdException w:name="Medium Grid 2 Accent 4" w:uiPriority="68"/>
+    <w:lsdException w:name="Medium Grid 3 Accent 4" w:uiPriority="69"/>
+    <w:lsdException w:name="Dark List Accent 4" w:uiPriority="70"/>
+    <w:lsdException w:name="Colorful Shading Accent 4" w:uiPriority="71"/>
+    <w:lsdException w:name="Colorful List Accent 4" w:uiPriority="72"/>
+    <w:lsdException w:name="Colorful Grid Accent 4" w:uiPriority="73"/>
+    <w:lsdException w:name="Light Shading Accent 5" w:uiPriority="60"/>
+    <w:lsdException w:name="Light List Accent 5" w:uiPriority="61"/>
+    <w:lsdException w:name="Light Grid Accent 5" w:uiPriority="62"/>
+    <w:lsdException w:name="Medium Shading 1 Accent 5" w:uiPriority="63"/>
+    <w:lsdException w:name="Medium Shading 2 Accent 5" w:uiPriority="64"/>
+    <w:lsdException w:name="Medium List 1 Accent 5" w:uiPriority="65"/>
+    <w:lsdException w:name="Medium List 2 Accent 5" w:uiPriority="66"/>
+    <w:lsdException w:name="Medium Grid 1 Accent 5" w:uiPriority="67"/>
+    <w:lsdException w:name="Medium Grid 2 Accent 5" w:uiPriority="68"/>
+    <w:lsdException w:name="Medium Grid 3 Accent 5" w:uiPriority="69"/>
+    <w:lsdException w:name="Dark List Accent 5" w:uiPriority="70"/>
+    <w:lsdException w:name="Colorful Shading Accent 5" w:uiPriority="71"/>
+    <w:lsdException w:name="Colorful List Accent 5" w:uiPriority="72"/>
+    <w:lsdException w:name="Colorful Grid Accent 5" w:uiPriority="73"/>
+    <w:lsdException w:name="Light Shading Accent 6" w:uiPriority="60"/>
+    <w:lsdException w:name="Light List Accent 6" w:uiPriority="61"/>
+    <w:lsdException w:name="Light Grid Accent 6" w:uiPriority="62"/>
+    <w:lsdException w:name="Medium Shading 1 Accent 6" w:uiPriority="63"/>
+    <w:lsdException w:name="Medium Shading 2 Accent 6" w:uiPriority="64"/>
+    <w:lsdException w:name="Medium List 1 Accent 6" w:uiPriority="65"/>
+    <w:lsdException w:name="Medium List 2 Accent 6" w:uiPriority="66"/>
+    <w:lsdException w:name="Medium Grid 1 Accent 6" w:uiPriority="67"/>
+    <w:lsdException w:name="Medium Grid 2 Accent 6" w:uiPriority="68"/>
+    <w:lsdException w:name="Medium Grid 3 Accent 6" w:uiPriority="69"/>
+    <w:lsdException w:name="Dark List Accent 6" w:uiPriority="70"/>
+    <w:lsdException w:name="Colorful Shading Accent 6" w:uiPriority="71"/>
+    <w:lsdException w:name="Colorful List Accent 6" w:uiPriority="72"/>
+    <w:lsdException w:name="Colorful Grid Accent 6" w:uiPriority="73"/>
+    <w:lsdException w:name="Subtle Emphasis" w:uiPriority="19" w:qFormat="1"/>
+    <w:lsdException w:name="Intense Emphasis" w:uiPriority="21" w:qFormat="1"/>
+    <w:lsdException w:name="Subtle Reference" w:uiPriority="31" w:qFormat="1"/>
+    <w:lsdException w:name="Intense Reference" w:uiPriority="32" w:qFormat="1"/>
+    <w:lsdException w:name="Book Title" w:uiPriority="33" w:qFormat="1"/>
+    <w:lsdException w:name="Bibliography" w:semiHidden="1" w:uiPriority="0" w:unhideWhenUsed="1" w:qFormat="1"/>
+    <w:lsdException w:name="TOC Heading" w:semiHidden="1" w:uiPriority="39" w:unhideWhenUsed="1" w:qFormat="1"/>
+    <w:lsdException w:name="Plain Table 1" w:uiPriority="41"/>
+    <w:lsdException w:name="Plain Table 2" w:uiPriority="42"/>
+    <w:lsdException w:name="Plain Table 3" w:uiPriority="43"/>
+    <w:lsdException w:name="Plain Table 4" w:uiPriority="44"/>
+    <w:lsdException w:name="Plain Table 5" w:uiPriority="45"/>
+    <w:lsdException w:name="Grid Table Light" w:uiPriority="40"/>
+    <w:lsdException w:name="Grid Table 1 Light" w:uiPriority="46"/>
+    <w:lsdException w:name="Grid Table 2" w:uiPriority="47"/>
+    <w:lsdException w:name="Grid Table 3" w:uiPriority="48"/>
     <w:lsdException w:name="Grid Table 4" w:uiPriority="49"/>
     <w:lsdException w:name="Grid Table 5 Dark" w:uiPriority="50"/>
     <w:lsdException w:name="Grid Table 6 Colorful" w:uiPriority="51"/>
@@ -2221,24 +2992,37 @@
   <w:style w:type="paragraph" w:default="1" w:styleId="Normal">
     <w:name w:val="Normal"/>
     <w:qFormat/>
+    <w:rsid w:val="00D146FB"/>
+    <w:pPr>
+      <w:spacing w:line="259" w:lineRule="auto"/>
+    </w:pPr>
+    <w:rPr>
+      <w:kern w:val="0"/>
+      <w:sz w:val="22"/>
+      <w:szCs w:val="22"/>
+      <w14:ligatures w14:val="none"/>
+    </w:rPr>
   </w:style>
   <w:style w:type="paragraph" w:styleId="Heading1">
     <w:name w:val="heading 1"/>
     <w:basedOn w:val="Normal"/>
     <w:next w:val="BodyText"/>
+    <w:link w:val="Heading1Char"/>
+    <w:autoRedefine/>
     <w:uiPriority w:val="9"/>
     <w:qFormat/>
+    <w:rsid w:val="00DD6E47"/>
     <w:pPr>
       <w:keepNext/>
       <w:keepLines/>
-      <w:spacing w:before="480" w:after="0"/>
+      <w:jc w:val="center"/>
       <w:outlineLvl w:val="0"/>
     </w:pPr>
     <w:rPr>
-      <w:rFonts w:asciiTheme="majorHAnsi" w:eastAsiaTheme="majorEastAsia" w:hAnsiTheme="majorHAnsi" w:cstheme="majorBidi"/>
+      <w:rFonts w:eastAsiaTheme="majorEastAsia" w:cstheme="majorBidi"/>
       <w:b/>
       <w:bCs/>
-      <w:color w:val="4F81BD" w:themeColor="accent1"/>
+      <w:color w:val="000000" w:themeColor="text1"/>
       <w:sz w:val="32"/>
       <w:szCs w:val="32"/>
     </w:rPr>
@@ -2247,21 +3031,23 @@
     <w:name w:val="heading 2"/>
     <w:basedOn w:val="Normal"/>
     <w:next w:val="BodyText"/>
+    <w:link w:val="Heading2Char"/>
     <w:uiPriority w:val="9"/>
     <w:unhideWhenUsed/>
     <w:qFormat/>
+    <w:rsid w:val="00AE3F74"/>
     <w:pPr>
       <w:keepNext/>
       <w:keepLines/>
-      <w:spacing w:before="200" w:after="0"/>
+      <w:spacing w:before="160" w:after="0"/>
       <w:outlineLvl w:val="1"/>
     </w:pPr>
     <w:rPr>
-      <w:rFonts w:asciiTheme="majorHAnsi" w:eastAsiaTheme="majorEastAsia" w:hAnsiTheme="majorHAnsi" w:cstheme="majorBidi"/>
+      <w:rFonts w:eastAsiaTheme="majorEastAsia" w:cstheme="majorBidi"/>
       <w:b/>
       <w:bCs/>
-      <w:color w:val="4F81BD" w:themeColor="accent1"/>
-      <w:sz w:val="28"/>
+      <w:color w:val="000000" w:themeColor="text1"/>
+      <w:sz w:val="26"/>
       <w:szCs w:val="28"/>
     </w:rPr>
   </w:style>
@@ -2269,52 +3055,58 @@
     <w:name w:val="heading 3"/>
     <w:basedOn w:val="Normal"/>
     <w:next w:val="BodyText"/>
+    <w:link w:val="Heading3Char"/>
+    <w:autoRedefine/>
     <w:uiPriority w:val="9"/>
     <w:unhideWhenUsed/>
     <w:qFormat/>
-    <w:rsid w:val="00B459E7"/>
+    <w:rsid w:val="00AE3F74"/>
     <w:pPr>
       <w:keepNext/>
       <w:keepLines/>
-      <w:spacing w:before="120" w:after="0"/>
+      <w:spacing w:before="160" w:after="0"/>
       <w:outlineLvl w:val="2"/>
     </w:pPr>
     <w:rPr>
-      <w:rFonts w:asciiTheme="majorHAnsi" w:eastAsiaTheme="majorEastAsia" w:hAnsiTheme="majorHAnsi" w:cstheme="majorBidi"/>
+      <w:rFonts w:eastAsiaTheme="majorEastAsia" w:cstheme="majorBidi"/>
       <w:b/>
       <w:bCs/>
-      <w:color w:val="4F81BD" w:themeColor="accent1"/>
+      <w:color w:val="000000" w:themeColor="text1"/>
     </w:rPr>
   </w:style>
   <w:style w:type="paragraph" w:styleId="Heading4">
     <w:name w:val="heading 4"/>
     <w:basedOn w:val="Normal"/>
     <w:next w:val="BodyText"/>
+    <w:link w:val="Heading4Char"/>
+    <w:autoRedefine/>
     <w:uiPriority w:val="9"/>
     <w:unhideWhenUsed/>
     <w:qFormat/>
-    <w:rsid w:val="00C550E5"/>
+    <w:rsid w:val="00AE3F74"/>
     <w:pPr>
       <w:keepNext/>
       <w:keepLines/>
-      <w:spacing w:after="0"/>
-      <w:ind w:firstLine="360"/>
+      <w:spacing w:before="80" w:after="0"/>
+      <w:ind w:left="288"/>
       <w:outlineLvl w:val="3"/>
     </w:pPr>
     <w:rPr>
-      <w:rFonts w:asciiTheme="majorHAnsi" w:eastAsiaTheme="majorEastAsia" w:hAnsiTheme="majorHAnsi" w:cstheme="majorBidi"/>
+      <w:rFonts w:eastAsiaTheme="majorEastAsia" w:cstheme="majorBidi"/>
+      <w:b/>
       <w:bCs/>
-      <w:i/>
-      <w:color w:val="4F81BD" w:themeColor="accent1"/>
+      <w:color w:val="000000" w:themeColor="text1"/>
     </w:rPr>
   </w:style>
   <w:style w:type="paragraph" w:styleId="Heading5">
     <w:name w:val="heading 5"/>
     <w:basedOn w:val="Normal"/>
     <w:next w:val="BodyText"/>
+    <w:link w:val="Heading5Char"/>
     <w:uiPriority w:val="9"/>
     <w:unhideWhenUsed/>
     <w:qFormat/>
+    <w:rsid w:val="00AE3F74"/>
     <w:pPr>
       <w:keepNext/>
       <w:keepLines/>
@@ -2322,18 +3114,21 @@
       <w:outlineLvl w:val="4"/>
     </w:pPr>
     <w:rPr>
-      <w:rFonts w:asciiTheme="majorHAnsi" w:eastAsiaTheme="majorEastAsia" w:hAnsiTheme="majorHAnsi" w:cstheme="majorBidi"/>
+      <w:rFonts w:eastAsiaTheme="majorEastAsia" w:cstheme="majorBidi"/>
+      <w:b/>
       <w:iCs/>
-      <w:color w:val="4F81BD" w:themeColor="accent1"/>
+      <w:color w:val="000000" w:themeColor="text1"/>
     </w:rPr>
   </w:style>
   <w:style w:type="paragraph" w:styleId="Heading6">
     <w:name w:val="heading 6"/>
     <w:basedOn w:val="Normal"/>
     <w:next w:val="BodyText"/>
+    <w:link w:val="Heading6Char"/>
     <w:uiPriority w:val="9"/>
     <w:unhideWhenUsed/>
     <w:qFormat/>
+    <w:rsid w:val="00AE3F74"/>
     <w:pPr>
       <w:keepNext/>
       <w:keepLines/>
@@ -2342,16 +3137,18 @@
     </w:pPr>
     <w:rPr>
       <w:rFonts w:asciiTheme="majorHAnsi" w:eastAsiaTheme="majorEastAsia" w:hAnsiTheme="majorHAnsi" w:cstheme="majorBidi"/>
-      <w:color w:val="4F81BD" w:themeColor="accent1"/>
+      <w:color w:val="156082" w:themeColor="accent1"/>
     </w:rPr>
   </w:style>
   <w:style w:type="paragraph" w:styleId="Heading7">
     <w:name w:val="heading 7"/>
     <w:basedOn w:val="Normal"/>
     <w:next w:val="BodyText"/>
+    <w:link w:val="Heading7Char"/>
     <w:uiPriority w:val="9"/>
     <w:unhideWhenUsed/>
     <w:qFormat/>
+    <w:rsid w:val="00AE3F74"/>
     <w:pPr>
       <w:keepNext/>
       <w:keepLines/>
@@ -2360,16 +3157,18 @@
     </w:pPr>
     <w:rPr>
       <w:rFonts w:asciiTheme="majorHAnsi" w:eastAsiaTheme="majorEastAsia" w:hAnsiTheme="majorHAnsi" w:cstheme="majorBidi"/>
-      <w:color w:val="4F81BD" w:themeColor="accent1"/>
+      <w:color w:val="156082" w:themeColor="accent1"/>
     </w:rPr>
   </w:style>
   <w:style w:type="paragraph" w:styleId="Heading8">
     <w:name w:val="heading 8"/>
     <w:basedOn w:val="Normal"/>
     <w:next w:val="BodyText"/>
+    <w:link w:val="Heading8Char"/>
     <w:uiPriority w:val="9"/>
     <w:unhideWhenUsed/>
     <w:qFormat/>
+    <w:rsid w:val="00AE3F74"/>
     <w:pPr>
       <w:keepNext/>
       <w:keepLines/>
@@ -2378,16 +3177,18 @@
     </w:pPr>
     <w:rPr>
       <w:rFonts w:asciiTheme="majorHAnsi" w:eastAsiaTheme="majorEastAsia" w:hAnsiTheme="majorHAnsi" w:cstheme="majorBidi"/>
-      <w:color w:val="4F81BD" w:themeColor="accent1"/>
+      <w:color w:val="156082" w:themeColor="accent1"/>
     </w:rPr>
   </w:style>
   <w:style w:type="paragraph" w:styleId="Heading9">
     <w:name w:val="heading 9"/>
     <w:basedOn w:val="Normal"/>
     <w:next w:val="BodyText"/>
+    <w:link w:val="Heading9Char"/>
     <w:uiPriority w:val="9"/>
     <w:unhideWhenUsed/>
     <w:qFormat/>
+    <w:rsid w:val="00AE3F74"/>
     <w:pPr>
       <w:keepNext/>
       <w:keepLines/>
@@ -2396,7 +3197,7 @@
     </w:pPr>
     <w:rPr>
       <w:rFonts w:asciiTheme="majorHAnsi" w:eastAsiaTheme="majorEastAsia" w:hAnsiTheme="majorHAnsi" w:cstheme="majorBidi"/>
-      <w:color w:val="4F81BD" w:themeColor="accent1"/>
+      <w:color w:val="156082" w:themeColor="accent1"/>
     </w:rPr>
   </w:style>
   <w:style w:type="character" w:default="1" w:styleId="DefaultParagraphFont">
@@ -2404,6 +3205,7 @@
     <w:uiPriority w:val="1"/>
     <w:semiHidden/>
     <w:unhideWhenUsed/>
+    <w:rsid w:val="00D146FB"/>
   </w:style>
   <w:style w:type="table" w:default="1" w:styleId="TableNormal">
     <w:name w:val="Normal Table"/>
@@ -2425,90 +3227,411 @@
     <w:uiPriority w:val="99"/>
     <w:semiHidden/>
     <w:unhideWhenUsed/>
+    <w:rsid w:val="00D146FB"/>
+  </w:style>
+  <w:style w:type="character" w:customStyle="1" w:styleId="Heading1Char">
+    <w:name w:val="Heading 1 Char"/>
+    <w:basedOn w:val="DefaultParagraphFont"/>
+    <w:link w:val="Heading1"/>
+    <w:uiPriority w:val="9"/>
+    <w:rsid w:val="00DD6E47"/>
+    <w:rPr>
+      <w:rFonts w:ascii="Noto Sans NKo" w:eastAsiaTheme="majorEastAsia" w:hAnsi="Noto Sans NKo" w:cstheme="majorBidi"/>
+      <w:b/>
+      <w:bCs/>
+      <w:color w:val="000000" w:themeColor="text1"/>
+      <w:kern w:val="0"/>
+      <w:sz w:val="32"/>
+      <w:szCs w:val="32"/>
+      <w:lang w:val="en"/>
+      <w14:ligatures w14:val="none"/>
+    </w:rPr>
+  </w:style>
+  <w:style w:type="character" w:customStyle="1" w:styleId="Heading2Char">
+    <w:name w:val="Heading 2 Char"/>
+    <w:basedOn w:val="DefaultParagraphFont"/>
+    <w:link w:val="Heading2"/>
+    <w:uiPriority w:val="9"/>
+    <w:rsid w:val="00AE3F74"/>
+    <w:rPr>
+      <w:rFonts w:ascii="Noto Sans NKo" w:eastAsiaTheme="majorEastAsia" w:hAnsi="Noto Sans NKo" w:cstheme="majorBidi"/>
+      <w:b/>
+      <w:bCs/>
+      <w:color w:val="000000" w:themeColor="text1"/>
+      <w:kern w:val="0"/>
+      <w:sz w:val="26"/>
+      <w:szCs w:val="28"/>
+      <w:lang w:val="en"/>
+      <w14:ligatures w14:val="none"/>
+    </w:rPr>
+  </w:style>
+  <w:style w:type="character" w:customStyle="1" w:styleId="Heading3Char">
+    <w:name w:val="Heading 3 Char"/>
+    <w:basedOn w:val="DefaultParagraphFont"/>
+    <w:link w:val="Heading3"/>
+    <w:uiPriority w:val="9"/>
+    <w:rsid w:val="00AE3F74"/>
+    <w:rPr>
+      <w:rFonts w:ascii="Noto Sans NKo" w:eastAsiaTheme="majorEastAsia" w:hAnsi="Noto Sans NKo" w:cstheme="majorBidi"/>
+      <w:b/>
+      <w:bCs/>
+      <w:color w:val="000000" w:themeColor="text1"/>
+      <w:kern w:val="0"/>
+      <w:lang w:val="en"/>
+      <w14:ligatures w14:val="none"/>
+    </w:rPr>
+  </w:style>
+  <w:style w:type="character" w:customStyle="1" w:styleId="Heading4Char">
+    <w:name w:val="Heading 4 Char"/>
+    <w:basedOn w:val="DefaultParagraphFont"/>
+    <w:link w:val="Heading4"/>
+    <w:uiPriority w:val="9"/>
+    <w:rsid w:val="00AE3F74"/>
+    <w:rPr>
+      <w:rFonts w:ascii="Noto Sans NKo" w:eastAsiaTheme="majorEastAsia" w:hAnsi="Noto Sans NKo" w:cstheme="majorBidi"/>
+      <w:b/>
+      <w:bCs/>
+      <w:color w:val="000000" w:themeColor="text1"/>
+      <w:kern w:val="0"/>
+      <w:lang w:val="en"/>
+      <w14:ligatures w14:val="none"/>
+    </w:rPr>
+  </w:style>
+  <w:style w:type="character" w:customStyle="1" w:styleId="Heading5Char">
+    <w:name w:val="Heading 5 Char"/>
+    <w:basedOn w:val="DefaultParagraphFont"/>
+    <w:link w:val="Heading5"/>
+    <w:uiPriority w:val="9"/>
+    <w:rsid w:val="00656812"/>
+    <w:rPr>
+      <w:rFonts w:ascii="Noto Sans NKo" w:eastAsiaTheme="majorEastAsia" w:hAnsi="Noto Sans NKo" w:cstheme="majorBidi"/>
+      <w:b/>
+      <w:iCs/>
+      <w:color w:val="000000" w:themeColor="text1"/>
+      <w:kern w:val="0"/>
+      <w:lang w:val="en"/>
+      <w14:ligatures w14:val="none"/>
+    </w:rPr>
+  </w:style>
+  <w:style w:type="character" w:customStyle="1" w:styleId="Heading6Char">
+    <w:name w:val="Heading 6 Char"/>
+    <w:basedOn w:val="DefaultParagraphFont"/>
+    <w:link w:val="Heading6"/>
+    <w:uiPriority w:val="9"/>
+    <w:rsid w:val="00656812"/>
+    <w:rPr>
+      <w:rFonts w:asciiTheme="majorHAnsi" w:eastAsiaTheme="majorEastAsia" w:hAnsiTheme="majorHAnsi" w:cstheme="majorBidi"/>
+      <w:color w:val="156082" w:themeColor="accent1"/>
+      <w:kern w:val="0"/>
+      <w:lang w:val="en"/>
+      <w14:ligatures w14:val="none"/>
+    </w:rPr>
+  </w:style>
+  <w:style w:type="character" w:customStyle="1" w:styleId="Heading7Char">
+    <w:name w:val="Heading 7 Char"/>
+    <w:basedOn w:val="DefaultParagraphFont"/>
+    <w:link w:val="Heading7"/>
+    <w:uiPriority w:val="9"/>
+    <w:rsid w:val="00656812"/>
+    <w:rPr>
+      <w:rFonts w:asciiTheme="majorHAnsi" w:eastAsiaTheme="majorEastAsia" w:hAnsiTheme="majorHAnsi" w:cstheme="majorBidi"/>
+      <w:color w:val="156082" w:themeColor="accent1"/>
+      <w:kern w:val="0"/>
+      <w:lang w:val="en"/>
+      <w14:ligatures w14:val="none"/>
+    </w:rPr>
+  </w:style>
+  <w:style w:type="character" w:customStyle="1" w:styleId="Heading8Char">
+    <w:name w:val="Heading 8 Char"/>
+    <w:basedOn w:val="DefaultParagraphFont"/>
+    <w:link w:val="Heading8"/>
+    <w:uiPriority w:val="9"/>
+    <w:rsid w:val="00656812"/>
+    <w:rPr>
+      <w:rFonts w:asciiTheme="majorHAnsi" w:eastAsiaTheme="majorEastAsia" w:hAnsiTheme="majorHAnsi" w:cstheme="majorBidi"/>
+      <w:color w:val="156082" w:themeColor="accent1"/>
+      <w:kern w:val="0"/>
+      <w:lang w:val="en"/>
+      <w14:ligatures w14:val="none"/>
+    </w:rPr>
+  </w:style>
+  <w:style w:type="character" w:customStyle="1" w:styleId="Heading9Char">
+    <w:name w:val="Heading 9 Char"/>
+    <w:basedOn w:val="DefaultParagraphFont"/>
+    <w:link w:val="Heading9"/>
+    <w:uiPriority w:val="9"/>
+    <w:rsid w:val="00656812"/>
+    <w:rPr>
+      <w:rFonts w:asciiTheme="majorHAnsi" w:eastAsiaTheme="majorEastAsia" w:hAnsiTheme="majorHAnsi" w:cstheme="majorBidi"/>
+      <w:color w:val="156082" w:themeColor="accent1"/>
+      <w:kern w:val="0"/>
+      <w:lang w:val="en"/>
+      <w14:ligatures w14:val="none"/>
+    </w:rPr>
+  </w:style>
+  <w:style w:type="paragraph" w:styleId="Title">
+    <w:name w:val="Title"/>
+    <w:basedOn w:val="Normal"/>
+    <w:next w:val="BodyText"/>
+    <w:link w:val="TitleChar"/>
+    <w:qFormat/>
+    <w:rsid w:val="00AE3F74"/>
+    <w:pPr>
+      <w:keepNext/>
+      <w:keepLines/>
+      <w:spacing w:before="480" w:after="240"/>
+      <w:jc w:val="center"/>
+    </w:pPr>
+    <w:rPr>
+      <w:rFonts w:asciiTheme="majorHAnsi" w:eastAsiaTheme="majorEastAsia" w:hAnsiTheme="majorHAnsi" w:cstheme="majorBidi"/>
+      <w:b/>
+      <w:bCs/>
+      <w:color w:val="000000" w:themeColor="text1"/>
+      <w:sz w:val="36"/>
+      <w:szCs w:val="36"/>
+    </w:rPr>
+  </w:style>
+  <w:style w:type="character" w:customStyle="1" w:styleId="TitleChar">
+    <w:name w:val="Title Char"/>
+    <w:basedOn w:val="DefaultParagraphFont"/>
+    <w:link w:val="Title"/>
+    <w:rsid w:val="00656812"/>
+    <w:rPr>
+      <w:rFonts w:asciiTheme="majorHAnsi" w:eastAsiaTheme="majorEastAsia" w:hAnsiTheme="majorHAnsi" w:cstheme="majorBidi"/>
+      <w:b/>
+      <w:bCs/>
+      <w:color w:val="000000" w:themeColor="text1"/>
+      <w:kern w:val="0"/>
+      <w:sz w:val="36"/>
+      <w:szCs w:val="36"/>
+      <w:lang w:val="en"/>
+      <w14:ligatures w14:val="none"/>
+    </w:rPr>
+  </w:style>
+  <w:style w:type="paragraph" w:styleId="Subtitle">
+    <w:name w:val="Subtitle"/>
+    <w:basedOn w:val="Title"/>
+    <w:next w:val="BodyText"/>
+    <w:link w:val="SubtitleChar"/>
+    <w:qFormat/>
+    <w:rsid w:val="00AE3F74"/>
+    <w:pPr>
+      <w:spacing w:before="240"/>
+    </w:pPr>
+    <w:rPr>
+      <w:sz w:val="30"/>
+      <w:szCs w:val="30"/>
+    </w:rPr>
+  </w:style>
+  <w:style w:type="character" w:customStyle="1" w:styleId="SubtitleChar">
+    <w:name w:val="Subtitle Char"/>
+    <w:basedOn w:val="DefaultParagraphFont"/>
+    <w:link w:val="Subtitle"/>
+    <w:rsid w:val="00656812"/>
+    <w:rPr>
+      <w:rFonts w:asciiTheme="majorHAnsi" w:eastAsiaTheme="majorEastAsia" w:hAnsiTheme="majorHAnsi" w:cstheme="majorBidi"/>
+      <w:b/>
+      <w:bCs/>
+      <w:color w:val="000000" w:themeColor="text1"/>
+      <w:kern w:val="0"/>
+      <w:sz w:val="30"/>
+      <w:szCs w:val="30"/>
+      <w:lang w:val="en"/>
+      <w14:ligatures w14:val="none"/>
+    </w:rPr>
+  </w:style>
+  <w:style w:type="paragraph" w:styleId="Quote">
+    <w:name w:val="Quote"/>
+    <w:basedOn w:val="Normal"/>
+    <w:next w:val="Normal"/>
+    <w:link w:val="QuoteChar"/>
+    <w:uiPriority w:val="29"/>
+    <w:qFormat/>
+    <w:rsid w:val="00656812"/>
+    <w:pPr>
+      <w:spacing w:before="160"/>
+      <w:jc w:val="center"/>
+    </w:pPr>
+    <w:rPr>
+      <w:i/>
+      <w:iCs/>
+      <w:color w:val="404040" w:themeColor="text1" w:themeTint="BF"/>
+    </w:rPr>
+  </w:style>
+  <w:style w:type="character" w:customStyle="1" w:styleId="QuoteChar">
+    <w:name w:val="Quote Char"/>
+    <w:basedOn w:val="DefaultParagraphFont"/>
+    <w:link w:val="Quote"/>
+    <w:uiPriority w:val="29"/>
+    <w:rsid w:val="00656812"/>
+    <w:rPr>
+      <w:i/>
+      <w:iCs/>
+      <w:color w:val="404040" w:themeColor="text1" w:themeTint="BF"/>
+    </w:rPr>
+  </w:style>
+  <w:style w:type="paragraph" w:styleId="ListParagraph">
+    <w:name w:val="List Paragraph"/>
+    <w:basedOn w:val="Normal"/>
+    <w:uiPriority w:val="34"/>
+    <w:qFormat/>
+    <w:rsid w:val="00656812"/>
+    <w:pPr>
+      <w:ind w:left="720"/>
+      <w:contextualSpacing/>
+    </w:pPr>
+  </w:style>
+  <w:style w:type="character" w:styleId="IntenseEmphasis">
+    <w:name w:val="Intense Emphasis"/>
+    <w:basedOn w:val="DefaultParagraphFont"/>
+    <w:uiPriority w:val="21"/>
+    <w:qFormat/>
+    <w:rsid w:val="00656812"/>
+    <w:rPr>
+      <w:i/>
+      <w:iCs/>
+      <w:color w:val="0F4761" w:themeColor="accent1" w:themeShade="BF"/>
+    </w:rPr>
+  </w:style>
+  <w:style w:type="paragraph" w:styleId="IntenseQuote">
+    <w:name w:val="Intense Quote"/>
+    <w:basedOn w:val="Normal"/>
+    <w:next w:val="Normal"/>
+    <w:link w:val="IntenseQuoteChar"/>
+    <w:uiPriority w:val="30"/>
+    <w:qFormat/>
+    <w:rsid w:val="00656812"/>
+    <w:pPr>
+      <w:pBdr>
+        <w:top w:val="single" w:sz="4" w:space="10" w:color="0F4761" w:themeColor="accent1" w:themeShade="BF"/>
+        <w:bottom w:val="single" w:sz="4" w:space="10" w:color="0F4761" w:themeColor="accent1" w:themeShade="BF"/>
+      </w:pBdr>
+      <w:spacing w:before="360" w:after="360"/>
+      <w:ind w:left="864" w:right="864"/>
+      <w:jc w:val="center"/>
+    </w:pPr>
+    <w:rPr>
+      <w:i/>
+      <w:iCs/>
+      <w:color w:val="0F4761" w:themeColor="accent1" w:themeShade="BF"/>
+    </w:rPr>
+  </w:style>
+  <w:style w:type="character" w:customStyle="1" w:styleId="IntenseQuoteChar">
+    <w:name w:val="Intense Quote Char"/>
+    <w:basedOn w:val="DefaultParagraphFont"/>
+    <w:link w:val="IntenseQuote"/>
+    <w:uiPriority w:val="30"/>
+    <w:rsid w:val="00656812"/>
+    <w:rPr>
+      <w:i/>
+      <w:iCs/>
+      <w:color w:val="0F4761" w:themeColor="accent1" w:themeShade="BF"/>
+    </w:rPr>
+  </w:style>
+  <w:style w:type="character" w:styleId="IntenseReference">
+    <w:name w:val="Intense Reference"/>
+    <w:basedOn w:val="DefaultParagraphFont"/>
+    <w:uiPriority w:val="32"/>
+    <w:qFormat/>
+    <w:rsid w:val="00656812"/>
+    <w:rPr>
+      <w:b/>
+      <w:bCs/>
+      <w:smallCaps/>
+      <w:color w:val="0F4761" w:themeColor="accent1" w:themeShade="BF"/>
+      <w:spacing w:val="5"/>
+    </w:rPr>
   </w:style>
   <w:style w:type="paragraph" w:styleId="BodyText">
     <w:name w:val="Body Text"/>
     <w:basedOn w:val="Normal"/>
     <w:link w:val="BodyTextChar"/>
     <w:qFormat/>
-    <w:rsid w:val="00B459E7"/>
-    <w:pPr>
-      <w:spacing w:after="120"/>
+    <w:rsid w:val="00AE3F74"/>
+    <w:pPr>
       <w:ind w:firstLine="360"/>
     </w:pPr>
+  </w:style>
+  <w:style w:type="character" w:customStyle="1" w:styleId="BodyTextChar">
+    <w:name w:val="Body Text Char"/>
+    <w:basedOn w:val="DefaultParagraphFont"/>
+    <w:link w:val="BodyText"/>
+    <w:rsid w:val="00AE3F74"/>
+    <w:rPr>
+      <w:rFonts w:ascii="Noto Sans NKo" w:hAnsi="Noto Sans NKo"/>
+      <w:kern w:val="0"/>
+      <w:lang w:val="en"/>
+      <w14:ligatures w14:val="none"/>
+    </w:rPr>
   </w:style>
   <w:style w:type="paragraph" w:customStyle="1" w:styleId="FirstParagraph">
     <w:name w:val="First Paragraph"/>
     <w:basedOn w:val="BodyText"/>
     <w:next w:val="BodyText"/>
     <w:qFormat/>
+    <w:rsid w:val="00AE3F74"/>
   </w:style>
   <w:style w:type="paragraph" w:customStyle="1" w:styleId="Compact">
     <w:name w:val="Compact"/>
     <w:basedOn w:val="BodyText"/>
     <w:qFormat/>
+    <w:rsid w:val="00AE3F74"/>
     <w:pPr>
       <w:spacing w:before="36" w:after="36"/>
     </w:pPr>
-  </w:style>
-  <w:style w:type="paragraph" w:styleId="Title">
-    <w:name w:val="Title"/>
-    <w:basedOn w:val="Normal"/>
-    <w:next w:val="BodyText"/>
-    <w:qFormat/>
-    <w:pPr>
-      <w:keepNext/>
-      <w:keepLines/>
-      <w:spacing w:before="480" w:after="240"/>
-      <w:jc w:val="center"/>
-    </w:pPr>
-    <w:rPr>
-      <w:rFonts w:asciiTheme="majorHAnsi" w:eastAsiaTheme="majorEastAsia" w:hAnsiTheme="majorHAnsi" w:cstheme="majorBidi"/>
-      <w:b/>
-      <w:bCs/>
-      <w:color w:val="345A8A" w:themeColor="accent1" w:themeShade="B5"/>
-      <w:sz w:val="36"/>
-      <w:szCs w:val="36"/>
-    </w:rPr>
-  </w:style>
-  <w:style w:type="paragraph" w:styleId="Subtitle">
-    <w:name w:val="Subtitle"/>
-    <w:basedOn w:val="Title"/>
-    <w:next w:val="BodyText"/>
-    <w:qFormat/>
-    <w:pPr>
-      <w:spacing w:before="240"/>
-    </w:pPr>
-    <w:rPr>
-      <w:sz w:val="30"/>
-      <w:szCs w:val="30"/>
-    </w:rPr>
   </w:style>
   <w:style w:type="paragraph" w:customStyle="1" w:styleId="Author">
     <w:name w:val="Author"/>
     <w:next w:val="BodyText"/>
     <w:qFormat/>
+    <w:rsid w:val="00AE3F74"/>
     <w:pPr>
       <w:keepNext/>
       <w:keepLines/>
+      <w:spacing w:after="200" w:line="240" w:lineRule="auto"/>
       <w:jc w:val="center"/>
     </w:pPr>
+    <w:rPr>
+      <w:kern w:val="0"/>
+      <w:lang w:val="en"/>
+      <w14:ligatures w14:val="none"/>
+    </w:rPr>
   </w:style>
   <w:style w:type="paragraph" w:styleId="Date">
     <w:name w:val="Date"/>
     <w:next w:val="BodyText"/>
+    <w:link w:val="DateChar"/>
     <w:qFormat/>
+    <w:rsid w:val="00AE3F74"/>
     <w:pPr>
       <w:keepNext/>
       <w:keepLines/>
+      <w:spacing w:after="200" w:line="240" w:lineRule="auto"/>
       <w:jc w:val="center"/>
     </w:pPr>
+    <w:rPr>
+      <w:kern w:val="0"/>
+      <w:lang w:val="en"/>
+      <w14:ligatures w14:val="none"/>
+    </w:rPr>
+  </w:style>
+  <w:style w:type="character" w:customStyle="1" w:styleId="DateChar">
+    <w:name w:val="Date Char"/>
+    <w:basedOn w:val="DefaultParagraphFont"/>
+    <w:link w:val="Date"/>
+    <w:rsid w:val="00656812"/>
+    <w:rPr>
+      <w:kern w:val="0"/>
+      <w:lang w:val="en"/>
+      <w14:ligatures w14:val="none"/>
+    </w:rPr>
   </w:style>
   <w:style w:type="paragraph" w:customStyle="1" w:styleId="Abstract">
     <w:name w:val="Abstract"/>
     <w:basedOn w:val="Normal"/>
     <w:next w:val="BodyText"/>
     <w:qFormat/>
+    <w:rsid w:val="00AE3F74"/>
     <w:pPr>
       <w:keepNext/>
       <w:keepLines/>
@@ -2523,6 +3646,7 @@
     <w:name w:val="Bibliography"/>
     <w:basedOn w:val="Normal"/>
     <w:qFormat/>
+    <w:rsid w:val="00AE3F74"/>
   </w:style>
   <w:style w:type="paragraph" w:styleId="BlockText">
     <w:name w:val="Block Text"/>
@@ -2531,6 +3655,7 @@
     <w:uiPriority w:val="9"/>
     <w:unhideWhenUsed/>
     <w:qFormat/>
+    <w:rsid w:val="00AE3F74"/>
     <w:pPr>
       <w:spacing w:before="100" w:after="100"/>
       <w:ind w:left="480" w:right="480" w:firstLine="0"/>
@@ -2539,15 +3664,41 @@
   <w:style w:type="paragraph" w:styleId="FootnoteText">
     <w:name w:val="footnote text"/>
     <w:basedOn w:val="Normal"/>
+    <w:link w:val="FootnoteTextChar"/>
     <w:uiPriority w:val="9"/>
     <w:unhideWhenUsed/>
     <w:qFormat/>
+    <w:rsid w:val="00AE3F74"/>
+  </w:style>
+  <w:style w:type="character" w:customStyle="1" w:styleId="FootnoteTextChar">
+    <w:name w:val="Footnote Text Char"/>
+    <w:basedOn w:val="DefaultParagraphFont"/>
+    <w:link w:val="FootnoteText"/>
+    <w:uiPriority w:val="9"/>
+    <w:rsid w:val="00656812"/>
+    <w:rPr>
+      <w:rFonts w:ascii="Noto Sans NKo" w:hAnsi="Noto Sans NKo"/>
+      <w:kern w:val="0"/>
+      <w:lang w:val="en"/>
+      <w14:ligatures w14:val="none"/>
+    </w:rPr>
   </w:style>
   <w:style w:type="table" w:customStyle="1" w:styleId="Table">
     <w:name w:val="Table"/>
     <w:semiHidden/>
     <w:unhideWhenUsed/>
     <w:qFormat/>
+    <w:rsid w:val="00AE3F74"/>
+    <w:pPr>
+      <w:spacing w:after="200" w:line="240" w:lineRule="auto"/>
+    </w:pPr>
+    <w:rPr>
+      <w:kern w:val="0"/>
+      <w:sz w:val="20"/>
+      <w:szCs w:val="20"/>
+      <w:lang w:val="en"/>
+      <w14:ligatures w14:val="none"/>
+    </w:rPr>
     <w:tblPr>
       <w:tblInd w:w="0" w:type="dxa"/>
       <w:tblCellMar>
@@ -2576,6 +3727,7 @@
     <w:name w:val="Definition Term"/>
     <w:basedOn w:val="Normal"/>
     <w:next w:val="Definition"/>
+    <w:rsid w:val="00AE3F74"/>
     <w:pPr>
       <w:keepNext/>
       <w:keepLines/>
@@ -2588,14 +3740,13 @@
   <w:style w:type="paragraph" w:customStyle="1" w:styleId="Definition">
     <w:name w:val="Definition"/>
     <w:basedOn w:val="Normal"/>
+    <w:rsid w:val="00AE3F74"/>
   </w:style>
   <w:style w:type="paragraph" w:styleId="Caption">
     <w:name w:val="caption"/>
     <w:basedOn w:val="Normal"/>
     <w:link w:val="CaptionChar"/>
-    <w:pPr>
-      <w:spacing w:after="120"/>
-    </w:pPr>
+    <w:rsid w:val="00AE3F74"/>
     <w:rPr>
       <w:i/>
     </w:rPr>
@@ -2603,6 +3754,7 @@
   <w:style w:type="paragraph" w:customStyle="1" w:styleId="TableCaption">
     <w:name w:val="Table Caption"/>
     <w:basedOn w:val="Caption"/>
+    <w:rsid w:val="00AE3F74"/>
     <w:pPr>
       <w:keepNext/>
     </w:pPr>
@@ -2610,14 +3762,17 @@
   <w:style w:type="paragraph" w:customStyle="1" w:styleId="ImageCaption">
     <w:name w:val="Image Caption"/>
     <w:basedOn w:val="Caption"/>
+    <w:rsid w:val="00AE3F74"/>
   </w:style>
   <w:style w:type="paragraph" w:customStyle="1" w:styleId="Figure">
     <w:name w:val="Figure"/>
     <w:basedOn w:val="Normal"/>
+    <w:rsid w:val="00AE3F74"/>
   </w:style>
   <w:style w:type="paragraph" w:customStyle="1" w:styleId="CaptionedFigure">
     <w:name w:val="Captioned Figure"/>
     <w:basedOn w:val="Figure"/>
+    <w:rsid w:val="00AE3F74"/>
     <w:pPr>
       <w:keepNext/>
     </w:pPr>
@@ -2626,346 +3781,533 @@
     <w:name w:val="Caption Char"/>
     <w:basedOn w:val="DefaultParagraphFont"/>
     <w:link w:val="Caption"/>
+    <w:rsid w:val="00AE3F74"/>
+    <w:rPr>
+      <w:rFonts w:ascii="Noto Sans NKo" w:hAnsi="Noto Sans NKo"/>
+      <w:i/>
+      <w:kern w:val="0"/>
+      <w:lang w:val="en"/>
+      <w14:ligatures w14:val="none"/>
+    </w:rPr>
   </w:style>
   <w:style w:type="character" w:customStyle="1" w:styleId="VerbatimChar">
     <w:name w:val="Verbatim Char"/>
     <w:basedOn w:val="CaptionChar"/>
     <w:link w:val="SourceCode"/>
+    <w:rsid w:val="00AE3F74"/>
     <w:rPr>
       <w:rFonts w:ascii="Consolas" w:hAnsi="Consolas"/>
+      <w:i/>
+      <w:kern w:val="0"/>
       <w:sz w:val="22"/>
+      <w:lang w:val="en"/>
+      <w14:ligatures w14:val="none"/>
     </w:rPr>
   </w:style>
   <w:style w:type="character" w:customStyle="1" w:styleId="SectionNumber">
     <w:name w:val="Section Number"/>
     <w:basedOn w:val="CaptionChar"/>
+    <w:rsid w:val="00AE3F74"/>
+    <w:rPr>
+      <w:rFonts w:ascii="Noto Sans NKo" w:hAnsi="Noto Sans NKo"/>
+      <w:i/>
+      <w:kern w:val="0"/>
+      <w:lang w:val="en"/>
+      <w14:ligatures w14:val="none"/>
+    </w:rPr>
   </w:style>
   <w:style w:type="character" w:styleId="FootnoteReference">
     <w:name w:val="footnote reference"/>
     <w:basedOn w:val="CaptionChar"/>
-    <w:rPr>
+    <w:rsid w:val="00AE3F74"/>
+    <w:rPr>
+      <w:rFonts w:ascii="Noto Sans NKo" w:hAnsi="Noto Sans NKo"/>
+      <w:i/>
+      <w:kern w:val="0"/>
       <w:vertAlign w:val="superscript"/>
+      <w:lang w:val="en"/>
+      <w14:ligatures w14:val="none"/>
     </w:rPr>
   </w:style>
   <w:style w:type="character" w:styleId="Hyperlink">
     <w:name w:val="Hyperlink"/>
     <w:basedOn w:val="CaptionChar"/>
     <w:uiPriority w:val="99"/>
-    <w:rPr>
-      <w:color w:val="4F81BD" w:themeColor="accent1"/>
+    <w:rsid w:val="00AE3F74"/>
+    <w:rPr>
+      <w:rFonts w:ascii="Noto Sans NKo" w:hAnsi="Noto Sans NKo"/>
+      <w:i/>
+      <w:color w:val="156082" w:themeColor="accent1"/>
+      <w:kern w:val="0"/>
+      <w:lang w:val="en"/>
+      <w14:ligatures w14:val="none"/>
     </w:rPr>
   </w:style>
   <w:style w:type="paragraph" w:styleId="TOCHeading">
     <w:name w:val="TOC Heading"/>
     <w:basedOn w:val="Heading1"/>
     <w:next w:val="BodyText"/>
+    <w:autoRedefine/>
     <w:uiPriority w:val="39"/>
     <w:unhideWhenUsed/>
     <w:qFormat/>
-    <w:pPr>
-      <w:spacing w:before="240" w:line="259" w:lineRule="auto"/>
+    <w:rsid w:val="00AE3F74"/>
+    <w:pPr>
+      <w:spacing w:before="240"/>
       <w:outlineLvl w:val="9"/>
     </w:pPr>
     <w:rPr>
-      <w:b w:val="0"/>
       <w:bCs w:val="0"/>
-      <w:color w:val="365F91" w:themeColor="accent1" w:themeShade="BF"/>
     </w:rPr>
   </w:style>
   <w:style w:type="paragraph" w:customStyle="1" w:styleId="SourceCode">
     <w:name w:val="Source Code"/>
     <w:basedOn w:val="Normal"/>
     <w:link w:val="VerbatimChar"/>
+    <w:rsid w:val="00AE3F74"/>
     <w:pPr>
       <w:wordWrap w:val="0"/>
     </w:pPr>
+    <w:rPr>
+      <w:rFonts w:ascii="Consolas" w:hAnsi="Consolas"/>
+      <w:i/>
+    </w:rPr>
   </w:style>
   <w:style w:type="character" w:customStyle="1" w:styleId="KeywordTok">
     <w:name w:val="KeywordTok"/>
     <w:basedOn w:val="VerbatimChar"/>
+    <w:rsid w:val="00AE3F74"/>
     <w:rPr>
       <w:rFonts w:ascii="Consolas" w:hAnsi="Consolas"/>
       <w:b/>
+      <w:i/>
       <w:color w:val="007020"/>
+      <w:kern w:val="0"/>
       <w:sz w:val="22"/>
+      <w:lang w:val="en"/>
+      <w14:ligatures w14:val="none"/>
     </w:rPr>
   </w:style>
   <w:style w:type="character" w:customStyle="1" w:styleId="DataTypeTok">
     <w:name w:val="DataTypeTok"/>
     <w:basedOn w:val="VerbatimChar"/>
+    <w:rsid w:val="00AE3F74"/>
     <w:rPr>
       <w:rFonts w:ascii="Consolas" w:hAnsi="Consolas"/>
+      <w:i/>
       <w:color w:val="902000"/>
+      <w:kern w:val="0"/>
       <w:sz w:val="22"/>
+      <w:lang w:val="en"/>
+      <w14:ligatures w14:val="none"/>
     </w:rPr>
   </w:style>
   <w:style w:type="character" w:customStyle="1" w:styleId="DecValTok">
     <w:name w:val="DecValTok"/>
     <w:basedOn w:val="VerbatimChar"/>
+    <w:rsid w:val="00AE3F74"/>
     <w:rPr>
       <w:rFonts w:ascii="Consolas" w:hAnsi="Consolas"/>
+      <w:i/>
       <w:color w:val="40A070"/>
+      <w:kern w:val="0"/>
       <w:sz w:val="22"/>
+      <w:lang w:val="en"/>
+      <w14:ligatures w14:val="none"/>
     </w:rPr>
   </w:style>
   <w:style w:type="character" w:customStyle="1" w:styleId="BaseNTok">
     <w:name w:val="BaseNTok"/>
     <w:basedOn w:val="VerbatimChar"/>
+    <w:rsid w:val="00AE3F74"/>
     <w:rPr>
       <w:rFonts w:ascii="Consolas" w:hAnsi="Consolas"/>
+      <w:i/>
       <w:color w:val="40A070"/>
+      <w:kern w:val="0"/>
       <w:sz w:val="22"/>
+      <w:lang w:val="en"/>
+      <w14:ligatures w14:val="none"/>
     </w:rPr>
   </w:style>
   <w:style w:type="character" w:customStyle="1" w:styleId="FloatTok">
     <w:name w:val="FloatTok"/>
     <w:basedOn w:val="VerbatimChar"/>
+    <w:rsid w:val="00AE3F74"/>
     <w:rPr>
       <w:rFonts w:ascii="Consolas" w:hAnsi="Consolas"/>
+      <w:i/>
       <w:color w:val="40A070"/>
+      <w:kern w:val="0"/>
       <w:sz w:val="22"/>
+      <w:lang w:val="en"/>
+      <w14:ligatures w14:val="none"/>
     </w:rPr>
   </w:style>
   <w:style w:type="character" w:customStyle="1" w:styleId="ConstantTok">
     <w:name w:val="ConstantTok"/>
     <w:basedOn w:val="VerbatimChar"/>
+    <w:rsid w:val="00AE3F74"/>
     <w:rPr>
       <w:rFonts w:ascii="Consolas" w:hAnsi="Consolas"/>
+      <w:i/>
       <w:color w:val="880000"/>
+      <w:kern w:val="0"/>
       <w:sz w:val="22"/>
+      <w:lang w:val="en"/>
+      <w14:ligatures w14:val="none"/>
     </w:rPr>
   </w:style>
   <w:style w:type="character" w:customStyle="1" w:styleId="CharTok">
     <w:name w:val="CharTok"/>
     <w:basedOn w:val="VerbatimChar"/>
+    <w:rsid w:val="00AE3F74"/>
     <w:rPr>
       <w:rFonts w:ascii="Consolas" w:hAnsi="Consolas"/>
+      <w:i/>
       <w:color w:val="4070A0"/>
+      <w:kern w:val="0"/>
       <w:sz w:val="22"/>
+      <w:lang w:val="en"/>
+      <w14:ligatures w14:val="none"/>
     </w:rPr>
   </w:style>
   <w:style w:type="character" w:customStyle="1" w:styleId="SpecialCharTok">
     <w:name w:val="SpecialCharTok"/>
     <w:basedOn w:val="VerbatimChar"/>
+    <w:rsid w:val="00AE3F74"/>
     <w:rPr>
       <w:rFonts w:ascii="Consolas" w:hAnsi="Consolas"/>
+      <w:i/>
       <w:color w:val="4070A0"/>
+      <w:kern w:val="0"/>
       <w:sz w:val="22"/>
+      <w:lang w:val="en"/>
+      <w14:ligatures w14:val="none"/>
     </w:rPr>
   </w:style>
   <w:style w:type="character" w:customStyle="1" w:styleId="StringTok">
     <w:name w:val="StringTok"/>
     <w:basedOn w:val="VerbatimChar"/>
+    <w:rsid w:val="00AE3F74"/>
     <w:rPr>
       <w:rFonts w:ascii="Consolas" w:hAnsi="Consolas"/>
+      <w:i/>
       <w:color w:val="4070A0"/>
+      <w:kern w:val="0"/>
       <w:sz w:val="22"/>
+      <w:lang w:val="en"/>
+      <w14:ligatures w14:val="none"/>
     </w:rPr>
   </w:style>
   <w:style w:type="character" w:customStyle="1" w:styleId="VerbatimStringTok">
     <w:name w:val="VerbatimStringTok"/>
     <w:basedOn w:val="VerbatimChar"/>
+    <w:rsid w:val="00AE3F74"/>
     <w:rPr>
       <w:rFonts w:ascii="Consolas" w:hAnsi="Consolas"/>
+      <w:i/>
       <w:color w:val="4070A0"/>
+      <w:kern w:val="0"/>
       <w:sz w:val="22"/>
+      <w:lang w:val="en"/>
+      <w14:ligatures w14:val="none"/>
     </w:rPr>
   </w:style>
   <w:style w:type="character" w:customStyle="1" w:styleId="SpecialStringTok">
     <w:name w:val="SpecialStringTok"/>
     <w:basedOn w:val="VerbatimChar"/>
+    <w:rsid w:val="00AE3F74"/>
     <w:rPr>
       <w:rFonts w:ascii="Consolas" w:hAnsi="Consolas"/>
+      <w:i/>
       <w:color w:val="BB6688"/>
+      <w:kern w:val="0"/>
       <w:sz w:val="22"/>
+      <w:lang w:val="en"/>
+      <w14:ligatures w14:val="none"/>
     </w:rPr>
   </w:style>
   <w:style w:type="character" w:customStyle="1" w:styleId="ImportTok">
     <w:name w:val="ImportTok"/>
     <w:basedOn w:val="VerbatimChar"/>
+    <w:rsid w:val="00AE3F74"/>
     <w:rPr>
       <w:rFonts w:ascii="Consolas" w:hAnsi="Consolas"/>
+      <w:i/>
+      <w:kern w:val="0"/>
       <w:sz w:val="22"/>
+      <w:lang w:val="en"/>
+      <w14:ligatures w14:val="none"/>
     </w:rPr>
   </w:style>
   <w:style w:type="character" w:customStyle="1" w:styleId="CommentTok">
     <w:name w:val="CommentTok"/>
     <w:basedOn w:val="VerbatimChar"/>
+    <w:rsid w:val="00AE3F74"/>
     <w:rPr>
       <w:rFonts w:ascii="Consolas" w:hAnsi="Consolas"/>
-      <w:i/>
+      <w:i w:val="0"/>
       <w:color w:val="60A0B0"/>
+      <w:kern w:val="0"/>
       <w:sz w:val="22"/>
+      <w:lang w:val="en"/>
+      <w14:ligatures w14:val="none"/>
     </w:rPr>
   </w:style>
   <w:style w:type="character" w:customStyle="1" w:styleId="DocumentationTok">
     <w:name w:val="DocumentationTok"/>
     <w:basedOn w:val="VerbatimChar"/>
+    <w:rsid w:val="00AE3F74"/>
     <w:rPr>
       <w:rFonts w:ascii="Consolas" w:hAnsi="Consolas"/>
-      <w:i/>
+      <w:i w:val="0"/>
       <w:color w:val="BA2121"/>
+      <w:kern w:val="0"/>
       <w:sz w:val="22"/>
+      <w:lang w:val="en"/>
+      <w14:ligatures w14:val="none"/>
     </w:rPr>
   </w:style>
   <w:style w:type="character" w:customStyle="1" w:styleId="AnnotationTok">
     <w:name w:val="AnnotationTok"/>
     <w:basedOn w:val="VerbatimChar"/>
+    <w:rsid w:val="00AE3F74"/>
+    <w:rPr>
+      <w:rFonts w:ascii="Consolas" w:hAnsi="Consolas"/>
+      <w:b/>
+      <w:i w:val="0"/>
+      <w:color w:val="60A0B0"/>
+      <w:kern w:val="0"/>
+      <w:sz w:val="22"/>
+      <w:lang w:val="en"/>
+      <w14:ligatures w14:val="none"/>
+    </w:rPr>
+  </w:style>
+  <w:style w:type="character" w:customStyle="1" w:styleId="CommentVarTok">
+    <w:name w:val="CommentVarTok"/>
+    <w:basedOn w:val="VerbatimChar"/>
+    <w:rsid w:val="00AE3F74"/>
+    <w:rPr>
+      <w:rFonts w:ascii="Consolas" w:hAnsi="Consolas"/>
+      <w:b/>
+      <w:i w:val="0"/>
+      <w:color w:val="60A0B0"/>
+      <w:kern w:val="0"/>
+      <w:sz w:val="22"/>
+      <w:lang w:val="en"/>
+      <w14:ligatures w14:val="none"/>
+    </w:rPr>
+  </w:style>
+  <w:style w:type="character" w:customStyle="1" w:styleId="OtherTok">
+    <w:name w:val="OtherTok"/>
+    <w:basedOn w:val="VerbatimChar"/>
+    <w:rsid w:val="00AE3F74"/>
+    <w:rPr>
+      <w:rFonts w:ascii="Consolas" w:hAnsi="Consolas"/>
+      <w:i/>
+      <w:color w:val="007020"/>
+      <w:kern w:val="0"/>
+      <w:sz w:val="22"/>
+      <w:lang w:val="en"/>
+      <w14:ligatures w14:val="none"/>
+    </w:rPr>
+  </w:style>
+  <w:style w:type="character" w:customStyle="1" w:styleId="FunctionTok">
+    <w:name w:val="FunctionTok"/>
+    <w:basedOn w:val="VerbatimChar"/>
+    <w:rsid w:val="00AE3F74"/>
+    <w:rPr>
+      <w:rFonts w:ascii="Consolas" w:hAnsi="Consolas"/>
+      <w:i/>
+      <w:color w:val="06287E"/>
+      <w:kern w:val="0"/>
+      <w:sz w:val="22"/>
+      <w:lang w:val="en"/>
+      <w14:ligatures w14:val="none"/>
+    </w:rPr>
+  </w:style>
+  <w:style w:type="character" w:customStyle="1" w:styleId="VariableTok">
+    <w:name w:val="VariableTok"/>
+    <w:basedOn w:val="VerbatimChar"/>
+    <w:rsid w:val="00AE3F74"/>
+    <w:rPr>
+      <w:rFonts w:ascii="Consolas" w:hAnsi="Consolas"/>
+      <w:i/>
+      <w:color w:val="19177C"/>
+      <w:kern w:val="0"/>
+      <w:sz w:val="22"/>
+      <w:lang w:val="en"/>
+      <w14:ligatures w14:val="none"/>
+    </w:rPr>
+  </w:style>
+  <w:style w:type="character" w:customStyle="1" w:styleId="ControlFlowTok">
+    <w:name w:val="ControlFlowTok"/>
+    <w:basedOn w:val="VerbatimChar"/>
+    <w:rsid w:val="00AE3F74"/>
     <w:rPr>
       <w:rFonts w:ascii="Consolas" w:hAnsi="Consolas"/>
       <w:b/>
       <w:i/>
+      <w:color w:val="007020"/>
+      <w:kern w:val="0"/>
+      <w:sz w:val="22"/>
+      <w:lang w:val="en"/>
+      <w14:ligatures w14:val="none"/>
+    </w:rPr>
+  </w:style>
+  <w:style w:type="character" w:customStyle="1" w:styleId="OperatorTok">
+    <w:name w:val="OperatorTok"/>
+    <w:basedOn w:val="VerbatimChar"/>
+    <w:rsid w:val="00AE3F74"/>
+    <w:rPr>
+      <w:rFonts w:ascii="Consolas" w:hAnsi="Consolas"/>
+      <w:i/>
+      <w:color w:val="666666"/>
+      <w:kern w:val="0"/>
+      <w:sz w:val="22"/>
+      <w:lang w:val="en"/>
+      <w14:ligatures w14:val="none"/>
+    </w:rPr>
+  </w:style>
+  <w:style w:type="character" w:customStyle="1" w:styleId="BuiltInTok">
+    <w:name w:val="BuiltInTok"/>
+    <w:basedOn w:val="VerbatimChar"/>
+    <w:rsid w:val="00AE3F74"/>
+    <w:rPr>
+      <w:rFonts w:ascii="Consolas" w:hAnsi="Consolas"/>
+      <w:i/>
+      <w:kern w:val="0"/>
+      <w:sz w:val="22"/>
+      <w:lang w:val="en"/>
+      <w14:ligatures w14:val="none"/>
+    </w:rPr>
+  </w:style>
+  <w:style w:type="character" w:customStyle="1" w:styleId="ExtensionTok">
+    <w:name w:val="ExtensionTok"/>
+    <w:basedOn w:val="VerbatimChar"/>
+    <w:rsid w:val="00AE3F74"/>
+    <w:rPr>
+      <w:rFonts w:ascii="Consolas" w:hAnsi="Consolas"/>
+      <w:i/>
+      <w:kern w:val="0"/>
+      <w:sz w:val="22"/>
+      <w:lang w:val="en"/>
+      <w14:ligatures w14:val="none"/>
+    </w:rPr>
+  </w:style>
+  <w:style w:type="character" w:customStyle="1" w:styleId="PreprocessorTok">
+    <w:name w:val="PreprocessorTok"/>
+    <w:basedOn w:val="VerbatimChar"/>
+    <w:rsid w:val="00AE3F74"/>
+    <w:rPr>
+      <w:rFonts w:ascii="Consolas" w:hAnsi="Consolas"/>
+      <w:i/>
+      <w:color w:val="BC7A00"/>
+      <w:kern w:val="0"/>
+      <w:sz w:val="22"/>
+      <w:lang w:val="en"/>
+      <w14:ligatures w14:val="none"/>
+    </w:rPr>
+  </w:style>
+  <w:style w:type="character" w:customStyle="1" w:styleId="AttributeTok">
+    <w:name w:val="AttributeTok"/>
+    <w:basedOn w:val="VerbatimChar"/>
+    <w:rsid w:val="00AE3F74"/>
+    <w:rPr>
+      <w:rFonts w:ascii="Consolas" w:hAnsi="Consolas"/>
+      <w:i/>
+      <w:color w:val="7D9029"/>
+      <w:kern w:val="0"/>
+      <w:sz w:val="22"/>
+      <w:lang w:val="en"/>
+      <w14:ligatures w14:val="none"/>
+    </w:rPr>
+  </w:style>
+  <w:style w:type="character" w:customStyle="1" w:styleId="RegionMarkerTok">
+    <w:name w:val="RegionMarkerTok"/>
+    <w:basedOn w:val="VerbatimChar"/>
+    <w:rsid w:val="00AE3F74"/>
+    <w:rPr>
+      <w:rFonts w:ascii="Consolas" w:hAnsi="Consolas"/>
+      <w:i/>
+      <w:kern w:val="0"/>
+      <w:sz w:val="22"/>
+      <w:lang w:val="en"/>
+      <w14:ligatures w14:val="none"/>
+    </w:rPr>
+  </w:style>
+  <w:style w:type="character" w:customStyle="1" w:styleId="InformationTok">
+    <w:name w:val="InformationTok"/>
+    <w:basedOn w:val="VerbatimChar"/>
+    <w:rsid w:val="00AE3F74"/>
+    <w:rPr>
+      <w:rFonts w:ascii="Consolas" w:hAnsi="Consolas"/>
+      <w:b/>
+      <w:i w:val="0"/>
       <w:color w:val="60A0B0"/>
+      <w:kern w:val="0"/>
       <w:sz w:val="22"/>
-    </w:rPr>
-  </w:style>
-  <w:style w:type="character" w:customStyle="1" w:styleId="CommentVarTok">
-    <w:name w:val="CommentVarTok"/>
+      <w:lang w:val="en"/>
+      <w14:ligatures w14:val="none"/>
+    </w:rPr>
+  </w:style>
+  <w:style w:type="character" w:customStyle="1" w:styleId="WarningTok">
+    <w:name w:val="WarningTok"/>
     <w:basedOn w:val="VerbatimChar"/>
+    <w:rsid w:val="00AE3F74"/>
+    <w:rPr>
+      <w:rFonts w:ascii="Consolas" w:hAnsi="Consolas"/>
+      <w:b/>
+      <w:i w:val="0"/>
+      <w:color w:val="60A0B0"/>
+      <w:kern w:val="0"/>
+      <w:sz w:val="22"/>
+      <w:lang w:val="en"/>
+      <w14:ligatures w14:val="none"/>
+    </w:rPr>
+  </w:style>
+  <w:style w:type="character" w:customStyle="1" w:styleId="AlertTok">
+    <w:name w:val="AlertTok"/>
+    <w:basedOn w:val="VerbatimChar"/>
+    <w:rsid w:val="00AE3F74"/>
     <w:rPr>
       <w:rFonts w:ascii="Consolas" w:hAnsi="Consolas"/>
       <w:b/>
       <w:i/>
-      <w:color w:val="60A0B0"/>
+      <w:color w:val="FF0000"/>
+      <w:kern w:val="0"/>
       <w:sz w:val="22"/>
-    </w:rPr>
-  </w:style>
-  <w:style w:type="character" w:customStyle="1" w:styleId="OtherTok">
-    <w:name w:val="OtherTok"/>
+      <w:lang w:val="en"/>
+      <w14:ligatures w14:val="none"/>
+    </w:rPr>
+  </w:style>
+  <w:style w:type="character" w:customStyle="1" w:styleId="ErrorTok">
+    <w:name w:val="ErrorTok"/>
     <w:basedOn w:val="VerbatimChar"/>
-    <w:rPr>
-      <w:rFonts w:ascii="Consolas" w:hAnsi="Consolas"/>
-      <w:color w:val="007020"/>
-      <w:sz w:val="22"/>
-    </w:rPr>
-  </w:style>
-  <w:style w:type="character" w:customStyle="1" w:styleId="FunctionTok">
-    <w:name w:val="FunctionTok"/>
-    <w:basedOn w:val="VerbatimChar"/>
-    <w:rPr>
-      <w:rFonts w:ascii="Consolas" w:hAnsi="Consolas"/>
-      <w:color w:val="06287E"/>
-      <w:sz w:val="22"/>
-    </w:rPr>
-  </w:style>
-  <w:style w:type="character" w:customStyle="1" w:styleId="VariableTok">
-    <w:name w:val="VariableTok"/>
-    <w:basedOn w:val="VerbatimChar"/>
-    <w:rPr>
-      <w:rFonts w:ascii="Consolas" w:hAnsi="Consolas"/>
-      <w:color w:val="19177C"/>
-      <w:sz w:val="22"/>
-    </w:rPr>
-  </w:style>
-  <w:style w:type="character" w:customStyle="1" w:styleId="ControlFlowTok">
-    <w:name w:val="ControlFlowTok"/>
-    <w:basedOn w:val="VerbatimChar"/>
-    <w:rPr>
-      <w:rFonts w:ascii="Consolas" w:hAnsi="Consolas"/>
-      <w:b/>
-      <w:color w:val="007020"/>
-      <w:sz w:val="22"/>
-    </w:rPr>
-  </w:style>
-  <w:style w:type="character" w:customStyle="1" w:styleId="OperatorTok">
-    <w:name w:val="OperatorTok"/>
-    <w:basedOn w:val="VerbatimChar"/>
-    <w:rPr>
-      <w:rFonts w:ascii="Consolas" w:hAnsi="Consolas"/>
-      <w:color w:val="666666"/>
-      <w:sz w:val="22"/>
-    </w:rPr>
-  </w:style>
-  <w:style w:type="character" w:customStyle="1" w:styleId="BuiltInTok">
-    <w:name w:val="BuiltInTok"/>
-    <w:basedOn w:val="VerbatimChar"/>
-    <w:rPr>
-      <w:rFonts w:ascii="Consolas" w:hAnsi="Consolas"/>
-      <w:sz w:val="22"/>
-    </w:rPr>
-  </w:style>
-  <w:style w:type="character" w:customStyle="1" w:styleId="ExtensionTok">
-    <w:name w:val="ExtensionTok"/>
-    <w:basedOn w:val="VerbatimChar"/>
-    <w:rPr>
-      <w:rFonts w:ascii="Consolas" w:hAnsi="Consolas"/>
-      <w:sz w:val="22"/>
-    </w:rPr>
-  </w:style>
-  <w:style w:type="character" w:customStyle="1" w:styleId="PreprocessorTok">
-    <w:name w:val="PreprocessorTok"/>
-    <w:basedOn w:val="VerbatimChar"/>
-    <w:rPr>
-      <w:rFonts w:ascii="Consolas" w:hAnsi="Consolas"/>
-      <w:color w:val="BC7A00"/>
-      <w:sz w:val="22"/>
-    </w:rPr>
-  </w:style>
-  <w:style w:type="character" w:customStyle="1" w:styleId="AttributeTok">
-    <w:name w:val="AttributeTok"/>
-    <w:basedOn w:val="VerbatimChar"/>
-    <w:rPr>
-      <w:rFonts w:ascii="Consolas" w:hAnsi="Consolas"/>
-      <w:color w:val="7D9029"/>
-      <w:sz w:val="22"/>
-    </w:rPr>
-  </w:style>
-  <w:style w:type="character" w:customStyle="1" w:styleId="RegionMarkerTok">
-    <w:name w:val="RegionMarkerTok"/>
-    <w:basedOn w:val="VerbatimChar"/>
-    <w:rPr>
-      <w:rFonts w:ascii="Consolas" w:hAnsi="Consolas"/>
-      <w:sz w:val="22"/>
-    </w:rPr>
-  </w:style>
-  <w:style w:type="character" w:customStyle="1" w:styleId="InformationTok">
-    <w:name w:val="InformationTok"/>
-    <w:basedOn w:val="VerbatimChar"/>
+    <w:rsid w:val="00AE3F74"/>
     <w:rPr>
       <w:rFonts w:ascii="Consolas" w:hAnsi="Consolas"/>
       <w:b/>
       <w:i/>
-      <w:color w:val="60A0B0"/>
+      <w:color w:val="FF0000"/>
+      <w:kern w:val="0"/>
       <w:sz w:val="22"/>
-    </w:rPr>
-  </w:style>
-  <w:style w:type="character" w:customStyle="1" w:styleId="WarningTok">
-    <w:name w:val="WarningTok"/>
-    <w:basedOn w:val="VerbatimChar"/>
-    <w:rPr>
-      <w:rFonts w:ascii="Consolas" w:hAnsi="Consolas"/>
-      <w:b/>
-      <w:i/>
-      <w:color w:val="60A0B0"/>
-      <w:sz w:val="22"/>
-    </w:rPr>
-  </w:style>
-  <w:style w:type="character" w:customStyle="1" w:styleId="AlertTok">
-    <w:name w:val="AlertTok"/>
-    <w:basedOn w:val="VerbatimChar"/>
-    <w:rPr>
-      <w:rFonts w:ascii="Consolas" w:hAnsi="Consolas"/>
-      <w:b/>
-      <w:color w:val="FF0000"/>
-      <w:sz w:val="22"/>
-    </w:rPr>
-  </w:style>
-  <w:style w:type="character" w:customStyle="1" w:styleId="ErrorTok">
-    <w:name w:val="ErrorTok"/>
-    <w:basedOn w:val="VerbatimChar"/>
-    <w:rPr>
-      <w:rFonts w:ascii="Consolas" w:hAnsi="Consolas"/>
-      <w:b/>
-      <w:color w:val="FF0000"/>
-      <w:sz w:val="22"/>
+      <w:lang w:val="en"/>
+      <w14:ligatures w14:val="none"/>
     </w:rPr>
   </w:style>
   <w:style w:type="character" w:customStyle="1" w:styleId="NormalTok">
     <w:name w:val="NormalTok"/>
     <w:basedOn w:val="VerbatimChar"/>
+    <w:rsid w:val="00AE3F74"/>
     <w:rPr>
       <w:rFonts w:ascii="Consolas" w:hAnsi="Consolas"/>
+      <w:i/>
+      <w:kern w:val="0"/>
       <w:sz w:val="22"/>
+      <w:lang w:val="en"/>
+      <w14:ligatures w14:val="none"/>
     </w:rPr>
   </w:style>
   <w:style w:type="paragraph" w:styleId="TOC1">
@@ -2975,7 +4317,7 @@
     <w:autoRedefine/>
     <w:uiPriority w:val="39"/>
     <w:unhideWhenUsed/>
-    <w:rsid w:val="00C55AC3"/>
+    <w:rsid w:val="00AE3F74"/>
     <w:pPr>
       <w:spacing w:after="100"/>
     </w:pPr>
@@ -2985,7 +4327,7 @@
     <w:basedOn w:val="Normal"/>
     <w:link w:val="HeaderChar"/>
     <w:unhideWhenUsed/>
-    <w:rsid w:val="009E0A49"/>
+    <w:rsid w:val="00AE3F74"/>
     <w:pPr>
       <w:tabs>
         <w:tab w:val="center" w:pos="4680"/>
@@ -2998,14 +4340,20 @@
     <w:name w:val="Header Char"/>
     <w:basedOn w:val="DefaultParagraphFont"/>
     <w:link w:val="Header"/>
-    <w:rsid w:val="009E0A49"/>
+    <w:rsid w:val="00AE3F74"/>
+    <w:rPr>
+      <w:rFonts w:ascii="Noto Sans NKo" w:hAnsi="Noto Sans NKo"/>
+      <w:kern w:val="0"/>
+      <w:lang w:val="en"/>
+      <w14:ligatures w14:val="none"/>
+    </w:rPr>
   </w:style>
   <w:style w:type="paragraph" w:styleId="Footer">
     <w:name w:val="footer"/>
     <w:basedOn w:val="Normal"/>
     <w:link w:val="FooterChar"/>
     <w:unhideWhenUsed/>
-    <w:rsid w:val="009E0A49"/>
+    <w:rsid w:val="00AE3F74"/>
     <w:pPr>
       <w:tabs>
         <w:tab w:val="center" w:pos="4680"/>
@@ -3018,13 +4366,411 @@
     <w:name w:val="Footer Char"/>
     <w:basedOn w:val="DefaultParagraphFont"/>
     <w:link w:val="Footer"/>
-    <w:rsid w:val="009E0A49"/>
-  </w:style>
-  <w:style w:type="character" w:customStyle="1" w:styleId="BodyTextChar">
-    <w:name w:val="Body Text Char"/>
+    <w:rsid w:val="00AE3F74"/>
+    <w:rPr>
+      <w:rFonts w:ascii="Noto Sans NKo" w:hAnsi="Noto Sans NKo"/>
+      <w:kern w:val="0"/>
+      <w:lang w:val="en"/>
+      <w14:ligatures w14:val="none"/>
+    </w:rPr>
+  </w:style>
+  <w:style w:type="paragraph" w:styleId="ListNumber">
+    <w:name w:val="List Number"/>
+    <w:basedOn w:val="Normal"/>
+    <w:uiPriority w:val="99"/>
+    <w:unhideWhenUsed/>
+    <w:rsid w:val="00AE3F74"/>
+    <w:pPr>
+      <w:numPr>
+        <w:numId w:val="34"/>
+      </w:numPr>
+      <w:ind w:left="720"/>
+      <w:contextualSpacing/>
+    </w:pPr>
+  </w:style>
+  <w:style w:type="paragraph" w:styleId="ListBullet">
+    <w:name w:val="List Bullet"/>
+    <w:basedOn w:val="Normal"/>
+    <w:uiPriority w:val="99"/>
+    <w:unhideWhenUsed/>
+    <w:rsid w:val="00AE3F74"/>
+    <w:pPr>
+      <w:numPr>
+        <w:numId w:val="35"/>
+      </w:numPr>
+      <w:contextualSpacing/>
+    </w:pPr>
+  </w:style>
+  <w:style w:type="paragraph" w:styleId="ListBullet2">
+    <w:name w:val="List Bullet 2"/>
+    <w:basedOn w:val="Normal"/>
+    <w:uiPriority w:val="99"/>
+    <w:unhideWhenUsed/>
+    <w:rsid w:val="00656812"/>
+    <w:pPr>
+      <w:numPr>
+        <w:numId w:val="27"/>
+      </w:numPr>
+      <w:tabs>
+        <w:tab w:val="clear" w:pos="720"/>
+      </w:tabs>
+      <w:ind w:left="0" w:firstLine="0"/>
+      <w:contextualSpacing/>
+    </w:pPr>
+  </w:style>
+  <w:style w:type="paragraph" w:styleId="TOC2">
+    <w:name w:val="toc 2"/>
+    <w:basedOn w:val="Normal"/>
+    <w:next w:val="Normal"/>
+    <w:autoRedefine/>
+    <w:uiPriority w:val="39"/>
+    <w:unhideWhenUsed/>
+    <w:rsid w:val="00AE3F74"/>
+    <w:pPr>
+      <w:spacing w:after="100"/>
+      <w:ind w:left="240"/>
+    </w:pPr>
+  </w:style>
+  <w:style w:type="paragraph" w:styleId="TOC3">
+    <w:name w:val="toc 3"/>
+    <w:basedOn w:val="Normal"/>
+    <w:next w:val="Normal"/>
+    <w:autoRedefine/>
+    <w:uiPriority w:val="39"/>
+    <w:unhideWhenUsed/>
+    <w:rsid w:val="00AE3F74"/>
+    <w:pPr>
+      <w:spacing w:after="100" w:line="278" w:lineRule="auto"/>
+      <w:ind w:left="480"/>
+    </w:pPr>
+    <w:rPr>
+      <w:rFonts w:eastAsiaTheme="minorEastAsia"/>
+      <w:kern w:val="2"/>
+      <w14:ligatures w14:val="standardContextual"/>
+    </w:rPr>
+  </w:style>
+  <w:style w:type="paragraph" w:styleId="TOC4">
+    <w:name w:val="toc 4"/>
+    <w:basedOn w:val="Normal"/>
+    <w:next w:val="Normal"/>
+    <w:autoRedefine/>
+    <w:uiPriority w:val="39"/>
+    <w:unhideWhenUsed/>
+    <w:rsid w:val="00AE3F74"/>
+    <w:pPr>
+      <w:spacing w:after="100" w:line="278" w:lineRule="auto"/>
+      <w:ind w:left="720"/>
+    </w:pPr>
+    <w:rPr>
+      <w:rFonts w:eastAsiaTheme="minorEastAsia"/>
+      <w:kern w:val="2"/>
+      <w14:ligatures w14:val="standardContextual"/>
+    </w:rPr>
+  </w:style>
+  <w:style w:type="paragraph" w:styleId="TOC5">
+    <w:name w:val="toc 5"/>
+    <w:basedOn w:val="Normal"/>
+    <w:next w:val="Normal"/>
+    <w:autoRedefine/>
+    <w:uiPriority w:val="39"/>
+    <w:unhideWhenUsed/>
+    <w:rsid w:val="00AE3F74"/>
+    <w:pPr>
+      <w:spacing w:after="100" w:line="278" w:lineRule="auto"/>
+      <w:ind w:left="960"/>
+    </w:pPr>
+    <w:rPr>
+      <w:rFonts w:eastAsiaTheme="minorEastAsia"/>
+      <w:kern w:val="2"/>
+      <w14:ligatures w14:val="standardContextual"/>
+    </w:rPr>
+  </w:style>
+  <w:style w:type="paragraph" w:styleId="TOC6">
+    <w:name w:val="toc 6"/>
+    <w:basedOn w:val="Normal"/>
+    <w:next w:val="Normal"/>
+    <w:autoRedefine/>
+    <w:uiPriority w:val="39"/>
+    <w:unhideWhenUsed/>
+    <w:rsid w:val="00AE3F74"/>
+    <w:pPr>
+      <w:spacing w:after="100" w:line="278" w:lineRule="auto"/>
+      <w:ind w:left="1200"/>
+    </w:pPr>
+    <w:rPr>
+      <w:rFonts w:eastAsiaTheme="minorEastAsia"/>
+      <w:kern w:val="2"/>
+      <w14:ligatures w14:val="standardContextual"/>
+    </w:rPr>
+  </w:style>
+  <w:style w:type="paragraph" w:styleId="TOC7">
+    <w:name w:val="toc 7"/>
+    <w:basedOn w:val="Normal"/>
+    <w:next w:val="Normal"/>
+    <w:autoRedefine/>
+    <w:uiPriority w:val="39"/>
+    <w:unhideWhenUsed/>
+    <w:rsid w:val="00AE3F74"/>
+    <w:pPr>
+      <w:spacing w:after="100" w:line="278" w:lineRule="auto"/>
+      <w:ind w:left="1440"/>
+    </w:pPr>
+    <w:rPr>
+      <w:rFonts w:eastAsiaTheme="minorEastAsia"/>
+      <w:kern w:val="2"/>
+      <w14:ligatures w14:val="standardContextual"/>
+    </w:rPr>
+  </w:style>
+  <w:style w:type="paragraph" w:styleId="TOC8">
+    <w:name w:val="toc 8"/>
+    <w:basedOn w:val="Normal"/>
+    <w:next w:val="Normal"/>
+    <w:autoRedefine/>
+    <w:uiPriority w:val="39"/>
+    <w:unhideWhenUsed/>
+    <w:rsid w:val="00AE3F74"/>
+    <w:pPr>
+      <w:spacing w:after="100" w:line="278" w:lineRule="auto"/>
+      <w:ind w:left="1680"/>
+    </w:pPr>
+    <w:rPr>
+      <w:rFonts w:eastAsiaTheme="minorEastAsia"/>
+      <w:kern w:val="2"/>
+      <w14:ligatures w14:val="standardContextual"/>
+    </w:rPr>
+  </w:style>
+  <w:style w:type="paragraph" w:styleId="TOC9">
+    <w:name w:val="toc 9"/>
+    <w:basedOn w:val="Normal"/>
+    <w:next w:val="Normal"/>
+    <w:autoRedefine/>
+    <w:uiPriority w:val="39"/>
+    <w:unhideWhenUsed/>
+    <w:rsid w:val="00AE3F74"/>
+    <w:pPr>
+      <w:spacing w:after="100" w:line="278" w:lineRule="auto"/>
+      <w:ind w:left="1920"/>
+    </w:pPr>
+    <w:rPr>
+      <w:rFonts w:eastAsiaTheme="minorEastAsia"/>
+      <w:kern w:val="2"/>
+      <w14:ligatures w14:val="standardContextual"/>
+    </w:rPr>
+  </w:style>
+  <w:style w:type="character" w:customStyle="1" w:styleId="UnresolvedMention">
+    <w:name w:val="Unresolved Mention"/>
     <w:basedOn w:val="DefaultParagraphFont"/>
-    <w:link w:val="BodyText"/>
-    <w:rsid w:val="00B459E7"/>
+    <w:uiPriority w:val="99"/>
+    <w:semiHidden/>
+    <w:unhideWhenUsed/>
+    <w:rsid w:val="00AE3F74"/>
+    <w:rPr>
+      <w:color w:val="605E5C"/>
+      <w:shd w:val="clear" w:color="auto" w:fill="E1DFDD"/>
+    </w:rPr>
+  </w:style>
+  <w:style w:type="paragraph" w:styleId="Revision">
+    <w:name w:val="Revision"/>
+    <w:hidden/>
+    <w:semiHidden/>
+    <w:rsid w:val="00AE3F74"/>
+    <w:pPr>
+      <w:spacing w:after="0" w:line="240" w:lineRule="auto"/>
+    </w:pPr>
+    <w:rPr>
+      <w:kern w:val="0"/>
+      <w:lang w:val="en"/>
+      <w14:ligatures w14:val="none"/>
+    </w:rPr>
+  </w:style>
+  <w:style w:type="character" w:styleId="CommentReference">
+    <w:name w:val="annotation reference"/>
+    <w:basedOn w:val="DefaultParagraphFont"/>
+    <w:semiHidden/>
+    <w:unhideWhenUsed/>
+    <w:rsid w:val="00AE3F74"/>
+    <w:rPr>
+      <w:sz w:val="16"/>
+      <w:szCs w:val="16"/>
+    </w:rPr>
+  </w:style>
+  <w:style w:type="paragraph" w:styleId="CommentText">
+    <w:name w:val="annotation text"/>
+    <w:basedOn w:val="Normal"/>
+    <w:link w:val="CommentTextChar"/>
+    <w:semiHidden/>
+    <w:unhideWhenUsed/>
+    <w:rsid w:val="00AE3F74"/>
+    <w:rPr>
+      <w:sz w:val="20"/>
+      <w:szCs w:val="20"/>
+    </w:rPr>
+  </w:style>
+  <w:style w:type="character" w:customStyle="1" w:styleId="CommentTextChar">
+    <w:name w:val="Comment Text Char"/>
+    <w:basedOn w:val="DefaultParagraphFont"/>
+    <w:link w:val="CommentText"/>
+    <w:semiHidden/>
+    <w:rsid w:val="00AE3F74"/>
+    <w:rPr>
+      <w:rFonts w:ascii="Noto Sans NKo" w:hAnsi="Noto Sans NKo"/>
+      <w:kern w:val="0"/>
+      <w:sz w:val="20"/>
+      <w:szCs w:val="20"/>
+      <w:lang w:val="en"/>
+      <w14:ligatures w14:val="none"/>
+    </w:rPr>
+  </w:style>
+  <w:style w:type="paragraph" w:styleId="CommentSubject">
+    <w:name w:val="annotation subject"/>
+    <w:basedOn w:val="CommentText"/>
+    <w:next w:val="CommentText"/>
+    <w:link w:val="CommentSubjectChar"/>
+    <w:semiHidden/>
+    <w:unhideWhenUsed/>
+    <w:rsid w:val="00AE3F74"/>
+    <w:rPr>
+      <w:b/>
+      <w:bCs/>
+    </w:rPr>
+  </w:style>
+  <w:style w:type="character" w:customStyle="1" w:styleId="CommentSubjectChar">
+    <w:name w:val="Comment Subject Char"/>
+    <w:basedOn w:val="CommentTextChar"/>
+    <w:link w:val="CommentSubject"/>
+    <w:semiHidden/>
+    <w:rsid w:val="00AE3F74"/>
+    <w:rPr>
+      <w:rFonts w:ascii="Noto Sans NKo" w:hAnsi="Noto Sans NKo"/>
+      <w:b/>
+      <w:bCs/>
+      <w:kern w:val="0"/>
+      <w:sz w:val="20"/>
+      <w:szCs w:val="20"/>
+      <w:lang w:val="en"/>
+      <w14:ligatures w14:val="none"/>
+    </w:rPr>
+  </w:style>
+  <w:style w:type="character" w:styleId="LineNumber">
+    <w:name w:val="line number"/>
+    <w:basedOn w:val="DefaultParagraphFont"/>
+    <w:unhideWhenUsed/>
+    <w:rsid w:val="00656812"/>
+  </w:style>
+  <w:style w:type="paragraph" w:styleId="List">
+    <w:name w:val="List"/>
+    <w:basedOn w:val="Normal"/>
+    <w:unhideWhenUsed/>
+    <w:rsid w:val="00656812"/>
+    <w:pPr>
+      <w:ind w:left="360" w:hanging="360"/>
+      <w:contextualSpacing/>
+    </w:pPr>
+  </w:style>
+  <w:style w:type="paragraph" w:styleId="ListNumber2">
+    <w:name w:val="List Number 2"/>
+    <w:basedOn w:val="Normal"/>
+    <w:autoRedefine/>
+    <w:unhideWhenUsed/>
+    <w:qFormat/>
+    <w:rsid w:val="00AE3F74"/>
+    <w:pPr>
+      <w:tabs>
+        <w:tab w:val="num" w:pos="720"/>
+      </w:tabs>
+      <w:ind w:left="720" w:hanging="360"/>
+      <w:contextualSpacing/>
+    </w:pPr>
+  </w:style>
+  <w:style w:type="paragraph" w:styleId="ListNumber3">
+    <w:name w:val="List Number 3"/>
+    <w:basedOn w:val="Normal"/>
+    <w:unhideWhenUsed/>
+    <w:rsid w:val="00656812"/>
+    <w:pPr>
+      <w:tabs>
+        <w:tab w:val="num" w:pos="1080"/>
+      </w:tabs>
+      <w:ind w:left="1080" w:hanging="360"/>
+      <w:contextualSpacing/>
+    </w:pPr>
+  </w:style>
+  <w:style w:type="paragraph" w:customStyle="1" w:styleId="Indenteddefinitiontext">
+    <w:name w:val="Indented definition text"/>
+    <w:basedOn w:val="Normal"/>
+    <w:autoRedefine/>
+    <w:qFormat/>
+    <w:rsid w:val="00AE3F74"/>
+    <w:pPr>
+      <w:spacing w:after="80"/>
+      <w:ind w:left="288"/>
+    </w:pPr>
+    <w:rPr>
+      <w:color w:val="000000" w:themeColor="text1"/>
+    </w:rPr>
+  </w:style>
+  <w:style w:type="paragraph" w:styleId="ListBullet3">
+    <w:name w:val="List Bullet 3"/>
+    <w:basedOn w:val="Normal"/>
+    <w:autoRedefine/>
+    <w:unhideWhenUsed/>
+    <w:qFormat/>
+    <w:rsid w:val="00AE3F74"/>
+    <w:pPr>
+      <w:contextualSpacing/>
+    </w:pPr>
+  </w:style>
+  <w:style w:type="paragraph" w:customStyle="1" w:styleId="CRpage">
+    <w:name w:val="CR page"/>
+    <w:basedOn w:val="Normal"/>
+    <w:qFormat/>
+    <w:rsid w:val="009E2BD6"/>
+    <w:pPr>
+      <w:spacing w:after="0"/>
+    </w:pPr>
+    <w:rPr>
+      <w:rFonts w:eastAsia="Calibri" w:cs="Calibri"/>
+      <w:color w:val="000000" w:themeColor="text1"/>
+    </w:rPr>
+  </w:style>
+  <w:style w:type="paragraph" w:customStyle="1" w:styleId="HeaderNoto">
+    <w:name w:val="Header Noto"/>
+    <w:basedOn w:val="Header"/>
+    <w:qFormat/>
+    <w:rsid w:val="009E2BD6"/>
+    <w:pPr>
+      <w:jc w:val="center"/>
+    </w:pPr>
+    <w:rPr>
+      <w:rFonts w:cs="Noto Sans NKo"/>
+    </w:rPr>
+  </w:style>
+  <w:style w:type="paragraph" w:customStyle="1" w:styleId="Linespace">
+    <w:name w:val="Line space"/>
+    <w:basedOn w:val="Normal"/>
+    <w:qFormat/>
+    <w:rsid w:val="00AE3F74"/>
+    <w:pPr>
+      <w:spacing w:after="0"/>
+    </w:pPr>
+    <w:rPr>
+      <w:rFonts w:cs="Times New Roman (Body CS)"/>
+      <w:color w:val="000000" w:themeColor="text1"/>
+    </w:rPr>
+  </w:style>
+  <w:style w:type="paragraph" w:customStyle="1" w:styleId="TNtext">
+    <w:name w:val="TN text"/>
+    <w:basedOn w:val="Normal"/>
+    <w:autoRedefine/>
+    <w:qFormat/>
+    <w:rsid w:val="00AE3F74"/>
+    <w:pPr>
+      <w:spacing w:after="80"/>
+      <w:ind w:left="288"/>
+    </w:pPr>
+    <w:rPr>
+      <w:color w:val="000000" w:themeColor="text1"/>
+    </w:rPr>
   </w:style>
 </w:styles>
 </file>
@@ -3040,44 +4786,44 @@
         <a:sysClr val="window" lastClr="FFFFFF"/>
       </a:lt1>
       <a:dk2>
-        <a:srgbClr val="1F497D"/>
+        <a:srgbClr val="0E2841"/>
       </a:dk2>
       <a:lt2>
-        <a:srgbClr val="EEECE1"/>
+        <a:srgbClr val="E8E8E8"/>
       </a:lt2>
       <a:accent1>
-        <a:srgbClr val="4F81BD"/>
+        <a:srgbClr val="156082"/>
       </a:accent1>
       <a:accent2>
-        <a:srgbClr val="C0504D"/>
+        <a:srgbClr val="E97132"/>
       </a:accent2>
       <a:accent3>
-        <a:srgbClr val="9BBB59"/>
+        <a:srgbClr val="196B24"/>
       </a:accent3>
       <a:accent4>
-        <a:srgbClr val="8064A2"/>
+        <a:srgbClr val="0F9ED5"/>
       </a:accent4>
       <a:accent5>
-        <a:srgbClr val="4BACC6"/>
+        <a:srgbClr val="A02B93"/>
       </a:accent5>
       <a:accent6>
-        <a:srgbClr val="F79646"/>
+        <a:srgbClr val="4EA72E"/>
       </a:accent6>
       <a:hlink>
-        <a:srgbClr val="0000FF"/>
+        <a:srgbClr val="467886"/>
       </a:hlink>
       <a:folHlink>
-        <a:srgbClr val="800080"/>
+        <a:srgbClr val="96607D"/>
       </a:folHlink>
     </a:clrScheme>
     <a:fontScheme name="Office">
       <a:majorFont>
-        <a:latin typeface="Calibri"/>
+        <a:latin typeface="Aptos Display" panose="02110004020202020204"/>
         <a:ea typeface=""/>
         <a:cs typeface=""/>
-        <a:font script="Jpan" typeface="ＭＳ ゴシック"/>
+        <a:font script="Jpan" typeface="游ゴシック Light"/>
         <a:font script="Hang" typeface="맑은 고딕"/>
-        <a:font script="Hans" typeface="宋体"/>
+        <a:font script="Hans" typeface="等线 Light"/>
         <a:font script="Hant" typeface="新細明體"/>
         <a:font script="Arab" typeface="Times New Roman"/>
         <a:font script="Hebr" typeface="Times New Roman"/>
@@ -3104,14 +4850,32 @@
         <a:font script="Mong" typeface="Mongolian Baiti"/>
         <a:font script="Viet" typeface="Times New Roman"/>
         <a:font script="Uigh" typeface="Microsoft Uighur"/>
+        <a:font script="Geor" typeface="Sylfaen"/>
+        <a:font script="Armn" typeface="Arial"/>
+        <a:font script="Bugi" typeface="Leelawadee UI"/>
+        <a:font script="Bopo" typeface="Microsoft JhengHei"/>
+        <a:font script="Java" typeface="Javanese Text"/>
+        <a:font script="Lisu" typeface="Segoe UI"/>
+        <a:font script="Mymr" typeface="Myanmar Text"/>
+        <a:font script="Nkoo" typeface="Ebrima"/>
+        <a:font script="Olck" typeface="Nirmala UI"/>
+        <a:font script="Osma" typeface="Ebrima"/>
+        <a:font script="Phag" typeface="Phagspa"/>
+        <a:font script="Syrn" typeface="Estrangelo Edessa"/>
+        <a:font script="Syrj" typeface="Estrangelo Edessa"/>
+        <a:font script="Syre" typeface="Estrangelo Edessa"/>
+        <a:font script="Sora" typeface="Nirmala UI"/>
+        <a:font script="Tale" typeface="Microsoft Tai Le"/>
+        <a:font script="Talu" typeface="Microsoft New Tai Lue"/>
+        <a:font script="Tfng" typeface="Ebrima"/>
       </a:majorFont>
       <a:minorFont>
-        <a:latin typeface="Cambria"/>
+        <a:latin typeface="Aptos" panose="02110004020202020204"/>
         <a:ea typeface=""/>
         <a:cs typeface=""/>
-        <a:font script="Jpan" typeface="ＭＳ 明朝"/>
+        <a:font script="Jpan" typeface="游ゴシック"/>
         <a:font script="Hang" typeface="맑은 고딕"/>
-        <a:font script="Hans" typeface="宋体"/>
+        <a:font script="Hans" typeface="等线"/>
         <a:font script="Hant" typeface="新細明體"/>
         <a:font script="Arab" typeface="Arial"/>
         <a:font script="Hebr" typeface="Arial"/>
@@ -3138,6 +4902,24 @@
         <a:font script="Mong" typeface="Mongolian Baiti"/>
         <a:font script="Viet" typeface="Arial"/>
         <a:font script="Uigh" typeface="Microsoft Uighur"/>
+        <a:font script="Geor" typeface="Sylfaen"/>
+        <a:font script="Armn" typeface="Arial"/>
+        <a:font script="Bugi" typeface="Leelawadee UI"/>
+        <a:font script="Bopo" typeface="Microsoft JhengHei"/>
+        <a:font script="Java" typeface="Javanese Text"/>
+        <a:font script="Lisu" typeface="Segoe UI"/>
+        <a:font script="Mymr" typeface="Myanmar Text"/>
+        <a:font script="Nkoo" typeface="Ebrima"/>
+        <a:font script="Olck" typeface="Nirmala UI"/>
+        <a:font script="Osma" typeface="Ebrima"/>
+        <a:font script="Phag" typeface="Phagspa"/>
+        <a:font script="Syrn" typeface="Estrangelo Edessa"/>
+        <a:font script="Syrj" typeface="Estrangelo Edessa"/>
+        <a:font script="Syre" typeface="Estrangelo Edessa"/>
+        <a:font script="Sora" typeface="Nirmala UI"/>
+        <a:font script="Tale" typeface="Microsoft Tai Le"/>
+        <a:font script="Talu" typeface="Microsoft New Tai Lue"/>
+        <a:font script="Tfng" typeface="Ebrima"/>
       </a:minorFont>
     </a:fontScheme>
     <a:fmtScheme name="Office">
@@ -3149,212 +4931,141 @@
           <a:gsLst>
             <a:gs pos="0">
               <a:schemeClr val="phClr">
-                <a:tint val="50000"/>
-                <a:satMod val="300000"/>
+                <a:lumMod val="110000"/>
+                <a:satMod val="105000"/>
+                <a:tint val="67000"/>
               </a:schemeClr>
             </a:gs>
-            <a:gs pos="35000">
+            <a:gs pos="50000">
               <a:schemeClr val="phClr">
-                <a:tint val="37000"/>
-                <a:satMod val="300000"/>
+                <a:lumMod val="105000"/>
+                <a:satMod val="103000"/>
+                <a:tint val="73000"/>
               </a:schemeClr>
             </a:gs>
             <a:gs pos="100000">
               <a:schemeClr val="phClr">
-                <a:tint val="15000"/>
-                <a:satMod val="350000"/>
+                <a:lumMod val="105000"/>
+                <a:satMod val="109000"/>
+                <a:tint val="81000"/>
               </a:schemeClr>
             </a:gs>
           </a:gsLst>
-          <a:lin ang="16200000" scaled="1"/>
+          <a:lin ang="5400000" scaled="0"/>
         </a:gradFill>
         <a:gradFill rotWithShape="1">
           <a:gsLst>
             <a:gs pos="0">
               <a:schemeClr val="phClr">
-                <a:tint val="100000"/>
+                <a:satMod val="103000"/>
+                <a:lumMod val="102000"/>
+                <a:tint val="94000"/>
+              </a:schemeClr>
+            </a:gs>
+            <a:gs pos="50000">
+              <a:schemeClr val="phClr">
+                <a:satMod val="110000"/>
+                <a:lumMod val="100000"/>
                 <a:shade val="100000"/>
-                <a:satMod val="130000"/>
               </a:schemeClr>
             </a:gs>
             <a:gs pos="100000">
               <a:schemeClr val="phClr">
-                <a:tint val="50000"/>
-                <a:shade val="100000"/>
-                <a:satMod val="350000"/>
+                <a:lumMod val="99000"/>
+                <a:satMod val="120000"/>
+                <a:shade val="78000"/>
               </a:schemeClr>
             </a:gs>
           </a:gsLst>
-          <a:lin ang="16200000" scaled="0"/>
+          <a:lin ang="5400000" scaled="0"/>
         </a:gradFill>
       </a:fillStyleLst>
       <a:lnStyleLst>
-        <a:ln w="9525" cap="flat" cmpd="sng" algn="ctr">
-          <a:solidFill>
-            <a:schemeClr val="phClr">
-              <a:shade val="95000"/>
-              <a:satMod val="105000"/>
-            </a:schemeClr>
-          </a:solidFill>
-          <a:prstDash val="solid"/>
-        </a:ln>
-        <a:ln w="25400" cap="flat" cmpd="sng" algn="ctr">
+        <a:ln w="6350" cap="flat" cmpd="sng" algn="ctr">
           <a:solidFill>
             <a:schemeClr val="phClr"/>
           </a:solidFill>
           <a:prstDash val="solid"/>
+          <a:miter lim="800000"/>
         </a:ln>
-        <a:ln w="38100" cap="flat" cmpd="sng" algn="ctr">
+        <a:ln w="12700" cap="flat" cmpd="sng" algn="ctr">
           <a:solidFill>
             <a:schemeClr val="phClr"/>
           </a:solidFill>
           <a:prstDash val="solid"/>
+          <a:miter lim="800000"/>
+        </a:ln>
+        <a:ln w="19050" cap="flat" cmpd="sng" algn="ctr">
+          <a:solidFill>
+            <a:schemeClr val="phClr"/>
+          </a:solidFill>
+          <a:prstDash val="solid"/>
+          <a:miter lim="800000"/>
         </a:ln>
       </a:lnStyleLst>
       <a:effectStyleLst>
         <a:effectStyle>
+          <a:effectLst/>
+        </a:effectStyle>
+        <a:effectStyle>
+          <a:effectLst/>
+        </a:effectStyle>
+        <a:effectStyle>
           <a:effectLst>
-            <a:outerShdw blurRad="40000" dist="20000" dir="5400000" rotWithShape="0">
+            <a:outerShdw blurRad="57150" dist="19050" dir="5400000" algn="ctr" rotWithShape="0">
               <a:srgbClr val="000000">
-                <a:alpha val="38000"/>
+                <a:alpha val="63000"/>
               </a:srgbClr>
             </a:outerShdw>
           </a:effectLst>
-        </a:effectStyle>
-        <a:effectStyle>
-          <a:effectLst>
-            <a:outerShdw blurRad="40000" dist="23000" dir="5400000" rotWithShape="0">
-              <a:srgbClr val="000000">
-                <a:alpha val="35000"/>
-              </a:srgbClr>
-            </a:outerShdw>
-          </a:effectLst>
-        </a:effectStyle>
-        <a:effectStyle>
-          <a:effectLst>
-            <a:outerShdw blurRad="40000" dist="23000" dir="5400000" rotWithShape="0">
-              <a:srgbClr val="000000">
-                <a:alpha val="35000"/>
-              </a:srgbClr>
-            </a:outerShdw>
-          </a:effectLst>
-          <a:scene3d>
-            <a:camera prst="orthographicFront">
-              <a:rot lat="0" lon="0" rev="0"/>
-            </a:camera>
-            <a:lightRig rig="threePt" dir="t">
-              <a:rot lat="0" lon="0" rev="1200000"/>
-            </a:lightRig>
-          </a:scene3d>
-          <a:sp3d>
-            <a:bevelT w="63500" h="25400"/>
-          </a:sp3d>
         </a:effectStyle>
       </a:effectStyleLst>
       <a:bgFillStyleLst>
         <a:solidFill>
           <a:schemeClr val="phClr"/>
         </a:solidFill>
+        <a:solidFill>
+          <a:schemeClr val="phClr">
+            <a:tint val="95000"/>
+            <a:satMod val="170000"/>
+          </a:schemeClr>
+        </a:solidFill>
         <a:gradFill rotWithShape="1">
           <a:gsLst>
             <a:gs pos="0">
               <a:schemeClr val="phClr">
-                <a:tint val="40000"/>
-                <a:satMod val="350000"/>
+                <a:tint val="93000"/>
+                <a:satMod val="150000"/>
+                <a:shade val="98000"/>
+                <a:lumMod val="102000"/>
               </a:schemeClr>
             </a:gs>
-            <a:gs pos="40000">
+            <a:gs pos="50000">
               <a:schemeClr val="phClr">
-                <a:tint val="45000"/>
-                <a:shade val="99000"/>
-                <a:satMod val="350000"/>
+                <a:tint val="98000"/>
+                <a:satMod val="130000"/>
+                <a:shade val="90000"/>
+                <a:lumMod val="103000"/>
               </a:schemeClr>
             </a:gs>
             <a:gs pos="100000">
               <a:schemeClr val="phClr">
-                <a:shade val="20000"/>
-                <a:satMod val="255000"/>
+                <a:shade val="63000"/>
+                <a:satMod val="120000"/>
               </a:schemeClr>
             </a:gs>
           </a:gsLst>
-          <a:path path="circle">
-            <a:fillToRect l="50000" t="-80000" r="50000" b="180000"/>
-          </a:path>
-        </a:gradFill>
-        <a:gradFill rotWithShape="1">
-          <a:gsLst>
-            <a:gs pos="0">
-              <a:schemeClr val="phClr">
-                <a:tint val="80000"/>
-                <a:satMod val="300000"/>
-              </a:schemeClr>
-            </a:gs>
-            <a:gs pos="100000">
-              <a:schemeClr val="phClr">
-                <a:shade val="30000"/>
-                <a:satMod val="200000"/>
-              </a:schemeClr>
-            </a:gs>
-          </a:gsLst>
-          <a:path path="circle">
-            <a:fillToRect l="50000" t="50000" r="50000" b="50000"/>
-          </a:path>
+          <a:lin ang="5400000" scaled="0"/>
         </a:gradFill>
       </a:bgFillStyleLst>
     </a:fmtScheme>
   </a:themeElements>
-  <a:objectDefaults>
-    <a:spDef>
-      <a:spPr/>
-      <a:bodyPr/>
-      <a:lstStyle/>
-      <a:style>
-        <a:lnRef idx="1">
-          <a:schemeClr val="accent1"/>
-        </a:lnRef>
-        <a:fillRef idx="3">
-          <a:schemeClr val="accent1"/>
-        </a:fillRef>
-        <a:effectRef idx="2">
-          <a:schemeClr val="accent1"/>
-        </a:effectRef>
-        <a:fontRef idx="minor">
-          <a:schemeClr val="lt1"/>
-        </a:fontRef>
-      </a:style>
-    </a:spDef>
-    <a:lnDef>
-      <a:spPr/>
-      <a:bodyPr/>
-      <a:lstStyle/>
-      <a:style>
-        <a:lnRef idx="2">
-          <a:schemeClr val="accent1"/>
-        </a:lnRef>
-        <a:fillRef idx="0">
-          <a:schemeClr val="accent1"/>
-        </a:fillRef>
-        <a:effectRef idx="1">
-          <a:schemeClr val="accent1"/>
-        </a:effectRef>
-        <a:fontRef idx="minor">
-          <a:schemeClr val="tx1"/>
-        </a:fontRef>
-      </a:style>
-    </a:lnDef>
-  </a:objectDefaults>
+  <a:objectDefaults/>
   <a:extraClrSchemeLst/>
+  <a:extLst>
+    <a:ext uri="{05A4C25C-085E-4340-85A3-A5531E510DB2}">
+      <thm15:themeFamily xmlns:thm15="http://schemas.microsoft.com/office/thememl/2012/main" name="Office Theme" id="{62F939B6-93AF-4DB8-9C6B-D6C7DFDC589F}" vid="{4A3C46E8-61CC-4603-A589-7422A47A8E4A}"/>
+    </a:ext>
+  </a:extLst>
 </a:theme>
-</file>
-
-<file path=customXml/item1.xml><?xml version="1.0" encoding="utf-8"?>
-<b:Sources xmlns:b="http://schemas.openxmlformats.org/officeDocument/2006/bibliography" xmlns="http://schemas.openxmlformats.org/officeDocument/2006/bibliography" SelectedStyle="\APASixthEditionOfficeOnline.xsl" StyleName="APA" Version="6"/>
-</file>
-
-<file path=customXml/itemProps1.xml><?xml version="1.0" encoding="utf-8"?>
-<ds:datastoreItem xmlns:ds="http://schemas.openxmlformats.org/officeDocument/2006/customXml" ds:itemID="{D8903B22-4737-4802-B8E3-D7336DA9CFB7}">
-  <ds:schemaRefs>
-    <ds:schemaRef ds:uri="http://schemas.openxmlformats.org/officeDocument/2006/bibliography"/>
-  </ds:schemaRefs>
-</ds:datastoreItem>
 </file>
</xml_diff>

<commit_message>
Style hyperlinks per PO request
Underline and black. Have not added the highlight desired yet as it is
quite tricky to achieve and may not be desirable since it will gobble
toner.
</commit_message>
<xml_diff>
--- a/template.docx
+++ b/template.docx
@@ -123,6 +123,8 @@
           <w:color w:val="000000" w:themeColor="text1"/>
         </w:rPr>
       </w:pPr>
+      <w:bookmarkStart w:id="1" w:name="_GoBack"/>
+      <w:bookmarkEnd w:id="1"/>
     </w:p>
     <w:p>
       <w:pPr>
@@ -152,7 +154,7 @@
         </w:rPr>
         <w:br w:type="page"/>
       </w:r>
-      <w:bookmarkStart w:id="1" w:name="_Hlk117865285"/>
+      <w:bookmarkStart w:id="2" w:name="_Hlk117865285"/>
       <w:r>
         <w:rPr>
           <w:rFonts w:ascii="Calibri" w:eastAsia="Calibri" w:hAnsi="Calibri" w:cs="Calibri"/>
@@ -866,16 +868,17 @@
         </w:sectPr>
       </w:pPr>
     </w:p>
-    <w:bookmarkEnd w:id="1"/>
+    <w:bookmarkEnd w:id="2"/>
     <w:p>
-      <w:r>
-        <w:rPr>
-          <w:color w:val="000000" w:themeColor="text1"/>
-        </w:rPr>
+      <w:pPr>
+        <w:pStyle w:val="PlainHyperlink"/>
+      </w:pPr>
+      <w:r>
         <w:lastRenderedPageBreak/>
         <w:t xml:space="preserve"> </w:t>
       </w:r>
     </w:p>
+    <w:p/>
     <w:sectPr>
       <w:headerReference w:type="default" r:id="rId16"/>
       <w:footerReference w:type="default" r:id="rId17"/>
@@ -1365,8 +1368,6 @@
       </w:rPr>
       <w:fldChar w:fldCharType="end"/>
     </w:r>
-    <w:bookmarkStart w:id="2" w:name="_GoBack"/>
-    <w:bookmarkEnd w:id="2"/>
   </w:p>
 </w:hdr>
 </file>
@@ -2702,7 +2703,7 @@
     <w:lsdException w:name="Body Text Indent 2" w:semiHidden="1" w:unhideWhenUsed="1"/>
     <w:lsdException w:name="Body Text Indent 3" w:semiHidden="1" w:unhideWhenUsed="1"/>
     <w:lsdException w:name="Block Text" w:semiHidden="1" w:uiPriority="9" w:unhideWhenUsed="1" w:qFormat="1"/>
-    <w:lsdException w:name="Hyperlink" w:semiHidden="1" w:unhideWhenUsed="1"/>
+    <w:lsdException w:name="Hyperlink" w:semiHidden="1" w:unhideWhenUsed="1" w:qFormat="1"/>
     <w:lsdException w:name="FollowedHyperlink" w:semiHidden="1" w:unhideWhenUsed="1"/>
     <w:lsdException w:name="Strong" w:uiPriority="22" w:qFormat="1"/>
     <w:lsdException w:name="Emphasis" w:uiPriority="20" w:qFormat="1"/>
@@ -2992,7 +2993,7 @@
   <w:style w:type="paragraph" w:default="1" w:styleId="Normal">
     <w:name w:val="Normal"/>
     <w:qFormat/>
-    <w:rsid w:val="00D146FB"/>
+    <w:rsid w:val="00741A46"/>
     <w:pPr>
       <w:spacing w:line="259" w:lineRule="auto"/>
     </w:pPr>
@@ -3128,7 +3129,7 @@
     <w:uiPriority w:val="9"/>
     <w:unhideWhenUsed/>
     <w:qFormat/>
-    <w:rsid w:val="00AE3F74"/>
+    <w:rsid w:val="00A21358"/>
     <w:pPr>
       <w:keepNext/>
       <w:keepLines/>
@@ -3137,7 +3138,7 @@
     </w:pPr>
     <w:rPr>
       <w:rFonts w:asciiTheme="majorHAnsi" w:eastAsiaTheme="majorEastAsia" w:hAnsiTheme="majorHAnsi" w:cstheme="majorBidi"/>
-      <w:color w:val="156082" w:themeColor="accent1"/>
+      <w:color w:val="000000" w:themeColor="text1"/>
     </w:rPr>
   </w:style>
   <w:style w:type="paragraph" w:styleId="Heading7">
@@ -3205,7 +3206,7 @@
     <w:uiPriority w:val="1"/>
     <w:semiHidden/>
     <w:unhideWhenUsed/>
-    <w:rsid w:val="00D146FB"/>
+    <w:rsid w:val="00741A46"/>
   </w:style>
   <w:style w:type="table" w:default="1" w:styleId="TableNormal">
     <w:name w:val="Normal Table"/>
@@ -3227,7 +3228,7 @@
     <w:uiPriority w:val="99"/>
     <w:semiHidden/>
     <w:unhideWhenUsed/>
-    <w:rsid w:val="00D146FB"/>
+    <w:rsid w:val="00741A46"/>
   </w:style>
   <w:style w:type="character" w:customStyle="1" w:styleId="Heading1Char">
     <w:name w:val="Heading 1 Char"/>
@@ -3318,12 +3319,13 @@
     <w:basedOn w:val="DefaultParagraphFont"/>
     <w:link w:val="Heading6"/>
     <w:uiPriority w:val="9"/>
-    <w:rsid w:val="00656812"/>
+    <w:rsid w:val="00A21358"/>
     <w:rPr>
       <w:rFonts w:asciiTheme="majorHAnsi" w:eastAsiaTheme="majorEastAsia" w:hAnsiTheme="majorHAnsi" w:cstheme="majorBidi"/>
-      <w:color w:val="156082" w:themeColor="accent1"/>
-      <w:kern w:val="0"/>
-      <w:lang w:val="en"/>
+      <w:color w:val="000000" w:themeColor="text1"/>
+      <w:kern w:val="0"/>
+      <w:sz w:val="22"/>
+      <w:szCs w:val="22"/>
       <w14:ligatures w14:val="none"/>
     </w:rPr>
   </w:style>
@@ -3831,14 +3833,16 @@
   </w:style>
   <w:style w:type="character" w:styleId="Hyperlink">
     <w:name w:val="Hyperlink"/>
-    <w:basedOn w:val="CaptionChar"/>
+    <w:basedOn w:val="DefaultParagraphFont"/>
     <w:uiPriority w:val="99"/>
-    <w:rsid w:val="00AE3F74"/>
+    <w:qFormat/>
+    <w:rsid w:val="00741A46"/>
     <w:rPr>
       <w:rFonts w:ascii="Noto Sans NKo" w:hAnsi="Noto Sans NKo"/>
       <w:i/>
-      <w:color w:val="156082" w:themeColor="accent1"/>
-      <w:kern w:val="0"/>
+      <w:color w:val="000000" w:themeColor="text1"/>
+      <w:kern w:val="0"/>
+      <w:u w:val="single"/>
       <w:lang w:val="en"/>
       <w14:ligatures w14:val="none"/>
     </w:rPr>
@@ -4770,6 +4774,43 @@
     </w:pPr>
     <w:rPr>
       <w:color w:val="000000" w:themeColor="text1"/>
+    </w:rPr>
+  </w:style>
+  <w:style w:type="paragraph" w:customStyle="1" w:styleId="PlainHyperlink">
+    <w:name w:val="PlainHyperlink"/>
+    <w:basedOn w:val="Normal"/>
+    <w:link w:val="PlainHyperlinkChar"/>
+    <w:qFormat/>
+    <w:rsid w:val="00741A46"/>
+    <w:rPr>
+      <w:color w:val="000000" w:themeColor="text1"/>
+      <w:u w:val="single"/>
+    </w:rPr>
+  </w:style>
+  <w:style w:type="character" w:customStyle="1" w:styleId="PlainHyperlinkChar">
+    <w:name w:val="PlainHyperlink Char"/>
+    <w:basedOn w:val="DefaultParagraphFont"/>
+    <w:link w:val="PlainHyperlink"/>
+    <w:rsid w:val="001F04A0"/>
+    <w:rPr>
+      <w:color w:val="000000" w:themeColor="text1"/>
+      <w:kern w:val="0"/>
+      <w:sz w:val="22"/>
+      <w:szCs w:val="22"/>
+      <w:u w:val="single"/>
+      <w14:ligatures w14:val="none"/>
+    </w:rPr>
+  </w:style>
+  <w:style w:type="character" w:customStyle="1" w:styleId="PlainHyperlinkChar0">
+    <w:name w:val="PlainHyperlinkChar"/>
+    <w:basedOn w:val="DefaultParagraphFont"/>
+    <w:uiPriority w:val="1"/>
+    <w:qFormat/>
+    <w:rsid w:val="00741A46"/>
+    <w:rPr>
+      <w:color w:val="000000" w:themeColor="text1"/>
+      <w:u w:val="single"/>
+      <w:bdr w:val="none" w:sz="0" w:space="0" w:color="auto"/>
     </w:rPr>
   </w:style>
 </w:styles>

</xml_diff>

<commit_message>
Update docx template to be a4 size
By request of PO
</commit_message>
<xml_diff>
--- a/template.docx
+++ b/template.docx
@@ -11,6 +11,8 @@
         </w:rPr>
       </w:pPr>
       <w:bookmarkStart w:id="0" w:name="introduction-to-the-gospel-of-matthew"/>
+      <w:bookmarkStart w:id="1" w:name="_GoBack"/>
+      <w:bookmarkEnd w:id="1"/>
       <w:r>
         <w:rPr>
           <w:sz w:val="32"/>
@@ -123,8 +125,6 @@
           <w:color w:val="000000" w:themeColor="text1"/>
         </w:rPr>
       </w:pPr>
-      <w:bookmarkStart w:id="1" w:name="_GoBack"/>
-      <w:bookmarkEnd w:id="1"/>
     </w:p>
     <w:p>
       <w:pPr>
@@ -862,9 +862,10 @@
           <w:footerReference w:type="default" r:id="rId13"/>
           <w:headerReference w:type="first" r:id="rId14"/>
           <w:footerReference w:type="first" r:id="rId15"/>
-          <w:pgSz w:w="12240" w:h="15840"/>
+          <w:pgSz w:w="11907" w:h="16839" w:code="9"/>
           <w:pgMar w:top="1440" w:right="1440" w:bottom="1440" w:left="1440" w:header="720" w:footer="720" w:gutter="0"/>
           <w:cols w:space="720"/>
+          <w:docGrid w:linePitch="299"/>
         </w:sectPr>
       </w:pPr>
     </w:p>
@@ -2993,7 +2994,7 @@
   <w:style w:type="paragraph" w:default="1" w:styleId="Normal">
     <w:name w:val="Normal"/>
     <w:qFormat/>
-    <w:rsid w:val="00741A46"/>
+    <w:rsid w:val="004D70EA"/>
     <w:pPr>
       <w:spacing w:line="259" w:lineRule="auto"/>
     </w:pPr>
@@ -3206,7 +3207,7 @@
     <w:uiPriority w:val="1"/>
     <w:semiHidden/>
     <w:unhideWhenUsed/>
-    <w:rsid w:val="00741A46"/>
+    <w:rsid w:val="004D70EA"/>
   </w:style>
   <w:style w:type="table" w:default="1" w:styleId="TableNormal">
     <w:name w:val="Normal Table"/>
@@ -3228,7 +3229,7 @@
     <w:uiPriority w:val="99"/>
     <w:semiHidden/>
     <w:unhideWhenUsed/>
-    <w:rsid w:val="00741A46"/>
+    <w:rsid w:val="004D70EA"/>
   </w:style>
   <w:style w:type="character" w:customStyle="1" w:styleId="Heading1Char">
     <w:name w:val="Heading 1 Char"/>
@@ -3836,7 +3837,7 @@
     <w:basedOn w:val="DefaultParagraphFont"/>
     <w:uiPriority w:val="99"/>
     <w:qFormat/>
-    <w:rsid w:val="00741A46"/>
+    <w:rsid w:val="004D70EA"/>
     <w:rPr>
       <w:rFonts w:ascii="Noto Sans NKo" w:hAnsi="Noto Sans NKo"/>
       <w:i/>
@@ -4781,7 +4782,7 @@
     <w:basedOn w:val="Normal"/>
     <w:link w:val="PlainHyperlinkChar"/>
     <w:qFormat/>
-    <w:rsid w:val="00741A46"/>
+    <w:rsid w:val="004D70EA"/>
     <w:rPr>
       <w:color w:val="000000" w:themeColor="text1"/>
       <w:u w:val="single"/>
@@ -4806,11 +4807,10 @@
     <w:basedOn w:val="DefaultParagraphFont"/>
     <w:uiPriority w:val="1"/>
     <w:qFormat/>
-    <w:rsid w:val="00741A46"/>
+    <w:rsid w:val="004D70EA"/>
     <w:rPr>
       <w:color w:val="000000" w:themeColor="text1"/>
       <w:u w:val="single"/>
-      <w:bdr w:val="none" w:sz="0" w:space="0" w:color="auto"/>
     </w:rPr>
   </w:style>
 </w:styles>

</xml_diff>